<commit_message>
Updated Booked hours from yesterday, edited retrospective document, created a Sprint 3 team agreement
</commit_message>
<xml_diff>
--- a/Documentation/Sprint 2 Deliverables/Client_Meeting_Minutes_&_Retrospective.docx
+++ b/Documentation/Sprint 2 Deliverables/Client_Meeting_Minutes_&_Retrospective.docx
@@ -706,6 +706,338 @@
         <w:t>Retrospective:</w:t>
       </w:r>
     </w:p>
+    <w:p>
+      <w:pPr>
+        <w:pStyle w:val="ListParagraph"/>
+        <w:numPr>
+          <w:ilvl w:val="0"/>
+          <w:numId w:val="1"/>
+        </w:numPr>
+        <w:tabs>
+          <w:tab w:val="center" w:pos="4513"/>
+          <w:tab w:val="left" w:pos="5844"/>
+        </w:tabs>
+        <w:rPr>
+          <w:sz w:val="32"/>
+          <w:szCs w:val="32"/>
+          <w:lang w:val="en-US"/>
+        </w:rPr>
+      </w:pPr>
+      <w:r>
+        <w:rPr>
+          <w:sz w:val="32"/>
+          <w:szCs w:val="32"/>
+          <w:lang w:val="en-US"/>
+        </w:rPr>
+        <w:t>Purpose</w:t>
+      </w:r>
+    </w:p>
+    <w:p>
+      <w:pPr>
+        <w:tabs>
+          <w:tab w:val="center" w:pos="4513"/>
+          <w:tab w:val="left" w:pos="5844"/>
+        </w:tabs>
+        <w:rPr>
+          <w:sz w:val="32"/>
+          <w:szCs w:val="32"/>
+          <w:lang w:val="en-US"/>
+        </w:rPr>
+      </w:pPr>
+      <w:r>
+        <w:t xml:space="preserve">Per the unit requirements, this retrospective reflects on the team's progress to date </w:t>
+      </w:r>
+      <w:proofErr w:type="gramStart"/>
+      <w:r>
+        <w:t>in light of</w:t>
+      </w:r>
+      <w:proofErr w:type="gramEnd"/>
+      <w:r>
+        <w:t xml:space="preserve"> the Client demonstration, and on how the project is tracking against the </w:t>
+      </w:r>
+      <w:r>
+        <w:t>Sprint 2</w:t>
+      </w:r>
+      <w:r>
+        <w:t xml:space="preserve"> goals proposed at the end of Sprint 1 and the expected timeline given on the project timesheet</w:t>
+      </w:r>
+      <w:r>
+        <w:t>.</w:t>
+      </w:r>
+    </w:p>
+    <w:p>
+      <w:pPr>
+        <w:pStyle w:val="ListParagraph"/>
+        <w:numPr>
+          <w:ilvl w:val="0"/>
+          <w:numId w:val="1"/>
+        </w:numPr>
+        <w:tabs>
+          <w:tab w:val="center" w:pos="4513"/>
+          <w:tab w:val="left" w:pos="5844"/>
+        </w:tabs>
+        <w:rPr>
+          <w:sz w:val="32"/>
+          <w:szCs w:val="32"/>
+          <w:lang w:val="en-US"/>
+        </w:rPr>
+      </w:pPr>
+      <w:r>
+        <w:rPr>
+          <w:sz w:val="32"/>
+          <w:szCs w:val="32"/>
+          <w:lang w:val="en-US"/>
+        </w:rPr>
+        <w:t>What was</w:t>
+      </w:r>
+      <w:r>
+        <w:rPr>
+          <w:sz w:val="32"/>
+          <w:szCs w:val="32"/>
+          <w:lang w:val="en-US"/>
+        </w:rPr>
+        <w:t xml:space="preserve"> Demonstrated</w:t>
+      </w:r>
+    </w:p>
+    <w:p>
+      <w:pPr>
+        <w:tabs>
+          <w:tab w:val="center" w:pos="4513"/>
+          <w:tab w:val="left" w:pos="5844"/>
+        </w:tabs>
+        <w:rPr>
+          <w:lang w:val="en-US"/>
+        </w:rPr>
+      </w:pPr>
+      <w:r>
+        <w:rPr>
+          <w:lang w:val="en-US"/>
+        </w:rPr>
+        <w:t>Gesture simulation</w:t>
+      </w:r>
+      <w:r>
+        <w:rPr>
+          <w:lang w:val="en-US"/>
+        </w:rPr>
+        <w:t>:</w:t>
+      </w:r>
+    </w:p>
+    <w:p>
+      <w:pPr>
+        <w:pStyle w:val="ListParagraph"/>
+        <w:numPr>
+          <w:ilvl w:val="0"/>
+          <w:numId w:val="2"/>
+        </w:numPr>
+        <w:tabs>
+          <w:tab w:val="center" w:pos="4513"/>
+          <w:tab w:val="left" w:pos="5844"/>
+        </w:tabs>
+        <w:rPr>
+          <w:lang w:val="en-US"/>
+        </w:rPr>
+      </w:pPr>
+      <w:r>
+        <w:rPr>
+          <w:lang w:val="en-US"/>
+        </w:rPr>
+        <w:t xml:space="preserve">A Unitree SDK and </w:t>
+      </w:r>
+      <w:proofErr w:type="spellStart"/>
+      <w:r>
+        <w:rPr>
+          <w:lang w:val="en-US"/>
+        </w:rPr>
+        <w:t>CycloneDDS</w:t>
+      </w:r>
+      <w:proofErr w:type="spellEnd"/>
+      <w:r>
+        <w:rPr>
+          <w:lang w:val="en-US"/>
+        </w:rPr>
+        <w:t xml:space="preserve"> implementation</w:t>
+      </w:r>
+      <w:r>
+        <w:rPr>
+          <w:lang w:val="en-US"/>
+        </w:rPr>
+        <w:t xml:space="preserve"> of the gesture control requirement</w:t>
+      </w:r>
+      <w:r>
+        <w:rPr>
+          <w:lang w:val="en-US"/>
+        </w:rPr>
+        <w:t xml:space="preserve"> being reflected in </w:t>
+      </w:r>
+      <w:proofErr w:type="spellStart"/>
+      <w:r>
+        <w:rPr>
+          <w:lang w:val="en-US"/>
+        </w:rPr>
+        <w:t>M</w:t>
+      </w:r>
+      <w:r>
+        <w:rPr>
+          <w:lang w:val="en-US"/>
+        </w:rPr>
+        <w:t>ujoco</w:t>
+      </w:r>
+      <w:proofErr w:type="spellEnd"/>
+      <w:r>
+        <w:rPr>
+          <w:lang w:val="en-US"/>
+        </w:rPr>
+        <w:t xml:space="preserve"> simulation</w:t>
+      </w:r>
+    </w:p>
+    <w:p>
+      <w:pPr>
+        <w:pStyle w:val="ListParagraph"/>
+        <w:numPr>
+          <w:ilvl w:val="0"/>
+          <w:numId w:val="2"/>
+        </w:numPr>
+        <w:tabs>
+          <w:tab w:val="center" w:pos="4513"/>
+          <w:tab w:val="left" w:pos="5844"/>
+        </w:tabs>
+        <w:rPr>
+          <w:lang w:val="en-US"/>
+        </w:rPr>
+      </w:pPr>
+      <w:r>
+        <w:rPr>
+          <w:lang w:val="en-US"/>
+        </w:rPr>
+        <w:t>The 8 different gestures to control the robot’s action</w:t>
+      </w:r>
+      <w:r>
+        <w:rPr>
+          <w:lang w:val="en-US"/>
+        </w:rPr>
+        <w:t>s</w:t>
+      </w:r>
+      <w:r>
+        <w:rPr>
+          <w:lang w:val="en-US"/>
+        </w:rPr>
+        <w:t xml:space="preserve"> all </w:t>
+      </w:r>
+      <w:r>
+        <w:rPr>
+          <w:lang w:val="en-US"/>
+        </w:rPr>
+        <w:t xml:space="preserve">creating a reaction to the webcam gesture in the </w:t>
+      </w:r>
+      <w:proofErr w:type="spellStart"/>
+      <w:r>
+        <w:rPr>
+          <w:lang w:val="en-US"/>
+        </w:rPr>
+        <w:t>Mujoco</w:t>
+      </w:r>
+      <w:proofErr w:type="spellEnd"/>
+      <w:r>
+        <w:rPr>
+          <w:lang w:val="en-US"/>
+        </w:rPr>
+        <w:t xml:space="preserve"> simulation</w:t>
+      </w:r>
+    </w:p>
+    <w:p>
+      <w:pPr>
+        <w:pStyle w:val="ListParagraph"/>
+        <w:numPr>
+          <w:ilvl w:val="0"/>
+          <w:numId w:val="2"/>
+        </w:numPr>
+        <w:tabs>
+          <w:tab w:val="center" w:pos="4513"/>
+          <w:tab w:val="left" w:pos="5844"/>
+        </w:tabs>
+        <w:rPr>
+          <w:lang w:val="en-US"/>
+        </w:rPr>
+      </w:pPr>
+      <w:r>
+        <w:rPr>
+          <w:lang w:val="en-US"/>
+        </w:rPr>
+        <w:t xml:space="preserve">A possible </w:t>
+      </w:r>
+      <w:proofErr w:type="gramStart"/>
+      <w:r>
+        <w:rPr>
+          <w:lang w:val="en-US"/>
+        </w:rPr>
+        <w:t xml:space="preserve">real </w:t>
+      </w:r>
+      <w:r>
+        <w:rPr>
+          <w:lang w:val="en-US"/>
+        </w:rPr>
+        <w:t>world</w:t>
+      </w:r>
+      <w:proofErr w:type="gramEnd"/>
+      <w:r>
+        <w:rPr>
+          <w:lang w:val="en-US"/>
+        </w:rPr>
+        <w:t xml:space="preserve"> implementation</w:t>
+      </w:r>
+      <w:r>
+        <w:rPr>
+          <w:lang w:val="en-US"/>
+        </w:rPr>
+        <w:t xml:space="preserve"> using the </w:t>
+      </w:r>
+      <w:proofErr w:type="spellStart"/>
+      <w:r>
+        <w:rPr>
+          <w:lang w:val="en-US"/>
+        </w:rPr>
+        <w:t>sport_client</w:t>
+      </w:r>
+      <w:proofErr w:type="spellEnd"/>
+      <w:r>
+        <w:rPr>
+          <w:lang w:val="en-US"/>
+        </w:rPr>
+        <w:t xml:space="preserve"> high level comman</w:t>
+      </w:r>
+      <w:r>
+        <w:rPr>
+          <w:lang w:val="en-US"/>
+        </w:rPr>
+        <w:t>d from the unitree SDK.</w:t>
+      </w:r>
+    </w:p>
+    <w:p>
+      <w:pPr>
+        <w:pStyle w:val="ListParagraph"/>
+        <w:numPr>
+          <w:ilvl w:val="0"/>
+          <w:numId w:val="1"/>
+        </w:numPr>
+        <w:tabs>
+          <w:tab w:val="center" w:pos="4513"/>
+          <w:tab w:val="left" w:pos="5844"/>
+        </w:tabs>
+        <w:rPr>
+          <w:sz w:val="32"/>
+          <w:szCs w:val="32"/>
+          <w:lang w:val="en-US"/>
+        </w:rPr>
+      </w:pPr>
+      <w:r>
+        <w:rPr>
+          <w:sz w:val="32"/>
+          <w:szCs w:val="32"/>
+          <w:lang w:val="en-US"/>
+        </w:rPr>
+        <w:t>Progress of Sprint 1 Stories</w:t>
+      </w:r>
+    </w:p>
     <w:tbl>
       <w:tblPr>
         <w:tblStyle w:val="TableGrid"/>
@@ -1353,7 +1685,11 @@
               </w:rPr>
             </w:pPr>
             <w:r>
-              <w:t>Implemented using MediaPipe's hand landmark model. Gestures are recorded by taking 20 samples of each gesture from a live camera feed. The landmark model assigns 21 points to the hand and records the 3D location of each point; these are flattened into a single 63-item array and stored.</w:t>
+              <w:t xml:space="preserve">Implemented using MediaPipe's hand landmark model. Gestures are recorded by taking 20 samples of each gesture from a live camera </w:t>
+            </w:r>
+            <w:r>
+              <w:lastRenderedPageBreak/>
+              <w:t>feed. The landmark model assigns 21 points to the hand and records the 3D location of each point; these are flattened into a single 63-item array and stored.</w:t>
             </w:r>
           </w:p>
         </w:tc>
@@ -1377,6 +1713,7 @@
               <w:rPr>
                 <w:lang w:val="en-US"/>
               </w:rPr>
+              <w:lastRenderedPageBreak/>
               <w:t>2.2</w:t>
             </w:r>
           </w:p>
@@ -1488,11 +1825,7 @@
               </w:rPr>
             </w:pPr>
             <w:r>
-              <w:t xml:space="preserve">As a developer, I want recognised gestures to be displayed with their frame number so </w:t>
-            </w:r>
-            <w:r>
-              <w:lastRenderedPageBreak/>
-              <w:t>that I can check whether gestures are being recognised correctly.</w:t>
+              <w:t>As a developer, I want recognised gestures to be displayed with their frame number so that I can check whether gestures are being recognised correctly.</w:t>
             </w:r>
           </w:p>
         </w:tc>
@@ -1516,7 +1849,6 @@
                 <w:bCs/>
                 <w:lang w:val="en-US"/>
               </w:rPr>
-              <w:lastRenderedPageBreak/>
               <w:t>COMPLETED</w:t>
             </w:r>
           </w:p>
@@ -1542,7 +1874,6 @@
               </w:rPr>
             </w:pPr>
             <w:r>
-              <w:lastRenderedPageBreak/>
               <w:t>Output goes to the terminal. On every gesture change, the program prints the recognised gesture, the calculated best distance (used to determine whether it falls under the threshold), and the number of milliseconds elapsed since the program started.</w:t>
             </w:r>
           </w:p>
@@ -1638,10 +1969,7 @@
               <w:t>A threshold (default 1.5) determines similarity to stored gesture data. A detected hand pose produces a vector; if its distance to a stored gesture falls below the threshold, that gesture is returned — otherwise the program returns "no match".</w:t>
             </w:r>
             <w:r>
-              <w:t xml:space="preserve"> Additionally</w:t>
-            </w:r>
-            <w:r>
-              <w:t xml:space="preserve"> chosen hand gestures are different enough so that 2 hand gestures may not accidentally be registered as each other due to similar vectors.</w:t>
+              <w:t xml:space="preserve"> Additionally chosen hand gestures are different enough so that 2 hand gestures may not accidentally be registered as each other due to similar vectors.</w:t>
             </w:r>
           </w:p>
         </w:tc>
@@ -1991,7 +2319,11 @@
               </w:rPr>
             </w:pPr>
             <w:r>
-              <w:t>As a user, I want the robot to follow the identified target person so that it can move with them as they move through the environment.</w:t>
+              <w:t xml:space="preserve">As a user, I want the robot to follow the identified target person so that it can move </w:t>
+            </w:r>
+            <w:r>
+              <w:lastRenderedPageBreak/>
+              <w:t>with them as they move through the environment.</w:t>
             </w:r>
           </w:p>
         </w:tc>
@@ -2006,9 +2338,49 @@
                 <w:tab w:val="left" w:pos="5844"/>
               </w:tabs>
               <w:rPr>
-                <w:lang w:val="en-US"/>
-              </w:rPr>
-            </w:pPr>
+                <w:b/>
+                <w:bCs/>
+                <w:lang w:val="en-US"/>
+              </w:rPr>
+            </w:pPr>
+            <w:r>
+              <w:rPr>
+                <w:b/>
+                <w:bCs/>
+                <w:lang w:val="en-US"/>
+              </w:rPr>
+              <w:lastRenderedPageBreak/>
+              <w:t>NOT STARTED</w:t>
+            </w:r>
+          </w:p>
+          <w:p>
+            <w:pPr>
+              <w:tabs>
+                <w:tab w:val="center" w:pos="4513"/>
+                <w:tab w:val="left" w:pos="5844"/>
+              </w:tabs>
+              <w:rPr>
+                <w:lang w:val="en-US"/>
+              </w:rPr>
+            </w:pPr>
+          </w:p>
+          <w:p>
+            <w:pPr>
+              <w:tabs>
+                <w:tab w:val="center" w:pos="4513"/>
+                <w:tab w:val="left" w:pos="5844"/>
+              </w:tabs>
+              <w:rPr>
+                <w:lang w:val="en-US"/>
+              </w:rPr>
+            </w:pPr>
+            <w:r>
+              <w:rPr>
+                <w:lang w:val="en-US"/>
+              </w:rPr>
+              <w:lastRenderedPageBreak/>
+              <w:t>To be implemented in future sprint. Has not been developed but solution will be feasibly adapted from previously developed code from `Person Identification`, and `Gesture Recognition` sections.</w:t>
+            </w:r>
           </w:p>
         </w:tc>
       </w:tr>
@@ -2031,6 +2403,7 @@
               <w:rPr>
                 <w:lang w:val="en-US"/>
               </w:rPr>
+              <w:lastRenderedPageBreak/>
               <w:t>4.2</w:t>
             </w:r>
           </w:p>
@@ -2065,309 +2438,47 @@
                 <w:tab w:val="left" w:pos="5844"/>
               </w:tabs>
               <w:rPr>
-                <w:lang w:val="en-US"/>
-              </w:rPr>
-            </w:pPr>
-          </w:p>
-        </w:tc>
-      </w:tr>
-      <w:tr>
-        <w:tc>
-          <w:tcPr>
-            <w:tcW w:w="562" w:type="dxa"/>
-          </w:tcPr>
-          <w:p>
-            <w:pPr>
-              <w:tabs>
-                <w:tab w:val="center" w:pos="4513"/>
-                <w:tab w:val="left" w:pos="5844"/>
-              </w:tabs>
-              <w:rPr>
-                <w:lang w:val="en-US"/>
-              </w:rPr>
-            </w:pPr>
-          </w:p>
-        </w:tc>
-        <w:tc>
-          <w:tcPr>
-            <w:tcW w:w="4719" w:type="dxa"/>
-          </w:tcPr>
-          <w:p>
-            <w:pPr>
-              <w:tabs>
-                <w:tab w:val="center" w:pos="4513"/>
-                <w:tab w:val="left" w:pos="5844"/>
-              </w:tabs>
-              <w:rPr>
-                <w:lang w:val="en-US"/>
-              </w:rPr>
-            </w:pPr>
-          </w:p>
-        </w:tc>
-        <w:tc>
-          <w:tcPr>
-            <w:tcW w:w="5175" w:type="dxa"/>
-          </w:tcPr>
-          <w:p>
-            <w:pPr>
-              <w:tabs>
-                <w:tab w:val="center" w:pos="4513"/>
-                <w:tab w:val="left" w:pos="5844"/>
-              </w:tabs>
-              <w:rPr>
-                <w:lang w:val="en-US"/>
-              </w:rPr>
-            </w:pPr>
-          </w:p>
-        </w:tc>
-      </w:tr>
-      <w:tr>
-        <w:tc>
-          <w:tcPr>
-            <w:tcW w:w="562" w:type="dxa"/>
-          </w:tcPr>
-          <w:p>
-            <w:pPr>
-              <w:tabs>
-                <w:tab w:val="center" w:pos="4513"/>
-                <w:tab w:val="left" w:pos="5844"/>
-              </w:tabs>
-              <w:rPr>
-                <w:lang w:val="en-US"/>
-              </w:rPr>
-            </w:pPr>
-          </w:p>
-        </w:tc>
-        <w:tc>
-          <w:tcPr>
-            <w:tcW w:w="4719" w:type="dxa"/>
-          </w:tcPr>
-          <w:p>
-            <w:pPr>
-              <w:tabs>
-                <w:tab w:val="center" w:pos="4513"/>
-                <w:tab w:val="left" w:pos="5844"/>
-              </w:tabs>
-              <w:rPr>
-                <w:lang w:val="en-US"/>
-              </w:rPr>
-            </w:pPr>
-          </w:p>
-        </w:tc>
-        <w:tc>
-          <w:tcPr>
-            <w:tcW w:w="5175" w:type="dxa"/>
-          </w:tcPr>
-          <w:p>
-            <w:pPr>
-              <w:tabs>
-                <w:tab w:val="center" w:pos="4513"/>
-                <w:tab w:val="left" w:pos="5844"/>
-              </w:tabs>
-              <w:rPr>
-                <w:lang w:val="en-US"/>
-              </w:rPr>
-            </w:pPr>
-          </w:p>
-        </w:tc>
-      </w:tr>
-      <w:tr>
-        <w:tc>
-          <w:tcPr>
-            <w:tcW w:w="562" w:type="dxa"/>
-          </w:tcPr>
-          <w:p>
-            <w:pPr>
-              <w:tabs>
-                <w:tab w:val="center" w:pos="4513"/>
-                <w:tab w:val="left" w:pos="5844"/>
-              </w:tabs>
-              <w:rPr>
-                <w:lang w:val="en-US"/>
-              </w:rPr>
-            </w:pPr>
-          </w:p>
-        </w:tc>
-        <w:tc>
-          <w:tcPr>
-            <w:tcW w:w="4719" w:type="dxa"/>
-          </w:tcPr>
-          <w:p>
-            <w:pPr>
-              <w:tabs>
-                <w:tab w:val="center" w:pos="4513"/>
-                <w:tab w:val="left" w:pos="5844"/>
-              </w:tabs>
-              <w:rPr>
-                <w:lang w:val="en-US"/>
-              </w:rPr>
-            </w:pPr>
-          </w:p>
-        </w:tc>
-        <w:tc>
-          <w:tcPr>
-            <w:tcW w:w="5175" w:type="dxa"/>
-          </w:tcPr>
-          <w:p>
-            <w:pPr>
-              <w:tabs>
-                <w:tab w:val="center" w:pos="4513"/>
-                <w:tab w:val="left" w:pos="5844"/>
-              </w:tabs>
-              <w:rPr>
-                <w:lang w:val="en-US"/>
-              </w:rPr>
-            </w:pPr>
-          </w:p>
-        </w:tc>
-      </w:tr>
-      <w:tr>
-        <w:tc>
-          <w:tcPr>
-            <w:tcW w:w="562" w:type="dxa"/>
-          </w:tcPr>
-          <w:p>
-            <w:pPr>
-              <w:tabs>
-                <w:tab w:val="center" w:pos="4513"/>
-                <w:tab w:val="left" w:pos="5844"/>
-              </w:tabs>
-              <w:rPr>
-                <w:lang w:val="en-US"/>
-              </w:rPr>
-            </w:pPr>
-          </w:p>
-        </w:tc>
-        <w:tc>
-          <w:tcPr>
-            <w:tcW w:w="4719" w:type="dxa"/>
-          </w:tcPr>
-          <w:p>
-            <w:pPr>
-              <w:tabs>
-                <w:tab w:val="center" w:pos="4513"/>
-                <w:tab w:val="left" w:pos="5844"/>
-              </w:tabs>
-              <w:rPr>
-                <w:lang w:val="en-US"/>
-              </w:rPr>
-            </w:pPr>
-          </w:p>
-        </w:tc>
-        <w:tc>
-          <w:tcPr>
-            <w:tcW w:w="5175" w:type="dxa"/>
-          </w:tcPr>
-          <w:p>
-            <w:pPr>
-              <w:tabs>
-                <w:tab w:val="center" w:pos="4513"/>
-                <w:tab w:val="left" w:pos="5844"/>
-              </w:tabs>
-              <w:rPr>
-                <w:lang w:val="en-US"/>
-              </w:rPr>
-            </w:pPr>
-          </w:p>
-        </w:tc>
-      </w:tr>
-      <w:tr>
-        <w:tc>
-          <w:tcPr>
-            <w:tcW w:w="562" w:type="dxa"/>
-          </w:tcPr>
-          <w:p>
-            <w:pPr>
-              <w:tabs>
-                <w:tab w:val="center" w:pos="4513"/>
-                <w:tab w:val="left" w:pos="5844"/>
-              </w:tabs>
-              <w:rPr>
-                <w:lang w:val="en-US"/>
-              </w:rPr>
-            </w:pPr>
-          </w:p>
-        </w:tc>
-        <w:tc>
-          <w:tcPr>
-            <w:tcW w:w="4719" w:type="dxa"/>
-          </w:tcPr>
-          <w:p>
-            <w:pPr>
-              <w:tabs>
-                <w:tab w:val="center" w:pos="4513"/>
-                <w:tab w:val="left" w:pos="5844"/>
-              </w:tabs>
-              <w:rPr>
-                <w:lang w:val="en-US"/>
-              </w:rPr>
-            </w:pPr>
-          </w:p>
-        </w:tc>
-        <w:tc>
-          <w:tcPr>
-            <w:tcW w:w="5175" w:type="dxa"/>
-          </w:tcPr>
-          <w:p>
-            <w:pPr>
-              <w:tabs>
-                <w:tab w:val="center" w:pos="4513"/>
-                <w:tab w:val="left" w:pos="5844"/>
-              </w:tabs>
-              <w:rPr>
-                <w:lang w:val="en-US"/>
-              </w:rPr>
-            </w:pPr>
-          </w:p>
-        </w:tc>
-      </w:tr>
-      <w:tr>
-        <w:tc>
-          <w:tcPr>
-            <w:tcW w:w="562" w:type="dxa"/>
-          </w:tcPr>
-          <w:p>
-            <w:pPr>
-              <w:tabs>
-                <w:tab w:val="center" w:pos="4513"/>
-                <w:tab w:val="left" w:pos="5844"/>
-              </w:tabs>
-              <w:rPr>
-                <w:lang w:val="en-US"/>
-              </w:rPr>
-            </w:pPr>
-          </w:p>
-        </w:tc>
-        <w:tc>
-          <w:tcPr>
-            <w:tcW w:w="4719" w:type="dxa"/>
-          </w:tcPr>
-          <w:p>
-            <w:pPr>
-              <w:tabs>
-                <w:tab w:val="center" w:pos="4513"/>
-                <w:tab w:val="left" w:pos="5844"/>
-              </w:tabs>
-              <w:rPr>
-                <w:lang w:val="en-US"/>
-              </w:rPr>
-            </w:pPr>
-          </w:p>
-        </w:tc>
-        <w:tc>
-          <w:tcPr>
-            <w:tcW w:w="5175" w:type="dxa"/>
-          </w:tcPr>
-          <w:p>
-            <w:pPr>
-              <w:tabs>
-                <w:tab w:val="center" w:pos="4513"/>
-                <w:tab w:val="left" w:pos="5844"/>
-              </w:tabs>
-              <w:rPr>
-                <w:lang w:val="en-US"/>
-              </w:rPr>
-            </w:pPr>
+                <w:b/>
+                <w:bCs/>
+                <w:lang w:val="en-US"/>
+              </w:rPr>
+            </w:pPr>
+            <w:r>
+              <w:rPr>
+                <w:b/>
+                <w:bCs/>
+                <w:lang w:val="en-US"/>
+              </w:rPr>
+              <w:t>NOT STARTED</w:t>
+            </w:r>
+          </w:p>
+          <w:p>
+            <w:pPr>
+              <w:tabs>
+                <w:tab w:val="center" w:pos="4513"/>
+                <w:tab w:val="left" w:pos="5844"/>
+              </w:tabs>
+              <w:rPr>
+                <w:lang w:val="en-US"/>
+              </w:rPr>
+            </w:pPr>
+          </w:p>
+          <w:p>
+            <w:pPr>
+              <w:tabs>
+                <w:tab w:val="center" w:pos="4513"/>
+                <w:tab w:val="left" w:pos="5844"/>
+              </w:tabs>
+              <w:rPr>
+                <w:lang w:val="en-US"/>
+              </w:rPr>
+            </w:pPr>
+            <w:r>
+              <w:rPr>
+                <w:lang w:val="en-US"/>
+              </w:rPr>
+              <w:t>To be implemented in future sprint. Has not been developed but solution will be feasibly adapted from previously developed code from `Person Identification`, and `Gesture Recognition` sections.</w:t>
+            </w:r>
           </w:p>
         </w:tc>
       </w:tr>
@@ -2429,6 +2540,58 @@
           <w:tab w:val="left" w:pos="5844"/>
         </w:tabs>
         <w:rPr>
+          <w:lang w:val="en-US"/>
+        </w:rPr>
+      </w:pPr>
+    </w:p>
+    <w:p>
+      <w:pPr>
+        <w:tabs>
+          <w:tab w:val="center" w:pos="4513"/>
+          <w:tab w:val="left" w:pos="5844"/>
+        </w:tabs>
+        <w:rPr>
+          <w:sz w:val="32"/>
+          <w:szCs w:val="32"/>
+          <w:lang w:val="en-US"/>
+        </w:rPr>
+      </w:pPr>
+    </w:p>
+    <w:p>
+      <w:pPr>
+        <w:pStyle w:val="ListParagraph"/>
+        <w:numPr>
+          <w:ilvl w:val="0"/>
+          <w:numId w:val="1"/>
+        </w:numPr>
+        <w:tabs>
+          <w:tab w:val="center" w:pos="4513"/>
+          <w:tab w:val="left" w:pos="5844"/>
+        </w:tabs>
+        <w:rPr>
+          <w:sz w:val="32"/>
+          <w:szCs w:val="32"/>
+          <w:lang w:val="en-US"/>
+        </w:rPr>
+      </w:pPr>
+      <w:r>
+        <w:rPr>
+          <w:sz w:val="32"/>
+          <w:szCs w:val="32"/>
+          <w:lang w:val="en-US"/>
+        </w:rPr>
+        <w:t>Timeline Reflection</w:t>
+      </w:r>
+    </w:p>
+    <w:p>
+      <w:pPr>
+        <w:tabs>
+          <w:tab w:val="center" w:pos="4513"/>
+          <w:tab w:val="left" w:pos="5844"/>
+        </w:tabs>
+        <w:rPr>
+          <w:sz w:val="32"/>
+          <w:szCs w:val="32"/>
           <w:lang w:val="en-US"/>
         </w:rPr>
       </w:pPr>
@@ -2441,6 +2604,219 @@
     </w:sectPr>
   </w:body>
 </w:document>
+</file>
+
+<file path=word/numbering.xml><?xml version="1.0" encoding="utf-8"?>
+<w:numbering xmlns:wpc="http://schemas.microsoft.com/office/word/2010/wordprocessingCanvas" xmlns:cx="http://schemas.microsoft.com/office/drawing/2014/chartex" xmlns:cx1="http://schemas.microsoft.com/office/drawing/2015/9/8/chartex" xmlns:cx2="http://schemas.microsoft.com/office/drawing/2015/10/21/chartex" xmlns:cx3="http://schemas.microsoft.com/office/drawing/2016/5/9/chartex" xmlns:cx4="http://schemas.microsoft.com/office/drawing/2016/5/10/chartex" xmlns:cx5="http://schemas.microsoft.com/office/drawing/2016/5/11/chartex" xmlns:cx6="http://schemas.microsoft.com/office/drawing/2016/5/12/chartex" xmlns:cx7="http://schemas.microsoft.com/office/drawing/2016/5/13/chartex" xmlns:cx8="http://schemas.microsoft.com/office/drawing/2016/5/14/chartex" xmlns:mc="http://schemas.openxmlformats.org/markup-compatibility/2006" xmlns:aink="http://schemas.microsoft.com/office/drawing/2016/ink" xmlns:am3d="http://schemas.microsoft.com/office/drawing/2017/model3d" xmlns:o="urn:schemas-microsoft-com:office:office" xmlns:oel="http://schemas.microsoft.com/office/2019/extlst" xmlns:r="http://schemas.openxmlformats.org/officeDocument/2006/relationships" xmlns:m="http://schemas.openxmlformats.org/officeDocument/2006/math" xmlns:v="urn:schemas-microsoft-com:vml" xmlns:wp14="http://schemas.microsoft.com/office/word/2010/wordprocessingDrawing" xmlns:wp="http://schemas.openxmlformats.org/drawingml/2006/wordprocessingDrawing" xmlns:w10="urn:schemas-microsoft-com:office:word" xmlns:w="http://schemas.openxmlformats.org/wordprocessingml/2006/main" xmlns:w14="http://schemas.microsoft.com/office/word/2010/wordml" xmlns:w15="http://schemas.microsoft.com/office/word/2012/wordml" xmlns:w16cex="http://schemas.microsoft.com/office/word/2018/wordml/cex" xmlns:w16cid="http://schemas.microsoft.com/office/word/2016/wordml/cid" xmlns:w16="http://schemas.microsoft.com/office/word/2018/wordml" xmlns:w16du="http://schemas.microsoft.com/office/word/2023/wordml/word16du" xmlns:w16sdtdh="http://schemas.microsoft.com/office/word/2020/wordml/sdtdatahash" xmlns:w16sdtfl="http://schemas.microsoft.com/office/word/2024/wordml/sdtformatlock" xmlns:w16se="http://schemas.microsoft.com/office/word/2015/wordml/symex" xmlns:wpg="http://schemas.microsoft.com/office/word/2010/wordprocessingGroup" xmlns:wpi="http://schemas.microsoft.com/office/word/2010/wordprocessingInk" xmlns:wne="http://schemas.microsoft.com/office/word/2006/wordml" xmlns:wps="http://schemas.microsoft.com/office/word/2010/wordprocessingShape" mc:Ignorable="w14 w15 w16se w16cid w16 w16cex w16sdtdh w16sdtfl w16du wp14">
+  <w:abstractNum w:abstractNumId="0" w15:restartNumberingAfterBreak="0">
+    <w:nsid w:val="3D4E20E2"/>
+    <w:multiLevelType w:val="hybridMultilevel"/>
+    <w:tmpl w:val="AB8EE31A"/>
+    <w:lvl w:ilvl="0" w:tplc="0C09000F">
+      <w:start w:val="1"/>
+      <w:numFmt w:val="decimal"/>
+      <w:lvlText w:val="%1."/>
+      <w:lvlJc w:val="left"/>
+      <w:pPr>
+        <w:ind w:left="720" w:hanging="360"/>
+      </w:pPr>
+      <w:rPr>
+        <w:rFonts w:hint="default"/>
+      </w:rPr>
+    </w:lvl>
+    <w:lvl w:ilvl="1" w:tplc="0C090019" w:tentative="1">
+      <w:start w:val="1"/>
+      <w:numFmt w:val="lowerLetter"/>
+      <w:lvlText w:val="%2."/>
+      <w:lvlJc w:val="left"/>
+      <w:pPr>
+        <w:ind w:left="1440" w:hanging="360"/>
+      </w:pPr>
+    </w:lvl>
+    <w:lvl w:ilvl="2" w:tplc="0C09001B" w:tentative="1">
+      <w:start w:val="1"/>
+      <w:numFmt w:val="lowerRoman"/>
+      <w:lvlText w:val="%3."/>
+      <w:lvlJc w:val="right"/>
+      <w:pPr>
+        <w:ind w:left="2160" w:hanging="180"/>
+      </w:pPr>
+    </w:lvl>
+    <w:lvl w:ilvl="3" w:tplc="0C09000F" w:tentative="1">
+      <w:start w:val="1"/>
+      <w:numFmt w:val="decimal"/>
+      <w:lvlText w:val="%4."/>
+      <w:lvlJc w:val="left"/>
+      <w:pPr>
+        <w:ind w:left="2880" w:hanging="360"/>
+      </w:pPr>
+    </w:lvl>
+    <w:lvl w:ilvl="4" w:tplc="0C090019" w:tentative="1">
+      <w:start w:val="1"/>
+      <w:numFmt w:val="lowerLetter"/>
+      <w:lvlText w:val="%5."/>
+      <w:lvlJc w:val="left"/>
+      <w:pPr>
+        <w:ind w:left="3600" w:hanging="360"/>
+      </w:pPr>
+    </w:lvl>
+    <w:lvl w:ilvl="5" w:tplc="0C09001B" w:tentative="1">
+      <w:start w:val="1"/>
+      <w:numFmt w:val="lowerRoman"/>
+      <w:lvlText w:val="%6."/>
+      <w:lvlJc w:val="right"/>
+      <w:pPr>
+        <w:ind w:left="4320" w:hanging="180"/>
+      </w:pPr>
+    </w:lvl>
+    <w:lvl w:ilvl="6" w:tplc="0C09000F" w:tentative="1">
+      <w:start w:val="1"/>
+      <w:numFmt w:val="decimal"/>
+      <w:lvlText w:val="%7."/>
+      <w:lvlJc w:val="left"/>
+      <w:pPr>
+        <w:ind w:left="5040" w:hanging="360"/>
+      </w:pPr>
+    </w:lvl>
+    <w:lvl w:ilvl="7" w:tplc="0C090019" w:tentative="1">
+      <w:start w:val="1"/>
+      <w:numFmt w:val="lowerLetter"/>
+      <w:lvlText w:val="%8."/>
+      <w:lvlJc w:val="left"/>
+      <w:pPr>
+        <w:ind w:left="5760" w:hanging="360"/>
+      </w:pPr>
+    </w:lvl>
+    <w:lvl w:ilvl="8" w:tplc="0C09001B" w:tentative="1">
+      <w:start w:val="1"/>
+      <w:numFmt w:val="lowerRoman"/>
+      <w:lvlText w:val="%9."/>
+      <w:lvlJc w:val="right"/>
+      <w:pPr>
+        <w:ind w:left="6480" w:hanging="180"/>
+      </w:pPr>
+    </w:lvl>
+  </w:abstractNum>
+  <w:abstractNum w:abstractNumId="1" w15:restartNumberingAfterBreak="0">
+    <w:nsid w:val="6A551FB0"/>
+    <w:multiLevelType w:val="hybridMultilevel"/>
+    <w:tmpl w:val="EA6E268A"/>
+    <w:lvl w:ilvl="0" w:tplc="3F9A6264">
+      <w:start w:val="1"/>
+      <w:numFmt w:val="bullet"/>
+      <w:lvlText w:val="-"/>
+      <w:lvlJc w:val="left"/>
+      <w:pPr>
+        <w:ind w:left="720" w:hanging="360"/>
+      </w:pPr>
+      <w:rPr>
+        <w:rFonts w:ascii="Aptos" w:eastAsiaTheme="minorHAnsi" w:hAnsi="Aptos" w:cstheme="minorBidi" w:hint="default"/>
+      </w:rPr>
+    </w:lvl>
+    <w:lvl w:ilvl="1" w:tplc="0C090003" w:tentative="1">
+      <w:start w:val="1"/>
+      <w:numFmt w:val="bullet"/>
+      <w:lvlText w:val="o"/>
+      <w:lvlJc w:val="left"/>
+      <w:pPr>
+        <w:ind w:left="1440" w:hanging="360"/>
+      </w:pPr>
+      <w:rPr>
+        <w:rFonts w:ascii="Courier New" w:hAnsi="Courier New" w:cs="Courier New" w:hint="default"/>
+      </w:rPr>
+    </w:lvl>
+    <w:lvl w:ilvl="2" w:tplc="0C090005" w:tentative="1">
+      <w:start w:val="1"/>
+      <w:numFmt w:val="bullet"/>
+      <w:lvlText w:val=""/>
+      <w:lvlJc w:val="left"/>
+      <w:pPr>
+        <w:ind w:left="2160" w:hanging="360"/>
+      </w:pPr>
+      <w:rPr>
+        <w:rFonts w:ascii="Wingdings" w:hAnsi="Wingdings" w:hint="default"/>
+      </w:rPr>
+    </w:lvl>
+    <w:lvl w:ilvl="3" w:tplc="0C090001" w:tentative="1">
+      <w:start w:val="1"/>
+      <w:numFmt w:val="bullet"/>
+      <w:lvlText w:val=""/>
+      <w:lvlJc w:val="left"/>
+      <w:pPr>
+        <w:ind w:left="2880" w:hanging="360"/>
+      </w:pPr>
+      <w:rPr>
+        <w:rFonts w:ascii="Symbol" w:hAnsi="Symbol" w:hint="default"/>
+      </w:rPr>
+    </w:lvl>
+    <w:lvl w:ilvl="4" w:tplc="0C090003" w:tentative="1">
+      <w:start w:val="1"/>
+      <w:numFmt w:val="bullet"/>
+      <w:lvlText w:val="o"/>
+      <w:lvlJc w:val="left"/>
+      <w:pPr>
+        <w:ind w:left="3600" w:hanging="360"/>
+      </w:pPr>
+      <w:rPr>
+        <w:rFonts w:ascii="Courier New" w:hAnsi="Courier New" w:cs="Courier New" w:hint="default"/>
+      </w:rPr>
+    </w:lvl>
+    <w:lvl w:ilvl="5" w:tplc="0C090005" w:tentative="1">
+      <w:start w:val="1"/>
+      <w:numFmt w:val="bullet"/>
+      <w:lvlText w:val=""/>
+      <w:lvlJc w:val="left"/>
+      <w:pPr>
+        <w:ind w:left="4320" w:hanging="360"/>
+      </w:pPr>
+      <w:rPr>
+        <w:rFonts w:ascii="Wingdings" w:hAnsi="Wingdings" w:hint="default"/>
+      </w:rPr>
+    </w:lvl>
+    <w:lvl w:ilvl="6" w:tplc="0C090001" w:tentative="1">
+      <w:start w:val="1"/>
+      <w:numFmt w:val="bullet"/>
+      <w:lvlText w:val=""/>
+      <w:lvlJc w:val="left"/>
+      <w:pPr>
+        <w:ind w:left="5040" w:hanging="360"/>
+      </w:pPr>
+      <w:rPr>
+        <w:rFonts w:ascii="Symbol" w:hAnsi="Symbol" w:hint="default"/>
+      </w:rPr>
+    </w:lvl>
+    <w:lvl w:ilvl="7" w:tplc="0C090003" w:tentative="1">
+      <w:start w:val="1"/>
+      <w:numFmt w:val="bullet"/>
+      <w:lvlText w:val="o"/>
+      <w:lvlJc w:val="left"/>
+      <w:pPr>
+        <w:ind w:left="5760" w:hanging="360"/>
+      </w:pPr>
+      <w:rPr>
+        <w:rFonts w:ascii="Courier New" w:hAnsi="Courier New" w:cs="Courier New" w:hint="default"/>
+      </w:rPr>
+    </w:lvl>
+    <w:lvl w:ilvl="8" w:tplc="0C090005" w:tentative="1">
+      <w:start w:val="1"/>
+      <w:numFmt w:val="bullet"/>
+      <w:lvlText w:val=""/>
+      <w:lvlJc w:val="left"/>
+      <w:pPr>
+        <w:ind w:left="6480" w:hanging="360"/>
+      </w:pPr>
+      <w:rPr>
+        <w:rFonts w:ascii="Wingdings" w:hAnsi="Wingdings" w:hint="default"/>
+      </w:rPr>
+    </w:lvl>
+  </w:abstractNum>
+  <w:num w:numId="1" w16cid:durableId="1226332060">
+    <w:abstractNumId w:val="0"/>
+  </w:num>
+  <w:num w:numId="2" w16cid:durableId="44106101">
+    <w:abstractNumId w:val="1"/>
+  </w:num>
+</w:numbering>
 </file>
 
 <file path=word/styles.xml><?xml version="1.0" encoding="utf-8"?>
@@ -3046,6 +3422,7 @@
   <w:style w:type="character" w:default="1" w:styleId="DefaultParagraphFont">
     <w:name w:val="Default Paragraph Font"/>
     <w:uiPriority w:val="1"/>
+    <w:semiHidden/>
     <w:unhideWhenUsed/>
   </w:style>
   <w:style w:type="table" w:default="1" w:styleId="TableNormal">

</xml_diff>

<commit_message>
Read and edited minutes as well as start on the Retrospective
</commit_message>
<xml_diff>
--- a/Documentation/Sprint 2 Deliverables/Client_Meeting_Minutes_&_Retrospective.docx
+++ b/Documentation/Sprint 2 Deliverables/Client_Meeting_Minutes_&_Retrospective.docx
@@ -47,7 +47,7 @@
           <w:szCs w:val="48"/>
           <w:lang w:val="en-US"/>
         </w:rPr>
-        <w:t>M</w:t>
+        <w:t xml:space="preserve">Minutes of Meeting </w:t>
       </w:r>
       <w:r>
         <w:rPr>
@@ -57,27 +57,7 @@
           <w:szCs w:val="48"/>
           <w:lang w:val="en-US"/>
         </w:rPr>
-        <w:t xml:space="preserve">inutes of </w:t>
-      </w:r>
-      <w:r>
-        <w:rPr>
-          <w:b/>
-          <w:bCs/>
-          <w:sz w:val="48"/>
-          <w:szCs w:val="48"/>
-          <w:lang w:val="en-US"/>
-        </w:rPr>
-        <w:t xml:space="preserve">Sprint 2 Client </w:t>
-      </w:r>
-      <w:r>
-        <w:rPr>
-          <w:b/>
-          <w:bCs/>
-          <w:sz w:val="48"/>
-          <w:szCs w:val="48"/>
-          <w:lang w:val="en-US"/>
-        </w:rPr>
-        <w:t>Meeting</w:t>
+        <w:t>8</w:t>
       </w:r>
     </w:p>
     <w:p>
@@ -99,7 +79,31 @@
           <w:szCs w:val="32"/>
           <w:lang w:val="en-US"/>
         </w:rPr>
-        <w:t>DD/MM/2026</w:t>
+        <w:t>16</w:t>
+      </w:r>
+      <w:r>
+        <w:rPr>
+          <w:sz w:val="32"/>
+          <w:szCs w:val="32"/>
+          <w:lang w:val="en-US"/>
+        </w:rPr>
+        <w:t>/</w:t>
+      </w:r>
+      <w:r>
+        <w:rPr>
+          <w:sz w:val="32"/>
+          <w:szCs w:val="32"/>
+          <w:lang w:val="en-US"/>
+        </w:rPr>
+        <w:t>09</w:t>
+      </w:r>
+      <w:r>
+        <w:rPr>
+          <w:sz w:val="32"/>
+          <w:szCs w:val="32"/>
+          <w:lang w:val="en-US"/>
+        </w:rPr>
+        <w:t>/2026</w:t>
       </w:r>
     </w:p>
     <w:p>
@@ -116,7 +120,35 @@
         <w:rPr>
           <w:lang w:val="en-US"/>
         </w:rPr>
-        <w:t xml:space="preserve">Present: </w:t>
+        <w:t xml:space="preserve">Present: Christo, Dylan, </w:t>
+      </w:r>
+      <w:proofErr w:type="spellStart"/>
+      <w:r>
+        <w:rPr>
+          <w:lang w:val="en-US"/>
+        </w:rPr>
+        <w:t>Lithasa</w:t>
+      </w:r>
+      <w:proofErr w:type="spellEnd"/>
+      <w:r>
+        <w:rPr>
+          <w:lang w:val="en-US"/>
+        </w:rPr>
+        <w:t xml:space="preserve">, </w:t>
+      </w:r>
+      <w:proofErr w:type="spellStart"/>
+      <w:r>
+        <w:rPr>
+          <w:lang w:val="en-US"/>
+        </w:rPr>
+        <w:t>Dhava</w:t>
+      </w:r>
+      <w:proofErr w:type="spellEnd"/>
+      <w:r>
+        <w:rPr>
+          <w:lang w:val="en-US"/>
+        </w:rPr>
+        <w:t>, Murphy, Terry</w:t>
       </w:r>
     </w:p>
     <w:p>
@@ -150,13 +182,7 @@
         <w:rPr>
           <w:lang w:val="en-US"/>
         </w:rPr>
-        <w:t>Absentees:</w:t>
-      </w:r>
-      <w:r>
-        <w:rPr>
-          <w:lang w:val="en-US"/>
-        </w:rPr>
-        <w:t xml:space="preserve"> </w:t>
+        <w:t xml:space="preserve">Absentees: </w:t>
       </w:r>
     </w:p>
     <w:p>
@@ -173,13 +199,7 @@
         <w:rPr>
           <w:lang w:val="en-US"/>
         </w:rPr>
-        <w:t>Meeting Start:</w:t>
-      </w:r>
-      <w:r>
-        <w:rPr>
-          <w:lang w:val="en-US"/>
-        </w:rPr>
-        <w:t xml:space="preserve"> </w:t>
+        <w:t>Meeting Start: 1.00pm</w:t>
       </w:r>
     </w:p>
     <w:p>
@@ -196,13 +216,7 @@
         <w:rPr>
           <w:lang w:val="en-US"/>
         </w:rPr>
-        <w:t>Meeting End:</w:t>
-      </w:r>
-      <w:r>
-        <w:rPr>
-          <w:lang w:val="en-US"/>
-        </w:rPr>
-        <w:t xml:space="preserve"> </w:t>
+        <w:t>Meeting End: 1:30pm</w:t>
       </w:r>
     </w:p>
     <w:tbl>
@@ -210,19 +224,20 @@
         <w:tblStyle w:val="TableGrid"/>
         <w:tblW w:w="11624" w:type="dxa"/>
         <w:tblInd w:w="-572" w:type="dxa"/>
+        <w:tblLayout w:type="fixed"/>
         <w:tblLook w:val="04A0" w:firstRow="1" w:lastRow="0" w:firstColumn="1" w:lastColumn="0" w:noHBand="0" w:noVBand="1"/>
       </w:tblPr>
       <w:tblGrid>
-        <w:gridCol w:w="822"/>
-        <w:gridCol w:w="987"/>
-        <w:gridCol w:w="2160"/>
+        <w:gridCol w:w="821"/>
+        <w:gridCol w:w="810"/>
+        <w:gridCol w:w="1399"/>
+        <w:gridCol w:w="4625"/>
         <w:gridCol w:w="3969"/>
-        <w:gridCol w:w="3686"/>
       </w:tblGrid>
       <w:tr>
         <w:tc>
           <w:tcPr>
-            <w:tcW w:w="822" w:type="dxa"/>
+            <w:tcW w:w="821" w:type="dxa"/>
             <w:shd w:val="clear" w:color="auto" w:fill="83CAEB" w:themeFill="accent1" w:themeFillTint="66"/>
           </w:tcPr>
           <w:p>
@@ -249,7 +264,7 @@
         </w:tc>
         <w:tc>
           <w:tcPr>
-            <w:tcW w:w="987" w:type="dxa"/>
+            <w:tcW w:w="810" w:type="dxa"/>
             <w:shd w:val="clear" w:color="auto" w:fill="83CAEB" w:themeFill="accent1" w:themeFillTint="66"/>
           </w:tcPr>
           <w:p>
@@ -276,7 +291,7 @@
         </w:tc>
         <w:tc>
           <w:tcPr>
-            <w:tcW w:w="2160" w:type="dxa"/>
+            <w:tcW w:w="1399" w:type="dxa"/>
             <w:shd w:val="clear" w:color="auto" w:fill="83CAEB" w:themeFill="accent1" w:themeFillTint="66"/>
           </w:tcPr>
           <w:p>
@@ -303,6 +318,33 @@
         </w:tc>
         <w:tc>
           <w:tcPr>
+            <w:tcW w:w="4625" w:type="dxa"/>
+            <w:shd w:val="clear" w:color="auto" w:fill="83CAEB" w:themeFill="accent1" w:themeFillTint="66"/>
+          </w:tcPr>
+          <w:p>
+            <w:pPr>
+              <w:tabs>
+                <w:tab w:val="center" w:pos="4513"/>
+                <w:tab w:val="left" w:pos="5844"/>
+              </w:tabs>
+              <w:rPr>
+                <w:b/>
+                <w:bCs/>
+                <w:lang w:val="en-US"/>
+              </w:rPr>
+            </w:pPr>
+            <w:r>
+              <w:rPr>
+                <w:b/>
+                <w:bCs/>
+                <w:lang w:val="en-US"/>
+              </w:rPr>
+              <w:t>Details:</w:t>
+            </w:r>
+          </w:p>
+        </w:tc>
+        <w:tc>
+          <w:tcPr>
             <w:tcW w:w="3969" w:type="dxa"/>
             <w:shd w:val="clear" w:color="auto" w:fill="83CAEB" w:themeFill="accent1" w:themeFillTint="66"/>
           </w:tcPr>
@@ -324,33 +366,6 @@
                 <w:bCs/>
                 <w:lang w:val="en-US"/>
               </w:rPr>
-              <w:t>Details:</w:t>
-            </w:r>
-          </w:p>
-        </w:tc>
-        <w:tc>
-          <w:tcPr>
-            <w:tcW w:w="3686" w:type="dxa"/>
-            <w:shd w:val="clear" w:color="auto" w:fill="83CAEB" w:themeFill="accent1" w:themeFillTint="66"/>
-          </w:tcPr>
-          <w:p>
-            <w:pPr>
-              <w:tabs>
-                <w:tab w:val="center" w:pos="4513"/>
-                <w:tab w:val="left" w:pos="5844"/>
-              </w:tabs>
-              <w:rPr>
-                <w:b/>
-                <w:bCs/>
-                <w:lang w:val="en-US"/>
-              </w:rPr>
-            </w:pPr>
-            <w:r>
-              <w:rPr>
-                <w:b/>
-                <w:bCs/>
-                <w:lang w:val="en-US"/>
-              </w:rPr>
               <w:t>Action:</w:t>
             </w:r>
           </w:p>
@@ -359,64 +374,127 @@
       <w:tr>
         <w:tc>
           <w:tcPr>
-            <w:tcW w:w="822" w:type="dxa"/>
-          </w:tcPr>
-          <w:p>
-            <w:pPr>
-              <w:tabs>
-                <w:tab w:val="center" w:pos="4513"/>
-                <w:tab w:val="left" w:pos="5844"/>
-              </w:tabs>
-              <w:rPr>
-                <w:sz w:val="20"/>
-                <w:szCs w:val="20"/>
-                <w:lang w:val="en-US"/>
-              </w:rPr>
-            </w:pPr>
-            <w:r>
-              <w:rPr>
-                <w:sz w:val="20"/>
-                <w:szCs w:val="20"/>
-                <w:lang w:val="en-US"/>
-              </w:rPr>
-              <w:t>1100</w:t>
-            </w:r>
-          </w:p>
-        </w:tc>
-        <w:tc>
-          <w:tcPr>
-            <w:tcW w:w="987" w:type="dxa"/>
-          </w:tcPr>
-          <w:p>
-            <w:pPr>
-              <w:tabs>
-                <w:tab w:val="center" w:pos="4513"/>
-                <w:tab w:val="left" w:pos="5844"/>
-              </w:tabs>
-              <w:rPr>
-                <w:sz w:val="20"/>
-                <w:szCs w:val="20"/>
-                <w:lang w:val="en-US"/>
-              </w:rPr>
-            </w:pPr>
-          </w:p>
-        </w:tc>
-        <w:tc>
-          <w:tcPr>
-            <w:tcW w:w="2160" w:type="dxa"/>
-          </w:tcPr>
-          <w:p>
-            <w:pPr>
-              <w:tabs>
-                <w:tab w:val="center" w:pos="4513"/>
-                <w:tab w:val="left" w:pos="5844"/>
-              </w:tabs>
-              <w:rPr>
-                <w:sz w:val="20"/>
-                <w:szCs w:val="20"/>
-                <w:lang w:val="en-US"/>
-              </w:rPr>
-            </w:pPr>
+            <w:tcW w:w="821" w:type="dxa"/>
+          </w:tcPr>
+          <w:p>
+            <w:pPr>
+              <w:tabs>
+                <w:tab w:val="center" w:pos="4513"/>
+                <w:tab w:val="left" w:pos="5844"/>
+              </w:tabs>
+              <w:rPr>
+                <w:sz w:val="20"/>
+                <w:szCs w:val="20"/>
+                <w:lang w:val="en-US"/>
+              </w:rPr>
+            </w:pPr>
+            <w:r>
+              <w:rPr>
+                <w:sz w:val="20"/>
+                <w:szCs w:val="20"/>
+                <w:lang w:val="en-US"/>
+              </w:rPr>
+              <w:t>13:00</w:t>
+            </w:r>
+          </w:p>
+        </w:tc>
+        <w:tc>
+          <w:tcPr>
+            <w:tcW w:w="810" w:type="dxa"/>
+          </w:tcPr>
+          <w:p>
+            <w:pPr>
+              <w:tabs>
+                <w:tab w:val="center" w:pos="4513"/>
+                <w:tab w:val="left" w:pos="5844"/>
+              </w:tabs>
+              <w:rPr>
+                <w:sz w:val="20"/>
+                <w:szCs w:val="20"/>
+                <w:lang w:val="en-US"/>
+              </w:rPr>
+            </w:pPr>
+            <w:r>
+              <w:rPr>
+                <w:sz w:val="20"/>
+                <w:szCs w:val="20"/>
+                <w:lang w:val="en-US"/>
+              </w:rPr>
+              <w:t>1</w:t>
+            </w:r>
+          </w:p>
+        </w:tc>
+        <w:tc>
+          <w:tcPr>
+            <w:tcW w:w="1399" w:type="dxa"/>
+          </w:tcPr>
+          <w:p>
+            <w:pPr>
+              <w:tabs>
+                <w:tab w:val="center" w:pos="4513"/>
+                <w:tab w:val="left" w:pos="5844"/>
+              </w:tabs>
+              <w:rPr>
+                <w:sz w:val="20"/>
+                <w:szCs w:val="20"/>
+                <w:lang w:val="en-US"/>
+              </w:rPr>
+            </w:pPr>
+            <w:r>
+              <w:rPr>
+                <w:sz w:val="20"/>
+                <w:szCs w:val="20"/>
+                <w:lang w:val="en-US"/>
+              </w:rPr>
+              <w:t>Demo</w:t>
+            </w:r>
+          </w:p>
+        </w:tc>
+        <w:tc>
+          <w:tcPr>
+            <w:tcW w:w="4625" w:type="dxa"/>
+          </w:tcPr>
+          <w:p>
+            <w:pPr>
+              <w:tabs>
+                <w:tab w:val="center" w:pos="4513"/>
+                <w:tab w:val="left" w:pos="5844"/>
+              </w:tabs>
+              <w:rPr>
+                <w:sz w:val="20"/>
+                <w:szCs w:val="20"/>
+                <w:lang w:val="en-US"/>
+              </w:rPr>
+            </w:pPr>
+            <w:r>
+              <w:rPr>
+                <w:sz w:val="20"/>
+                <w:szCs w:val="20"/>
+                <w:lang w:val="en-US"/>
+              </w:rPr>
+              <w:t>Demonstrated gesture recognition prototype</w:t>
+            </w:r>
+          </w:p>
+          <w:p>
+            <w:pPr>
+              <w:tabs>
+                <w:tab w:val="center" w:pos="4513"/>
+                <w:tab w:val="left" w:pos="5844"/>
+              </w:tabs>
+              <w:rPr>
+                <w:sz w:val="20"/>
+                <w:szCs w:val="20"/>
+                <w:lang w:val="en-US"/>
+              </w:rPr>
+            </w:pPr>
+            <w:r>
+              <w:rPr>
+                <w:sz w:val="20"/>
+                <w:szCs w:val="20"/>
+                <w:lang w:val="en-US"/>
+              </w:rPr>
+              <w:t>Demonstrated person identification</w:t>
+            </w:r>
           </w:p>
         </w:tc>
         <w:tc>
@@ -429,24 +507,7 @@
                 <w:tab w:val="center" w:pos="4513"/>
                 <w:tab w:val="left" w:pos="5844"/>
               </w:tabs>
-              <w:rPr>
-                <w:sz w:val="20"/>
-                <w:szCs w:val="20"/>
-                <w:lang w:val="en-US"/>
-              </w:rPr>
-            </w:pPr>
-          </w:p>
-        </w:tc>
-        <w:tc>
-          <w:tcPr>
-            <w:tcW w:w="3686" w:type="dxa"/>
-          </w:tcPr>
-          <w:p>
-            <w:pPr>
-              <w:tabs>
-                <w:tab w:val="center" w:pos="4513"/>
-                <w:tab w:val="left" w:pos="5844"/>
-              </w:tabs>
+              <w:ind w:left="360"/>
               <w:rPr>
                 <w:sz w:val="20"/>
                 <w:szCs w:val="20"/>
@@ -459,56 +520,510 @@
       <w:tr>
         <w:tc>
           <w:tcPr>
-            <w:tcW w:w="822" w:type="dxa"/>
-          </w:tcPr>
-          <w:p>
-            <w:pPr>
-              <w:tabs>
-                <w:tab w:val="center" w:pos="4513"/>
-                <w:tab w:val="left" w:pos="5844"/>
-              </w:tabs>
-              <w:rPr>
-                <w:sz w:val="20"/>
-                <w:szCs w:val="20"/>
-                <w:lang w:val="en-US"/>
-              </w:rPr>
-            </w:pPr>
-          </w:p>
-        </w:tc>
-        <w:tc>
-          <w:tcPr>
-            <w:tcW w:w="987" w:type="dxa"/>
-          </w:tcPr>
-          <w:p>
-            <w:pPr>
-              <w:tabs>
-                <w:tab w:val="center" w:pos="4513"/>
-                <w:tab w:val="left" w:pos="5844"/>
-              </w:tabs>
-              <w:rPr>
-                <w:sz w:val="20"/>
-                <w:szCs w:val="20"/>
-                <w:lang w:val="en-US"/>
-              </w:rPr>
-            </w:pPr>
-          </w:p>
-        </w:tc>
-        <w:tc>
-          <w:tcPr>
-            <w:tcW w:w="2160" w:type="dxa"/>
-          </w:tcPr>
-          <w:p>
-            <w:pPr>
-              <w:tabs>
-                <w:tab w:val="center" w:pos="4513"/>
-                <w:tab w:val="left" w:pos="5844"/>
-              </w:tabs>
-              <w:rPr>
-                <w:sz w:val="20"/>
-                <w:szCs w:val="20"/>
-                <w:lang w:val="en-US"/>
-              </w:rPr>
-            </w:pPr>
+            <w:tcW w:w="821" w:type="dxa"/>
+          </w:tcPr>
+          <w:p>
+            <w:pPr>
+              <w:tabs>
+                <w:tab w:val="center" w:pos="4513"/>
+                <w:tab w:val="left" w:pos="5844"/>
+              </w:tabs>
+              <w:rPr>
+                <w:sz w:val="20"/>
+                <w:szCs w:val="20"/>
+                <w:lang w:val="en-US"/>
+              </w:rPr>
+            </w:pPr>
+            <w:r>
+              <w:rPr>
+                <w:sz w:val="20"/>
+                <w:szCs w:val="20"/>
+                <w:lang w:val="en-US"/>
+              </w:rPr>
+              <w:t>13:00</w:t>
+            </w:r>
+          </w:p>
+        </w:tc>
+        <w:tc>
+          <w:tcPr>
+            <w:tcW w:w="810" w:type="dxa"/>
+          </w:tcPr>
+          <w:p>
+            <w:pPr>
+              <w:tabs>
+                <w:tab w:val="center" w:pos="4513"/>
+                <w:tab w:val="left" w:pos="5844"/>
+              </w:tabs>
+              <w:rPr>
+                <w:sz w:val="20"/>
+                <w:szCs w:val="20"/>
+                <w:lang w:val="en-US"/>
+              </w:rPr>
+            </w:pPr>
+            <w:r>
+              <w:rPr>
+                <w:sz w:val="20"/>
+                <w:szCs w:val="20"/>
+                <w:lang w:val="en-US"/>
+              </w:rPr>
+              <w:t>2</w:t>
+            </w:r>
+          </w:p>
+        </w:tc>
+        <w:tc>
+          <w:tcPr>
+            <w:tcW w:w="1399" w:type="dxa"/>
+          </w:tcPr>
+          <w:p>
+            <w:pPr>
+              <w:tabs>
+                <w:tab w:val="center" w:pos="4513"/>
+                <w:tab w:val="left" w:pos="5844"/>
+              </w:tabs>
+              <w:rPr>
+                <w:sz w:val="20"/>
+                <w:szCs w:val="20"/>
+                <w:lang w:val="en-US"/>
+              </w:rPr>
+            </w:pPr>
+            <w:r>
+              <w:rPr>
+                <w:sz w:val="20"/>
+                <w:szCs w:val="20"/>
+                <w:lang w:val="en-US"/>
+              </w:rPr>
+              <w:t>Feedback</w:t>
+            </w:r>
+          </w:p>
+        </w:tc>
+        <w:tc>
+          <w:tcPr>
+            <w:tcW w:w="4625" w:type="dxa"/>
+          </w:tcPr>
+          <w:p>
+            <w:pPr>
+              <w:tabs>
+                <w:tab w:val="center" w:pos="4513"/>
+                <w:tab w:val="left" w:pos="5844"/>
+              </w:tabs>
+              <w:rPr>
+                <w:sz w:val="20"/>
+                <w:szCs w:val="20"/>
+                <w:lang w:val="en-US"/>
+              </w:rPr>
+            </w:pPr>
+            <w:r>
+              <w:rPr>
+                <w:sz w:val="20"/>
+                <w:szCs w:val="20"/>
+                <w:lang w:val="en-US"/>
+              </w:rPr>
+              <w:t>Gesture recognition:</w:t>
+            </w:r>
+          </w:p>
+          <w:p>
+            <w:pPr>
+              <w:pStyle w:val="ListParagraph"/>
+              <w:numPr>
+                <w:ilvl w:val="0"/>
+                <w:numId w:val="1"/>
+              </w:numPr>
+              <w:tabs>
+                <w:tab w:val="center" w:pos="4513"/>
+                <w:tab w:val="left" w:pos="5844"/>
+              </w:tabs>
+              <w:rPr>
+                <w:sz w:val="20"/>
+                <w:szCs w:val="20"/>
+                <w:lang w:val="en-US"/>
+              </w:rPr>
+            </w:pPr>
+            <w:r>
+              <w:rPr>
+                <w:sz w:val="20"/>
+                <w:szCs w:val="20"/>
+                <w:lang w:val="en-US"/>
+              </w:rPr>
+              <w:t xml:space="preserve">Camera to recognize the gestures and translate into the three </w:t>
+            </w:r>
+            <w:proofErr w:type="spellStart"/>
+            <w:r>
+              <w:rPr>
+                <w:sz w:val="20"/>
+                <w:szCs w:val="20"/>
+                <w:lang w:val="en-US"/>
+              </w:rPr>
+              <w:t>vx</w:t>
+            </w:r>
+            <w:proofErr w:type="spellEnd"/>
+            <w:r>
+              <w:rPr>
+                <w:sz w:val="20"/>
+                <w:szCs w:val="20"/>
+                <w:lang w:val="en-US"/>
+              </w:rPr>
+              <w:t xml:space="preserve">, </w:t>
+            </w:r>
+            <w:proofErr w:type="spellStart"/>
+            <w:r>
+              <w:rPr>
+                <w:sz w:val="20"/>
+                <w:szCs w:val="20"/>
+                <w:lang w:val="en-US"/>
+              </w:rPr>
+              <w:t>vy</w:t>
+            </w:r>
+            <w:proofErr w:type="spellEnd"/>
+            <w:r>
+              <w:rPr>
+                <w:sz w:val="20"/>
+                <w:szCs w:val="20"/>
+                <w:lang w:val="en-US"/>
+              </w:rPr>
+              <w:t xml:space="preserve">, </w:t>
+            </w:r>
+            <w:proofErr w:type="spellStart"/>
+            <w:r>
+              <w:rPr>
+                <w:sz w:val="20"/>
+                <w:szCs w:val="20"/>
+                <w:lang w:val="en-US"/>
+              </w:rPr>
+              <w:t>vr</w:t>
+            </w:r>
+            <w:proofErr w:type="spellEnd"/>
+            <w:r>
+              <w:rPr>
+                <w:sz w:val="20"/>
+                <w:szCs w:val="20"/>
+                <w:lang w:val="en-US"/>
+              </w:rPr>
+              <w:t>. (x, y, rotation)</w:t>
+            </w:r>
+          </w:p>
+          <w:p>
+            <w:pPr>
+              <w:pStyle w:val="ListParagraph"/>
+              <w:numPr>
+                <w:ilvl w:val="0"/>
+                <w:numId w:val="1"/>
+              </w:numPr>
+              <w:tabs>
+                <w:tab w:val="center" w:pos="4513"/>
+                <w:tab w:val="left" w:pos="5844"/>
+              </w:tabs>
+              <w:rPr>
+                <w:sz w:val="20"/>
+                <w:szCs w:val="20"/>
+                <w:lang w:val="en-US"/>
+              </w:rPr>
+            </w:pPr>
+            <w:r>
+              <w:rPr>
+                <w:sz w:val="20"/>
+                <w:szCs w:val="20"/>
+                <w:lang w:val="en-US"/>
+              </w:rPr>
+              <w:t xml:space="preserve">Instead of </w:t>
+            </w:r>
+            <w:proofErr w:type="gramStart"/>
+            <w:r>
+              <w:rPr>
+                <w:sz w:val="20"/>
+                <w:szCs w:val="20"/>
+                <w:lang w:val="en-US"/>
+              </w:rPr>
+              <w:t>joystick</w:t>
+            </w:r>
+            <w:proofErr w:type="gramEnd"/>
+            <w:r>
+              <w:rPr>
+                <w:sz w:val="20"/>
+                <w:szCs w:val="20"/>
+                <w:lang w:val="en-US"/>
+              </w:rPr>
+              <w:t xml:space="preserve">, hands </w:t>
+            </w:r>
+            <w:proofErr w:type="gramStart"/>
+            <w:r>
+              <w:rPr>
+                <w:sz w:val="20"/>
+                <w:szCs w:val="20"/>
+                <w:lang w:val="en-US"/>
+              </w:rPr>
+              <w:t>used</w:t>
+            </w:r>
+            <w:proofErr w:type="gramEnd"/>
+            <w:r>
+              <w:rPr>
+                <w:sz w:val="20"/>
+                <w:szCs w:val="20"/>
+                <w:lang w:val="en-US"/>
+              </w:rPr>
+              <w:t xml:space="preserve"> to control </w:t>
+            </w:r>
+            <w:proofErr w:type="gramStart"/>
+            <w:r>
+              <w:rPr>
+                <w:sz w:val="20"/>
+                <w:szCs w:val="20"/>
+                <w:lang w:val="en-US"/>
+              </w:rPr>
+              <w:t>robot</w:t>
+            </w:r>
+            <w:proofErr w:type="gramEnd"/>
+          </w:p>
+          <w:p>
+            <w:pPr>
+              <w:pStyle w:val="ListParagraph"/>
+              <w:numPr>
+                <w:ilvl w:val="0"/>
+                <w:numId w:val="1"/>
+              </w:numPr>
+              <w:tabs>
+                <w:tab w:val="center" w:pos="4513"/>
+                <w:tab w:val="left" w:pos="5844"/>
+              </w:tabs>
+              <w:rPr>
+                <w:sz w:val="20"/>
+                <w:szCs w:val="20"/>
+                <w:lang w:val="en-US"/>
+              </w:rPr>
+            </w:pPr>
+            <w:r>
+              <w:rPr>
+                <w:sz w:val="20"/>
+                <w:szCs w:val="20"/>
+                <w:lang w:val="en-US"/>
+              </w:rPr>
+              <w:t>Use AI to research how to control the simulation from the group (no elastic band) and to control the directions of movement of the simulation with hands</w:t>
+            </w:r>
+          </w:p>
+          <w:p>
+            <w:pPr>
+              <w:tabs>
+                <w:tab w:val="center" w:pos="4513"/>
+                <w:tab w:val="left" w:pos="5844"/>
+              </w:tabs>
+              <w:rPr>
+                <w:sz w:val="20"/>
+                <w:szCs w:val="20"/>
+                <w:lang w:val="en-US"/>
+              </w:rPr>
+            </w:pPr>
+          </w:p>
+          <w:p>
+            <w:pPr>
+              <w:tabs>
+                <w:tab w:val="center" w:pos="4513"/>
+                <w:tab w:val="left" w:pos="5844"/>
+              </w:tabs>
+              <w:rPr>
+                <w:sz w:val="20"/>
+                <w:szCs w:val="20"/>
+                <w:lang w:val="en-US"/>
+              </w:rPr>
+            </w:pPr>
+            <w:r>
+              <w:rPr>
+                <w:sz w:val="20"/>
+                <w:szCs w:val="20"/>
+                <w:lang w:val="en-US"/>
+              </w:rPr>
+              <w:t>Person identification:</w:t>
+            </w:r>
+          </w:p>
+          <w:p>
+            <w:pPr>
+              <w:pStyle w:val="ListParagraph"/>
+              <w:numPr>
+                <w:ilvl w:val="0"/>
+                <w:numId w:val="1"/>
+              </w:numPr>
+              <w:tabs>
+                <w:tab w:val="center" w:pos="4513"/>
+                <w:tab w:val="left" w:pos="5844"/>
+              </w:tabs>
+              <w:rPr>
+                <w:sz w:val="20"/>
+                <w:szCs w:val="20"/>
+                <w:lang w:val="en-US"/>
+              </w:rPr>
+            </w:pPr>
+            <w:proofErr w:type="gramStart"/>
+            <w:r>
+              <w:rPr>
+                <w:sz w:val="20"/>
+                <w:szCs w:val="20"/>
+                <w:lang w:val="en-US"/>
+              </w:rPr>
+              <w:t>Have to</w:t>
+            </w:r>
+            <w:proofErr w:type="gramEnd"/>
+            <w:r>
+              <w:rPr>
+                <w:sz w:val="20"/>
+                <w:szCs w:val="20"/>
+                <w:lang w:val="en-US"/>
+              </w:rPr>
+              <w:t xml:space="preserve"> retarget to the real robot / simulation, and have the robot to mimic the movement (</w:t>
+            </w:r>
+            <w:proofErr w:type="gramStart"/>
+            <w:r>
+              <w:rPr>
+                <w:sz w:val="20"/>
+                <w:szCs w:val="20"/>
+                <w:lang w:val="en-US"/>
+              </w:rPr>
+              <w:t>look into</w:t>
+            </w:r>
+            <w:proofErr w:type="gramEnd"/>
+            <w:r>
+              <w:rPr>
+                <w:sz w:val="20"/>
+                <w:szCs w:val="20"/>
+                <w:lang w:val="en-US"/>
+              </w:rPr>
+              <w:t xml:space="preserve"> Pinocchio)</w:t>
+            </w:r>
+          </w:p>
+          <w:p>
+            <w:pPr>
+              <w:pStyle w:val="ListParagraph"/>
+              <w:numPr>
+                <w:ilvl w:val="0"/>
+                <w:numId w:val="1"/>
+              </w:numPr>
+              <w:tabs>
+                <w:tab w:val="center" w:pos="4513"/>
+                <w:tab w:val="left" w:pos="5844"/>
+              </w:tabs>
+              <w:rPr>
+                <w:sz w:val="20"/>
+                <w:szCs w:val="20"/>
+                <w:lang w:val="en-US"/>
+              </w:rPr>
+            </w:pPr>
+            <w:r>
+              <w:rPr>
+                <w:sz w:val="20"/>
+                <w:szCs w:val="20"/>
+                <w:lang w:val="en-US"/>
+              </w:rPr>
+              <w:t>Up to us how we want the robot to recognize the leader (possibilities: click on, hand gesture, …)</w:t>
+            </w:r>
+          </w:p>
+          <w:p>
+            <w:pPr>
+              <w:tabs>
+                <w:tab w:val="center" w:pos="4513"/>
+                <w:tab w:val="left" w:pos="5844"/>
+              </w:tabs>
+              <w:rPr>
+                <w:sz w:val="20"/>
+                <w:szCs w:val="20"/>
+                <w:lang w:val="en-US"/>
+              </w:rPr>
+            </w:pPr>
+          </w:p>
+          <w:p>
+            <w:pPr>
+              <w:tabs>
+                <w:tab w:val="center" w:pos="4513"/>
+                <w:tab w:val="left" w:pos="5844"/>
+              </w:tabs>
+              <w:rPr>
+                <w:sz w:val="20"/>
+                <w:szCs w:val="20"/>
+                <w:lang w:val="en-US"/>
+              </w:rPr>
+            </w:pPr>
+            <w:r>
+              <w:rPr>
+                <w:sz w:val="20"/>
+                <w:szCs w:val="20"/>
+                <w:lang w:val="en-US"/>
+              </w:rPr>
+              <w:t>Need a switch to change between the two projects</w:t>
+            </w:r>
+          </w:p>
+          <w:p>
+            <w:pPr>
+              <w:pStyle w:val="ListParagraph"/>
+              <w:numPr>
+                <w:ilvl w:val="0"/>
+                <w:numId w:val="1"/>
+              </w:numPr>
+              <w:tabs>
+                <w:tab w:val="center" w:pos="4513"/>
+                <w:tab w:val="left" w:pos="5844"/>
+              </w:tabs>
+              <w:rPr>
+                <w:sz w:val="20"/>
+                <w:szCs w:val="20"/>
+                <w:lang w:val="en-US"/>
+              </w:rPr>
+            </w:pPr>
+            <w:r>
+              <w:rPr>
+                <w:sz w:val="20"/>
+                <w:szCs w:val="20"/>
+                <w:lang w:val="en-US"/>
+              </w:rPr>
+              <w:t>Can be whatever we want</w:t>
+            </w:r>
+          </w:p>
+          <w:p>
+            <w:pPr>
+              <w:pStyle w:val="ListParagraph"/>
+              <w:numPr>
+                <w:ilvl w:val="0"/>
+                <w:numId w:val="1"/>
+              </w:numPr>
+              <w:tabs>
+                <w:tab w:val="center" w:pos="4513"/>
+                <w:tab w:val="left" w:pos="5844"/>
+              </w:tabs>
+              <w:rPr>
+                <w:sz w:val="20"/>
+                <w:szCs w:val="20"/>
+                <w:lang w:val="en-US"/>
+              </w:rPr>
+            </w:pPr>
+            <w:r>
+              <w:rPr>
+                <w:sz w:val="20"/>
+                <w:szCs w:val="20"/>
+                <w:lang w:val="en-US"/>
+              </w:rPr>
+              <w:t>Best demo is to the real robot</w:t>
+            </w:r>
+          </w:p>
+          <w:p>
+            <w:pPr>
+              <w:pStyle w:val="ListParagraph"/>
+              <w:numPr>
+                <w:ilvl w:val="0"/>
+                <w:numId w:val="1"/>
+              </w:numPr>
+              <w:tabs>
+                <w:tab w:val="center" w:pos="4513"/>
+                <w:tab w:val="left" w:pos="5844"/>
+              </w:tabs>
+              <w:rPr>
+                <w:sz w:val="20"/>
+                <w:szCs w:val="20"/>
+                <w:lang w:val="en-US"/>
+              </w:rPr>
+            </w:pPr>
+            <w:r>
+              <w:rPr>
+                <w:sz w:val="20"/>
+                <w:szCs w:val="20"/>
+                <w:lang w:val="en-US"/>
+              </w:rPr>
+              <w:t>Minimum is on the simulation robot. It is hard to get consistent access to the robot.</w:t>
+            </w:r>
           </w:p>
         </w:tc>
         <w:tc>
@@ -527,80 +1042,138 @@
                 <w:lang w:val="en-US"/>
               </w:rPr>
             </w:pPr>
-          </w:p>
-        </w:tc>
-        <w:tc>
-          <w:tcPr>
-            <w:tcW w:w="3686" w:type="dxa"/>
-          </w:tcPr>
-          <w:p>
-            <w:pPr>
-              <w:tabs>
-                <w:tab w:val="center" w:pos="4513"/>
-                <w:tab w:val="left" w:pos="5844"/>
-              </w:tabs>
-              <w:rPr>
-                <w:sz w:val="20"/>
-                <w:szCs w:val="20"/>
-                <w:lang w:val="en-US"/>
-              </w:rPr>
-            </w:pPr>
+            <w:r>
+              <w:rPr>
+                <w:sz w:val="20"/>
+                <w:szCs w:val="20"/>
+                <w:lang w:val="en-US"/>
+              </w:rPr>
+              <w:t xml:space="preserve">Client on leave Weeks </w:t>
+            </w:r>
+            <w:proofErr w:type="gramStart"/>
+            <w:r>
+              <w:rPr>
+                <w:sz w:val="20"/>
+                <w:szCs w:val="20"/>
+                <w:lang w:val="en-US"/>
+              </w:rPr>
+              <w:t>10,</w:t>
+            </w:r>
+            <w:proofErr w:type="gramEnd"/>
+            <w:r>
+              <w:rPr>
+                <w:sz w:val="20"/>
+                <w:szCs w:val="20"/>
+                <w:lang w:val="en-US"/>
+              </w:rPr>
+              <w:t xml:space="preserve"> and 11, so optimally finish by Week 9.</w:t>
+            </w:r>
           </w:p>
         </w:tc>
       </w:tr>
       <w:tr>
         <w:tc>
           <w:tcPr>
-            <w:tcW w:w="822" w:type="dxa"/>
-          </w:tcPr>
-          <w:p>
-            <w:pPr>
-              <w:tabs>
-                <w:tab w:val="center" w:pos="4513"/>
-                <w:tab w:val="left" w:pos="5844"/>
-              </w:tabs>
-              <w:rPr>
-                <w:sz w:val="20"/>
-                <w:szCs w:val="20"/>
-                <w:lang w:val="en-US"/>
-              </w:rPr>
-            </w:pPr>
-          </w:p>
-        </w:tc>
-        <w:tc>
-          <w:tcPr>
-            <w:tcW w:w="987" w:type="dxa"/>
-          </w:tcPr>
-          <w:p>
-            <w:pPr>
-              <w:tabs>
-                <w:tab w:val="center" w:pos="4513"/>
-                <w:tab w:val="left" w:pos="5844"/>
-              </w:tabs>
-              <w:rPr>
-                <w:sz w:val="20"/>
-                <w:szCs w:val="20"/>
-                <w:lang w:val="en-US"/>
-              </w:rPr>
-            </w:pPr>
-          </w:p>
-        </w:tc>
-        <w:tc>
-          <w:tcPr>
-            <w:tcW w:w="2160" w:type="dxa"/>
-          </w:tcPr>
-          <w:p>
-            <w:pPr>
-              <w:tabs>
-                <w:tab w:val="center" w:pos="4513"/>
-                <w:tab w:val="left" w:pos="5844"/>
-              </w:tabs>
-              <w:rPr>
-                <w:sz w:val="20"/>
-                <w:szCs w:val="20"/>
-                <w:lang w:val="en-US"/>
-              </w:rPr>
-            </w:pPr>
+            <w:tcW w:w="821" w:type="dxa"/>
+          </w:tcPr>
+          <w:p>
+            <w:pPr>
+              <w:tabs>
+                <w:tab w:val="center" w:pos="4513"/>
+                <w:tab w:val="left" w:pos="5844"/>
+              </w:tabs>
+              <w:rPr>
+                <w:sz w:val="20"/>
+                <w:szCs w:val="20"/>
+                <w:lang w:val="en-US"/>
+              </w:rPr>
+            </w:pPr>
+            <w:r>
+              <w:rPr>
+                <w:sz w:val="20"/>
+                <w:szCs w:val="20"/>
+                <w:lang w:val="en-US"/>
+              </w:rPr>
+              <w:t>13:25</w:t>
+            </w:r>
+          </w:p>
+        </w:tc>
+        <w:tc>
+          <w:tcPr>
+            <w:tcW w:w="810" w:type="dxa"/>
+          </w:tcPr>
+          <w:p>
+            <w:pPr>
+              <w:tabs>
+                <w:tab w:val="center" w:pos="4513"/>
+                <w:tab w:val="left" w:pos="5844"/>
+              </w:tabs>
+              <w:rPr>
+                <w:sz w:val="20"/>
+                <w:szCs w:val="20"/>
+                <w:lang w:val="en-US"/>
+              </w:rPr>
+            </w:pPr>
+            <w:r>
+              <w:rPr>
+                <w:sz w:val="20"/>
+                <w:szCs w:val="20"/>
+                <w:lang w:val="en-US"/>
+              </w:rPr>
+              <w:t>5</w:t>
+            </w:r>
+          </w:p>
+        </w:tc>
+        <w:tc>
+          <w:tcPr>
+            <w:tcW w:w="1399" w:type="dxa"/>
+          </w:tcPr>
+          <w:p>
+            <w:pPr>
+              <w:tabs>
+                <w:tab w:val="center" w:pos="4513"/>
+                <w:tab w:val="left" w:pos="5844"/>
+              </w:tabs>
+              <w:rPr>
+                <w:sz w:val="20"/>
+                <w:szCs w:val="20"/>
+                <w:lang w:val="en-US"/>
+              </w:rPr>
+            </w:pPr>
+            <w:r>
+              <w:rPr>
+                <w:sz w:val="20"/>
+                <w:szCs w:val="20"/>
+                <w:lang w:val="en-US"/>
+              </w:rPr>
+              <w:t>Next meeting</w:t>
+            </w:r>
+          </w:p>
+        </w:tc>
+        <w:tc>
+          <w:tcPr>
+            <w:tcW w:w="4625" w:type="dxa"/>
+          </w:tcPr>
+          <w:p>
+            <w:pPr>
+              <w:tabs>
+                <w:tab w:val="center" w:pos="4513"/>
+                <w:tab w:val="left" w:pos="5844"/>
+              </w:tabs>
+              <w:rPr>
+                <w:sz w:val="20"/>
+                <w:szCs w:val="20"/>
+                <w:lang w:val="en-US"/>
+              </w:rPr>
+            </w:pPr>
+            <w:r>
+              <w:rPr>
+                <w:sz w:val="20"/>
+                <w:szCs w:val="20"/>
+                <w:lang w:val="en-US"/>
+              </w:rPr>
+              <w:t>Week 9, Wednesday, last meeting before week 12.</w:t>
+            </w:r>
           </w:p>
         </w:tc>
         <w:tc>
@@ -619,11 +1192,117 @@
                 <w:lang w:val="en-US"/>
               </w:rPr>
             </w:pPr>
-          </w:p>
-        </w:tc>
-        <w:tc>
-          <w:tcPr>
-            <w:tcW w:w="3686" w:type="dxa"/>
+            <w:r>
+              <w:rPr>
+                <w:sz w:val="20"/>
+                <w:szCs w:val="20"/>
+                <w:lang w:val="en-US"/>
+              </w:rPr>
+              <w:t xml:space="preserve">Video for proof of the project working </w:t>
+            </w:r>
+          </w:p>
+        </w:tc>
+      </w:tr>
+      <w:tr>
+        <w:tc>
+          <w:tcPr>
+            <w:tcW w:w="821" w:type="dxa"/>
+          </w:tcPr>
+          <w:p>
+            <w:pPr>
+              <w:tabs>
+                <w:tab w:val="center" w:pos="4513"/>
+                <w:tab w:val="left" w:pos="5844"/>
+              </w:tabs>
+              <w:rPr>
+                <w:sz w:val="20"/>
+                <w:szCs w:val="20"/>
+                <w:lang w:val="en-US"/>
+              </w:rPr>
+            </w:pPr>
+            <w:r>
+              <w:rPr>
+                <w:sz w:val="20"/>
+                <w:szCs w:val="20"/>
+                <w:lang w:val="en-US"/>
+              </w:rPr>
+              <w:t>14:00</w:t>
+            </w:r>
+          </w:p>
+        </w:tc>
+        <w:tc>
+          <w:tcPr>
+            <w:tcW w:w="810" w:type="dxa"/>
+          </w:tcPr>
+          <w:p>
+            <w:pPr>
+              <w:tabs>
+                <w:tab w:val="center" w:pos="4513"/>
+                <w:tab w:val="left" w:pos="5844"/>
+              </w:tabs>
+              <w:rPr>
+                <w:sz w:val="20"/>
+                <w:szCs w:val="20"/>
+                <w:lang w:val="en-US"/>
+              </w:rPr>
+            </w:pPr>
+            <w:r>
+              <w:rPr>
+                <w:sz w:val="20"/>
+                <w:szCs w:val="20"/>
+                <w:lang w:val="en-US"/>
+              </w:rPr>
+              <w:t>6</w:t>
+            </w:r>
+          </w:p>
+        </w:tc>
+        <w:tc>
+          <w:tcPr>
+            <w:tcW w:w="1399" w:type="dxa"/>
+          </w:tcPr>
+          <w:p>
+            <w:pPr>
+              <w:tabs>
+                <w:tab w:val="center" w:pos="4513"/>
+                <w:tab w:val="left" w:pos="5844"/>
+              </w:tabs>
+              <w:rPr>
+                <w:sz w:val="20"/>
+                <w:szCs w:val="20"/>
+                <w:lang w:val="en-US"/>
+              </w:rPr>
+            </w:pPr>
+            <w:r>
+              <w:rPr>
+                <w:sz w:val="20"/>
+                <w:szCs w:val="20"/>
+                <w:lang w:val="en-US"/>
+              </w:rPr>
+              <w:t>Meeting end</w:t>
+            </w:r>
+          </w:p>
+        </w:tc>
+        <w:tc>
+          <w:tcPr>
+            <w:tcW w:w="4625" w:type="dxa"/>
+          </w:tcPr>
+          <w:p>
+            <w:pPr>
+              <w:tabs>
+                <w:tab w:val="center" w:pos="4513"/>
+                <w:tab w:val="left" w:pos="5844"/>
+              </w:tabs>
+              <w:rPr>
+                <w:sz w:val="20"/>
+                <w:szCs w:val="20"/>
+                <w:lang w:val="en-US"/>
+              </w:rPr>
+            </w:pPr>
+          </w:p>
+        </w:tc>
+        <w:tc>
+          <w:tcPr>
+            <w:tcW w:w="3969" w:type="dxa"/>
           </w:tcPr>
           <w:p>
             <w:pPr>
@@ -641,19 +1320,6 @@
         </w:tc>
       </w:tr>
     </w:tbl>
-    <w:p>
-      <w:pPr>
-        <w:tabs>
-          <w:tab w:val="center" w:pos="4513"/>
-          <w:tab w:val="left" w:pos="5844"/>
-        </w:tabs>
-        <w:rPr>
-          <w:sz w:val="32"/>
-          <w:szCs w:val="32"/>
-          <w:lang w:val="en-US"/>
-        </w:rPr>
-      </w:pPr>
-    </w:p>
     <w:p>
       <w:pPr>
         <w:tabs>
@@ -1289,6 +1955,43 @@
                 <w:lang w:val="en-US"/>
               </w:rPr>
             </w:pPr>
+            <w:r>
+              <w:rPr>
+                <w:b/>
+                <w:bCs/>
+                <w:lang w:val="en-US"/>
+              </w:rPr>
+              <w:t>COMPLETED/MODIFIED</w:t>
+            </w:r>
+          </w:p>
+          <w:p>
+            <w:pPr>
+              <w:tabs>
+                <w:tab w:val="center" w:pos="4513"/>
+                <w:tab w:val="left" w:pos="5844"/>
+              </w:tabs>
+              <w:rPr>
+                <w:lang w:val="en-US"/>
+              </w:rPr>
+            </w:pPr>
+            <w:r>
+              <w:rPr>
+                <w:lang w:val="en-US"/>
+              </w:rPr>
+              <w:t xml:space="preserve">The system detects different people’s </w:t>
+            </w:r>
+            <w:r>
+              <w:rPr>
+                <w:lang w:val="en-US"/>
+              </w:rPr>
+              <w:t>postures The system has been designed to lock onto a single person. That person</w:t>
+            </w:r>
+            <w:r>
+              <w:rPr>
+                <w:lang w:val="en-US"/>
+              </w:rPr>
+              <w:t>’s postures and gestures will be noted.</w:t>
+            </w:r>
           </w:p>
         </w:tc>
       </w:tr>
@@ -1530,15 +2233,7 @@
               </w:rPr>
             </w:pPr>
             <w:r>
-              <w:t xml:space="preserve">Implemented using </w:t>
-            </w:r>
-            <w:proofErr w:type="spellStart"/>
-            <w:r>
-              <w:t>MediaPipe's</w:t>
-            </w:r>
-            <w:proofErr w:type="spellEnd"/>
-            <w:r>
-              <w:t xml:space="preserve"> hand landmark model. Gestures are recorded by taking 20 samples of each gesture from a live camera feed. The landmark model assigns 21 points to the hand and records the 3D location of each point; these are flattened into a single 63-item array and stored.</w:t>
+              <w:t>Implemented using MediaPipe's hand landmark model. Gestures are recorded by taking 20 samples of each gesture from a live camera feed. The landmark model assigns 21 points to the hand and records the 3D location of each point; these are flattened into a single 63-item array and stored.</w:t>
             </w:r>
           </w:p>
         </w:tc>
@@ -1654,6 +2349,7 @@
               <w:rPr>
                 <w:lang w:val="en-US"/>
               </w:rPr>
+              <w:lastRenderedPageBreak/>
               <w:t>2.3</w:t>
             </w:r>
           </w:p>
@@ -1673,11 +2369,7 @@
               </w:rPr>
             </w:pPr>
             <w:r>
-              <w:t xml:space="preserve">As a developer, I want recognised gestures to be displayed with their frame number so </w:t>
-            </w:r>
-            <w:r>
-              <w:lastRenderedPageBreak/>
-              <w:t>that I can check whether gestures are being recognised correctly.</w:t>
+              <w:t>As a developer, I want recognised gestures to be displayed with their frame number so that I can check whether gestures are being recognised correctly.</w:t>
             </w:r>
           </w:p>
         </w:tc>
@@ -1701,7 +2393,6 @@
                 <w:bCs/>
                 <w:lang w:val="en-US"/>
               </w:rPr>
-              <w:lastRenderedPageBreak/>
               <w:t>COMPLETED</w:t>
             </w:r>
           </w:p>
@@ -1727,7 +2418,6 @@
               </w:rPr>
             </w:pPr>
             <w:r>
-              <w:lastRenderedPageBreak/>
               <w:t>Output goes to the terminal. On every gesture change, the program prints the recognised gesture, the calculated best distance (used to determine whether it falls under the threshold), and the number of milliseconds elapsed since the program started.</w:t>
             </w:r>
           </w:p>
@@ -1752,7 +2442,6 @@
               <w:rPr>
                 <w:lang w:val="en-US"/>
               </w:rPr>
-              <w:lastRenderedPageBreak/>
               <w:t>2.4</w:t>
             </w:r>
           </w:p>
@@ -1953,6 +2642,67 @@
                 <w:lang w:val="en-US"/>
               </w:rPr>
             </w:pPr>
+            <w:r>
+              <w:rPr>
+                <w:b/>
+                <w:bCs/>
+                <w:lang w:val="en-US"/>
+              </w:rPr>
+              <w:t>IN PROGRESS</w:t>
+            </w:r>
+          </w:p>
+          <w:p>
+            <w:pPr>
+              <w:tabs>
+                <w:tab w:val="center" w:pos="4513"/>
+                <w:tab w:val="left" w:pos="5844"/>
+              </w:tabs>
+              <w:rPr>
+                <w:lang w:val="en-US"/>
+              </w:rPr>
+            </w:pPr>
+            <w:r>
+              <w:rPr>
+                <w:lang w:val="en-US"/>
+              </w:rPr>
+              <w:t>People’s</w:t>
+            </w:r>
+            <w:r>
+              <w:rPr>
+                <w:lang w:val="en-US"/>
+              </w:rPr>
+              <w:t xml:space="preserve"> posture</w:t>
+            </w:r>
+            <w:r>
+              <w:rPr>
+                <w:lang w:val="en-US"/>
+              </w:rPr>
+              <w:t xml:space="preserve"> information</w:t>
+            </w:r>
+            <w:r>
+              <w:rPr>
+                <w:lang w:val="en-US"/>
+              </w:rPr>
+              <w:t xml:space="preserve"> gets </w:t>
+            </w:r>
+            <w:r>
+              <w:rPr>
+                <w:lang w:val="en-US"/>
+              </w:rPr>
+              <w:t>output</w:t>
+            </w:r>
+            <w:r>
+              <w:rPr>
+                <w:lang w:val="en-US"/>
+              </w:rPr>
+              <w:t>/registered</w:t>
+            </w:r>
+            <w:r>
+              <w:rPr>
+                <w:lang w:val="en-US"/>
+              </w:rPr>
+              <w:t>.</w:t>
+            </w:r>
           </w:p>
         </w:tc>
       </w:tr>
@@ -2012,6 +2762,54 @@
                 <w:lang w:val="en-US"/>
               </w:rPr>
             </w:pPr>
+            <w:r>
+              <w:rPr>
+                <w:b/>
+                <w:bCs/>
+                <w:lang w:val="en-US"/>
+              </w:rPr>
+              <w:t>NOT STARTED</w:t>
+            </w:r>
+          </w:p>
+          <w:p>
+            <w:pPr>
+              <w:tabs>
+                <w:tab w:val="center" w:pos="4513"/>
+                <w:tab w:val="left" w:pos="5844"/>
+              </w:tabs>
+              <w:rPr>
+                <w:lang w:val="en-US"/>
+              </w:rPr>
+            </w:pPr>
+            <w:r>
+              <w:rPr>
+                <w:lang w:val="en-US"/>
+              </w:rPr>
+              <w:t xml:space="preserve">Next </w:t>
+            </w:r>
+            <w:r>
+              <w:rPr>
+                <w:lang w:val="en-US"/>
+              </w:rPr>
+              <w:t>task</w:t>
+            </w:r>
+            <w:r>
+              <w:rPr>
+                <w:lang w:val="en-US"/>
+              </w:rPr>
+              <w:t>. Posture needs to be mapped onto the robot.</w:t>
+            </w:r>
+          </w:p>
+          <w:p>
+            <w:pPr>
+              <w:tabs>
+                <w:tab w:val="center" w:pos="4513"/>
+                <w:tab w:val="left" w:pos="5844"/>
+              </w:tabs>
+              <w:rPr>
+                <w:lang w:val="en-US"/>
+              </w:rPr>
+            </w:pPr>
           </w:p>
         </w:tc>
       </w:tr>
@@ -2071,6 +2869,42 @@
                 <w:lang w:val="en-US"/>
               </w:rPr>
             </w:pPr>
+            <w:r>
+              <w:rPr>
+                <w:b/>
+                <w:bCs/>
+                <w:lang w:val="en-US"/>
+              </w:rPr>
+              <w:t>IN PROGRESS</w:t>
+            </w:r>
+          </w:p>
+          <w:p>
+            <w:pPr>
+              <w:tabs>
+                <w:tab w:val="center" w:pos="4513"/>
+                <w:tab w:val="left" w:pos="5844"/>
+              </w:tabs>
+              <w:rPr>
+                <w:lang w:val="en-US"/>
+              </w:rPr>
+            </w:pPr>
+            <w:r>
+              <w:rPr>
+                <w:lang w:val="en-US"/>
+              </w:rPr>
+              <w:t>Next task. Posture needs to be mapped onto the robot.</w:t>
+            </w:r>
+          </w:p>
+          <w:p>
+            <w:pPr>
+              <w:tabs>
+                <w:tab w:val="center" w:pos="4513"/>
+                <w:tab w:val="left" w:pos="5844"/>
+              </w:tabs>
+              <w:rPr>
+                <w:lang w:val="en-US"/>
+              </w:rPr>
+            </w:pPr>
           </w:p>
         </w:tc>
       </w:tr>
@@ -2195,6 +3029,43 @@
                 <w:lang w:val="en-US"/>
               </w:rPr>
             </w:pPr>
+            <w:r>
+              <w:rPr>
+                <w:b/>
+                <w:bCs/>
+                <w:lang w:val="en-US"/>
+              </w:rPr>
+              <w:t>NOT STARTED</w:t>
+            </w:r>
+          </w:p>
+          <w:p>
+            <w:pPr>
+              <w:tabs>
+                <w:tab w:val="center" w:pos="4513"/>
+                <w:tab w:val="left" w:pos="5844"/>
+              </w:tabs>
+              <w:rPr>
+                <w:lang w:val="en-US"/>
+              </w:rPr>
+            </w:pPr>
+            <w:r>
+              <w:rPr>
+                <w:lang w:val="en-US"/>
+              </w:rPr>
+              <w:t>Less important, to be implemented later</w:t>
+            </w:r>
+            <w:r>
+              <w:rPr>
+                <w:lang w:val="en-US"/>
+              </w:rPr>
+              <w:t xml:space="preserve"> a</w:t>
+            </w:r>
+            <w:r>
+              <w:rPr>
+                <w:lang w:val="en-US"/>
+              </w:rPr>
+              <w:t>nd/or discarded. This functionality is already covered in other aspects of the project</w:t>
+            </w:r>
           </w:p>
         </w:tc>
       </w:tr>
@@ -2254,306 +3125,55 @@
                 <w:lang w:val="en-US"/>
               </w:rPr>
             </w:pPr>
-          </w:p>
-        </w:tc>
-      </w:tr>
-      <w:tr>
-        <w:tc>
-          <w:tcPr>
-            <w:tcW w:w="562" w:type="dxa"/>
-          </w:tcPr>
-          <w:p>
-            <w:pPr>
-              <w:tabs>
-                <w:tab w:val="center" w:pos="4513"/>
-                <w:tab w:val="left" w:pos="5844"/>
-              </w:tabs>
-              <w:rPr>
-                <w:lang w:val="en-US"/>
-              </w:rPr>
-            </w:pPr>
-          </w:p>
-        </w:tc>
-        <w:tc>
-          <w:tcPr>
-            <w:tcW w:w="4719" w:type="dxa"/>
-          </w:tcPr>
-          <w:p>
-            <w:pPr>
-              <w:tabs>
-                <w:tab w:val="center" w:pos="4513"/>
-                <w:tab w:val="left" w:pos="5844"/>
-              </w:tabs>
-              <w:rPr>
-                <w:lang w:val="en-US"/>
-              </w:rPr>
-            </w:pPr>
-          </w:p>
-        </w:tc>
-        <w:tc>
-          <w:tcPr>
-            <w:tcW w:w="5175" w:type="dxa"/>
-          </w:tcPr>
-          <w:p>
-            <w:pPr>
-              <w:tabs>
-                <w:tab w:val="center" w:pos="4513"/>
-                <w:tab w:val="left" w:pos="5844"/>
-              </w:tabs>
-              <w:rPr>
-                <w:lang w:val="en-US"/>
-              </w:rPr>
-            </w:pPr>
-          </w:p>
-        </w:tc>
-      </w:tr>
-      <w:tr>
-        <w:tc>
-          <w:tcPr>
-            <w:tcW w:w="562" w:type="dxa"/>
-          </w:tcPr>
-          <w:p>
-            <w:pPr>
-              <w:tabs>
-                <w:tab w:val="center" w:pos="4513"/>
-                <w:tab w:val="left" w:pos="5844"/>
-              </w:tabs>
-              <w:rPr>
-                <w:lang w:val="en-US"/>
-              </w:rPr>
-            </w:pPr>
-          </w:p>
-        </w:tc>
-        <w:tc>
-          <w:tcPr>
-            <w:tcW w:w="4719" w:type="dxa"/>
-          </w:tcPr>
-          <w:p>
-            <w:pPr>
-              <w:tabs>
-                <w:tab w:val="center" w:pos="4513"/>
-                <w:tab w:val="left" w:pos="5844"/>
-              </w:tabs>
-              <w:rPr>
-                <w:lang w:val="en-US"/>
-              </w:rPr>
-            </w:pPr>
-          </w:p>
-        </w:tc>
-        <w:tc>
-          <w:tcPr>
-            <w:tcW w:w="5175" w:type="dxa"/>
-          </w:tcPr>
-          <w:p>
-            <w:pPr>
-              <w:tabs>
-                <w:tab w:val="center" w:pos="4513"/>
-                <w:tab w:val="left" w:pos="5844"/>
-              </w:tabs>
-              <w:rPr>
-                <w:lang w:val="en-US"/>
-              </w:rPr>
-            </w:pPr>
-          </w:p>
-        </w:tc>
-      </w:tr>
-      <w:tr>
-        <w:tc>
-          <w:tcPr>
-            <w:tcW w:w="562" w:type="dxa"/>
-          </w:tcPr>
-          <w:p>
-            <w:pPr>
-              <w:tabs>
-                <w:tab w:val="center" w:pos="4513"/>
-                <w:tab w:val="left" w:pos="5844"/>
-              </w:tabs>
-              <w:rPr>
-                <w:lang w:val="en-US"/>
-              </w:rPr>
-            </w:pPr>
-          </w:p>
-        </w:tc>
-        <w:tc>
-          <w:tcPr>
-            <w:tcW w:w="4719" w:type="dxa"/>
-          </w:tcPr>
-          <w:p>
-            <w:pPr>
-              <w:tabs>
-                <w:tab w:val="center" w:pos="4513"/>
-                <w:tab w:val="left" w:pos="5844"/>
-              </w:tabs>
-              <w:rPr>
-                <w:lang w:val="en-US"/>
-              </w:rPr>
-            </w:pPr>
-          </w:p>
-        </w:tc>
-        <w:tc>
-          <w:tcPr>
-            <w:tcW w:w="5175" w:type="dxa"/>
-          </w:tcPr>
-          <w:p>
-            <w:pPr>
-              <w:tabs>
-                <w:tab w:val="center" w:pos="4513"/>
-                <w:tab w:val="left" w:pos="5844"/>
-              </w:tabs>
-              <w:rPr>
-                <w:lang w:val="en-US"/>
-              </w:rPr>
-            </w:pPr>
-          </w:p>
-        </w:tc>
-      </w:tr>
-      <w:tr>
-        <w:tc>
-          <w:tcPr>
-            <w:tcW w:w="562" w:type="dxa"/>
-          </w:tcPr>
-          <w:p>
-            <w:pPr>
-              <w:tabs>
-                <w:tab w:val="center" w:pos="4513"/>
-                <w:tab w:val="left" w:pos="5844"/>
-              </w:tabs>
-              <w:rPr>
-                <w:lang w:val="en-US"/>
-              </w:rPr>
-            </w:pPr>
-          </w:p>
-        </w:tc>
-        <w:tc>
-          <w:tcPr>
-            <w:tcW w:w="4719" w:type="dxa"/>
-          </w:tcPr>
-          <w:p>
-            <w:pPr>
-              <w:tabs>
-                <w:tab w:val="center" w:pos="4513"/>
-                <w:tab w:val="left" w:pos="5844"/>
-              </w:tabs>
-              <w:rPr>
-                <w:lang w:val="en-US"/>
-              </w:rPr>
-            </w:pPr>
-          </w:p>
-        </w:tc>
-        <w:tc>
-          <w:tcPr>
-            <w:tcW w:w="5175" w:type="dxa"/>
-          </w:tcPr>
-          <w:p>
-            <w:pPr>
-              <w:tabs>
-                <w:tab w:val="center" w:pos="4513"/>
-                <w:tab w:val="left" w:pos="5844"/>
-              </w:tabs>
-              <w:rPr>
-                <w:lang w:val="en-US"/>
-              </w:rPr>
-            </w:pPr>
-          </w:p>
-        </w:tc>
-      </w:tr>
-      <w:tr>
-        <w:tc>
-          <w:tcPr>
-            <w:tcW w:w="562" w:type="dxa"/>
-          </w:tcPr>
-          <w:p>
-            <w:pPr>
-              <w:tabs>
-                <w:tab w:val="center" w:pos="4513"/>
-                <w:tab w:val="left" w:pos="5844"/>
-              </w:tabs>
-              <w:rPr>
-                <w:lang w:val="en-US"/>
-              </w:rPr>
-            </w:pPr>
-          </w:p>
-        </w:tc>
-        <w:tc>
-          <w:tcPr>
-            <w:tcW w:w="4719" w:type="dxa"/>
-          </w:tcPr>
-          <w:p>
-            <w:pPr>
-              <w:tabs>
-                <w:tab w:val="center" w:pos="4513"/>
-                <w:tab w:val="left" w:pos="5844"/>
-              </w:tabs>
-              <w:rPr>
-                <w:lang w:val="en-US"/>
-              </w:rPr>
-            </w:pPr>
-          </w:p>
-        </w:tc>
-        <w:tc>
-          <w:tcPr>
-            <w:tcW w:w="5175" w:type="dxa"/>
-          </w:tcPr>
-          <w:p>
-            <w:pPr>
-              <w:tabs>
-                <w:tab w:val="center" w:pos="4513"/>
-                <w:tab w:val="left" w:pos="5844"/>
-              </w:tabs>
-              <w:rPr>
-                <w:lang w:val="en-US"/>
-              </w:rPr>
-            </w:pPr>
-          </w:p>
-        </w:tc>
-      </w:tr>
-      <w:tr>
-        <w:tc>
-          <w:tcPr>
-            <w:tcW w:w="562" w:type="dxa"/>
-          </w:tcPr>
-          <w:p>
-            <w:pPr>
-              <w:tabs>
-                <w:tab w:val="center" w:pos="4513"/>
-                <w:tab w:val="left" w:pos="5844"/>
-              </w:tabs>
-              <w:rPr>
-                <w:lang w:val="en-US"/>
-              </w:rPr>
-            </w:pPr>
-          </w:p>
-        </w:tc>
-        <w:tc>
-          <w:tcPr>
-            <w:tcW w:w="4719" w:type="dxa"/>
-          </w:tcPr>
-          <w:p>
-            <w:pPr>
-              <w:tabs>
-                <w:tab w:val="center" w:pos="4513"/>
-                <w:tab w:val="left" w:pos="5844"/>
-              </w:tabs>
-              <w:rPr>
-                <w:lang w:val="en-US"/>
-              </w:rPr>
-            </w:pPr>
-          </w:p>
-        </w:tc>
-        <w:tc>
-          <w:tcPr>
-            <w:tcW w:w="5175" w:type="dxa"/>
-          </w:tcPr>
-          <w:p>
-            <w:pPr>
-              <w:tabs>
-                <w:tab w:val="center" w:pos="4513"/>
-                <w:tab w:val="left" w:pos="5844"/>
-              </w:tabs>
-              <w:rPr>
-                <w:lang w:val="en-US"/>
-              </w:rPr>
-            </w:pPr>
+            <w:r>
+              <w:rPr>
+                <w:b/>
+                <w:bCs/>
+                <w:lang w:val="en-US"/>
+              </w:rPr>
+              <w:t>NOT STARTED</w:t>
+            </w:r>
+          </w:p>
+          <w:p>
+            <w:pPr>
+              <w:tabs>
+                <w:tab w:val="center" w:pos="4513"/>
+                <w:tab w:val="left" w:pos="5844"/>
+              </w:tabs>
+              <w:rPr>
+                <w:lang w:val="en-US"/>
+              </w:rPr>
+            </w:pPr>
+            <w:r>
+              <w:rPr>
+                <w:lang w:val="en-US"/>
+              </w:rPr>
+              <w:t>Less important, to be implemented later</w:t>
+            </w:r>
+            <w:r>
+              <w:rPr>
+                <w:lang w:val="en-US"/>
+              </w:rPr>
+              <w:t xml:space="preserve"> and/or discarded</w:t>
+            </w:r>
+            <w:r>
+              <w:rPr>
+                <w:lang w:val="en-US"/>
+              </w:rPr>
+              <w:t>. This</w:t>
+            </w:r>
+            <w:r>
+              <w:rPr>
+                <w:lang w:val="en-US"/>
+              </w:rPr>
+              <w:t xml:space="preserve"> functionality is already covered in other aspects</w:t>
+            </w:r>
+            <w:r>
+              <w:rPr>
+                <w:lang w:val="en-US"/>
+              </w:rPr>
+              <w:t xml:space="preserve"> of the project</w:t>
+            </w:r>
           </w:p>
         </w:tc>
       </w:tr>
@@ -2627,6 +3247,127 @@
     </w:sectPr>
   </w:body>
 </w:document>
+</file>
+
+<file path=word/numbering.xml><?xml version="1.0" encoding="utf-8"?>
+<w:numbering xmlns:wpc="http://schemas.microsoft.com/office/word/2010/wordprocessingCanvas" xmlns:cx="http://schemas.microsoft.com/office/drawing/2014/chartex" xmlns:cx1="http://schemas.microsoft.com/office/drawing/2015/9/8/chartex" xmlns:cx2="http://schemas.microsoft.com/office/drawing/2015/10/21/chartex" xmlns:cx3="http://schemas.microsoft.com/office/drawing/2016/5/9/chartex" xmlns:cx4="http://schemas.microsoft.com/office/drawing/2016/5/10/chartex" xmlns:cx5="http://schemas.microsoft.com/office/drawing/2016/5/11/chartex" xmlns:cx6="http://schemas.microsoft.com/office/drawing/2016/5/12/chartex" xmlns:cx7="http://schemas.microsoft.com/office/drawing/2016/5/13/chartex" xmlns:cx8="http://schemas.microsoft.com/office/drawing/2016/5/14/chartex" xmlns:mc="http://schemas.openxmlformats.org/markup-compatibility/2006" xmlns:aink="http://schemas.microsoft.com/office/drawing/2016/ink" xmlns:am3d="http://schemas.microsoft.com/office/drawing/2017/model3d" xmlns:o="urn:schemas-microsoft-com:office:office" xmlns:oel="http://schemas.microsoft.com/office/2019/extlst" xmlns:r="http://schemas.openxmlformats.org/officeDocument/2006/relationships" xmlns:m="http://schemas.openxmlformats.org/officeDocument/2006/math" xmlns:v="urn:schemas-microsoft-com:vml" xmlns:wp14="http://schemas.microsoft.com/office/word/2010/wordprocessingDrawing" xmlns:wp="http://schemas.openxmlformats.org/drawingml/2006/wordprocessingDrawing" xmlns:w10="urn:schemas-microsoft-com:office:word" xmlns:w="http://schemas.openxmlformats.org/wordprocessingml/2006/main" xmlns:w14="http://schemas.microsoft.com/office/word/2010/wordml" xmlns:w15="http://schemas.microsoft.com/office/word/2012/wordml" xmlns:w16cex="http://schemas.microsoft.com/office/word/2018/wordml/cex" xmlns:w16cid="http://schemas.microsoft.com/office/word/2016/wordml/cid" xmlns:w16="http://schemas.microsoft.com/office/word/2018/wordml" xmlns:w16du="http://schemas.microsoft.com/office/word/2023/wordml/word16du" xmlns:w16sdtdh="http://schemas.microsoft.com/office/word/2020/wordml/sdtdatahash" xmlns:w16sdtfl="http://schemas.microsoft.com/office/word/2024/wordml/sdtformatlock" xmlns:w16se="http://schemas.microsoft.com/office/word/2015/wordml/symex" xmlns:wpg="http://schemas.microsoft.com/office/word/2010/wordprocessingGroup" xmlns:wpi="http://schemas.microsoft.com/office/word/2010/wordprocessingInk" xmlns:wne="http://schemas.microsoft.com/office/word/2006/wordml" xmlns:wps="http://schemas.microsoft.com/office/word/2010/wordprocessingShape" mc:Ignorable="w14 w15 w16se w16cid w16 w16cex w16sdtdh w16sdtfl w16du wp14">
+  <w:abstractNum w:abstractNumId="0" w15:restartNumberingAfterBreak="0">
+    <w:nsid w:val="344E45CF"/>
+    <w:multiLevelType w:val="hybridMultilevel"/>
+    <w:tmpl w:val="A594B55E"/>
+    <w:lvl w:ilvl="0" w:tplc="B7FA70CC">
+      <w:start w:val="113"/>
+      <w:numFmt w:val="bullet"/>
+      <w:lvlText w:val="-"/>
+      <w:lvlJc w:val="left"/>
+      <w:pPr>
+        <w:ind w:left="720" w:hanging="360"/>
+      </w:pPr>
+      <w:rPr>
+        <w:rFonts w:ascii="Aptos" w:eastAsiaTheme="minorHAnsi" w:hAnsi="Aptos" w:cstheme="minorBidi" w:hint="default"/>
+      </w:rPr>
+    </w:lvl>
+    <w:lvl w:ilvl="1" w:tplc="0C090003" w:tentative="1">
+      <w:start w:val="1"/>
+      <w:numFmt w:val="bullet"/>
+      <w:lvlText w:val="o"/>
+      <w:lvlJc w:val="left"/>
+      <w:pPr>
+        <w:ind w:left="1440" w:hanging="360"/>
+      </w:pPr>
+      <w:rPr>
+        <w:rFonts w:ascii="Courier New" w:hAnsi="Courier New" w:cs="Courier New" w:hint="default"/>
+      </w:rPr>
+    </w:lvl>
+    <w:lvl w:ilvl="2" w:tplc="0C090005" w:tentative="1">
+      <w:start w:val="1"/>
+      <w:numFmt w:val="bullet"/>
+      <w:lvlText w:val=""/>
+      <w:lvlJc w:val="left"/>
+      <w:pPr>
+        <w:ind w:left="2160" w:hanging="360"/>
+      </w:pPr>
+      <w:rPr>
+        <w:rFonts w:ascii="Wingdings" w:hAnsi="Wingdings" w:hint="default"/>
+      </w:rPr>
+    </w:lvl>
+    <w:lvl w:ilvl="3" w:tplc="0C090001" w:tentative="1">
+      <w:start w:val="1"/>
+      <w:numFmt w:val="bullet"/>
+      <w:lvlText w:val=""/>
+      <w:lvlJc w:val="left"/>
+      <w:pPr>
+        <w:ind w:left="2880" w:hanging="360"/>
+      </w:pPr>
+      <w:rPr>
+        <w:rFonts w:ascii="Symbol" w:hAnsi="Symbol" w:hint="default"/>
+      </w:rPr>
+    </w:lvl>
+    <w:lvl w:ilvl="4" w:tplc="0C090003" w:tentative="1">
+      <w:start w:val="1"/>
+      <w:numFmt w:val="bullet"/>
+      <w:lvlText w:val="o"/>
+      <w:lvlJc w:val="left"/>
+      <w:pPr>
+        <w:ind w:left="3600" w:hanging="360"/>
+      </w:pPr>
+      <w:rPr>
+        <w:rFonts w:ascii="Courier New" w:hAnsi="Courier New" w:cs="Courier New" w:hint="default"/>
+      </w:rPr>
+    </w:lvl>
+    <w:lvl w:ilvl="5" w:tplc="0C090005" w:tentative="1">
+      <w:start w:val="1"/>
+      <w:numFmt w:val="bullet"/>
+      <w:lvlText w:val=""/>
+      <w:lvlJc w:val="left"/>
+      <w:pPr>
+        <w:ind w:left="4320" w:hanging="360"/>
+      </w:pPr>
+      <w:rPr>
+        <w:rFonts w:ascii="Wingdings" w:hAnsi="Wingdings" w:hint="default"/>
+      </w:rPr>
+    </w:lvl>
+    <w:lvl w:ilvl="6" w:tplc="0C090001" w:tentative="1">
+      <w:start w:val="1"/>
+      <w:numFmt w:val="bullet"/>
+      <w:lvlText w:val=""/>
+      <w:lvlJc w:val="left"/>
+      <w:pPr>
+        <w:ind w:left="5040" w:hanging="360"/>
+      </w:pPr>
+      <w:rPr>
+        <w:rFonts w:ascii="Symbol" w:hAnsi="Symbol" w:hint="default"/>
+      </w:rPr>
+    </w:lvl>
+    <w:lvl w:ilvl="7" w:tplc="0C090003" w:tentative="1">
+      <w:start w:val="1"/>
+      <w:numFmt w:val="bullet"/>
+      <w:lvlText w:val="o"/>
+      <w:lvlJc w:val="left"/>
+      <w:pPr>
+        <w:ind w:left="5760" w:hanging="360"/>
+      </w:pPr>
+      <w:rPr>
+        <w:rFonts w:ascii="Courier New" w:hAnsi="Courier New" w:cs="Courier New" w:hint="default"/>
+      </w:rPr>
+    </w:lvl>
+    <w:lvl w:ilvl="8" w:tplc="0C090005" w:tentative="1">
+      <w:start w:val="1"/>
+      <w:numFmt w:val="bullet"/>
+      <w:lvlText w:val=""/>
+      <w:lvlJc w:val="left"/>
+      <w:pPr>
+        <w:ind w:left="6480" w:hanging="360"/>
+      </w:pPr>
+      <w:rPr>
+        <w:rFonts w:ascii="Wingdings" w:hAnsi="Wingdings" w:hint="default"/>
+      </w:rPr>
+    </w:lvl>
+  </w:abstractNum>
+  <w:num w:numId="1" w16cid:durableId="1382830617">
+    <w:abstractNumId w:val="0"/>
+  </w:num>
+</w:numbering>
 </file>
 
 <file path=word/styles.xml><?xml version="1.0" encoding="utf-8"?>

</xml_diff>

<commit_message>
Retrospective written - Needs a second opinion
</commit_message>
<xml_diff>
--- a/Documentation/Sprint 2 Deliverables/Client_Meeting_Minutes_&_Retrospective.docx
+++ b/Documentation/Sprint 2 Deliverables/Client_Meeting_Minutes_&_Retrospective.docx
@@ -120,35 +120,7 @@
         <w:rPr>
           <w:lang w:val="en-US"/>
         </w:rPr>
-        <w:t xml:space="preserve">Present: Christo, Dylan, </w:t>
-      </w:r>
-      <w:proofErr w:type="spellStart"/>
-      <w:r>
-        <w:rPr>
-          <w:lang w:val="en-US"/>
-        </w:rPr>
-        <w:t>Lithasa</w:t>
-      </w:r>
-      <w:proofErr w:type="spellEnd"/>
-      <w:r>
-        <w:rPr>
-          <w:lang w:val="en-US"/>
-        </w:rPr>
-        <w:t xml:space="preserve">, </w:t>
-      </w:r>
-      <w:proofErr w:type="spellStart"/>
-      <w:r>
-        <w:rPr>
-          <w:lang w:val="en-US"/>
-        </w:rPr>
-        <w:t>Dhava</w:t>
-      </w:r>
-      <w:proofErr w:type="spellEnd"/>
-      <w:r>
-        <w:rPr>
-          <w:lang w:val="en-US"/>
-        </w:rPr>
-        <w:t>, Murphy, Terry</w:t>
+        <w:t>Present: Christo, Dylan, Lithasa, Dhava, Murphy, Terry</w:t>
       </w:r>
     </w:p>
     <w:p>
@@ -644,61 +616,7 @@
                 <w:szCs w:val="20"/>
                 <w:lang w:val="en-US"/>
               </w:rPr>
-              <w:t xml:space="preserve">Camera to recognize the gestures and translate into the three </w:t>
-            </w:r>
-            <w:proofErr w:type="spellStart"/>
-            <w:r>
-              <w:rPr>
-                <w:sz w:val="20"/>
-                <w:szCs w:val="20"/>
-                <w:lang w:val="en-US"/>
-              </w:rPr>
-              <w:t>vx</w:t>
-            </w:r>
-            <w:proofErr w:type="spellEnd"/>
-            <w:r>
-              <w:rPr>
-                <w:sz w:val="20"/>
-                <w:szCs w:val="20"/>
-                <w:lang w:val="en-US"/>
-              </w:rPr>
-              <w:t xml:space="preserve">, </w:t>
-            </w:r>
-            <w:proofErr w:type="spellStart"/>
-            <w:r>
-              <w:rPr>
-                <w:sz w:val="20"/>
-                <w:szCs w:val="20"/>
-                <w:lang w:val="en-US"/>
-              </w:rPr>
-              <w:t>vy</w:t>
-            </w:r>
-            <w:proofErr w:type="spellEnd"/>
-            <w:r>
-              <w:rPr>
-                <w:sz w:val="20"/>
-                <w:szCs w:val="20"/>
-                <w:lang w:val="en-US"/>
-              </w:rPr>
-              <w:t xml:space="preserve">, </w:t>
-            </w:r>
-            <w:proofErr w:type="spellStart"/>
-            <w:r>
-              <w:rPr>
-                <w:sz w:val="20"/>
-                <w:szCs w:val="20"/>
-                <w:lang w:val="en-US"/>
-              </w:rPr>
-              <w:t>vr</w:t>
-            </w:r>
-            <w:proofErr w:type="spellEnd"/>
-            <w:r>
-              <w:rPr>
-                <w:sz w:val="20"/>
-                <w:szCs w:val="20"/>
-                <w:lang w:val="en-US"/>
-              </w:rPr>
-              <w:t>. (x, y, rotation)</w:t>
+              <w:t>Camera to recognize the gestures and translate into the three vx, vy, vr. (x, y, rotation)</w:t>
             </w:r>
           </w:p>
           <w:p>
@@ -724,54 +642,8 @@
                 <w:szCs w:val="20"/>
                 <w:lang w:val="en-US"/>
               </w:rPr>
-              <w:t xml:space="preserve">Instead of </w:t>
-            </w:r>
-            <w:proofErr w:type="gramStart"/>
-            <w:r>
-              <w:rPr>
-                <w:sz w:val="20"/>
-                <w:szCs w:val="20"/>
-                <w:lang w:val="en-US"/>
-              </w:rPr>
-              <w:t>joystick</w:t>
-            </w:r>
-            <w:proofErr w:type="gramEnd"/>
-            <w:r>
-              <w:rPr>
-                <w:sz w:val="20"/>
-                <w:szCs w:val="20"/>
-                <w:lang w:val="en-US"/>
-              </w:rPr>
-              <w:t xml:space="preserve">, hands </w:t>
-            </w:r>
-            <w:proofErr w:type="gramStart"/>
-            <w:r>
-              <w:rPr>
-                <w:sz w:val="20"/>
-                <w:szCs w:val="20"/>
-                <w:lang w:val="en-US"/>
-              </w:rPr>
-              <w:t>used</w:t>
-            </w:r>
-            <w:proofErr w:type="gramEnd"/>
-            <w:r>
-              <w:rPr>
-                <w:sz w:val="20"/>
-                <w:szCs w:val="20"/>
-                <w:lang w:val="en-US"/>
-              </w:rPr>
-              <w:t xml:space="preserve"> to control </w:t>
-            </w:r>
-            <w:proofErr w:type="gramStart"/>
-            <w:r>
-              <w:rPr>
-                <w:sz w:val="20"/>
-                <w:szCs w:val="20"/>
-                <w:lang w:val="en-US"/>
-              </w:rPr>
-              <w:t>robot</w:t>
-            </w:r>
-            <w:proofErr w:type="gramEnd"/>
+              <w:t>Instead of joystick, hands used to control robot</w:t>
+            </w:r>
           </w:p>
           <w:p>
             <w:pPr>
@@ -850,41 +722,13 @@
                 <w:lang w:val="en-US"/>
               </w:rPr>
             </w:pPr>
-            <w:proofErr w:type="gramStart"/>
-            <w:r>
-              <w:rPr>
-                <w:sz w:val="20"/>
-                <w:szCs w:val="20"/>
-                <w:lang w:val="en-US"/>
-              </w:rPr>
-              <w:t>Have to</w:t>
-            </w:r>
-            <w:proofErr w:type="gramEnd"/>
-            <w:r>
-              <w:rPr>
-                <w:sz w:val="20"/>
-                <w:szCs w:val="20"/>
-                <w:lang w:val="en-US"/>
-              </w:rPr>
-              <w:t xml:space="preserve"> retarget to the real robot / simulation, and have the robot to mimic the movement (</w:t>
-            </w:r>
-            <w:proofErr w:type="gramStart"/>
-            <w:r>
-              <w:rPr>
-                <w:sz w:val="20"/>
-                <w:szCs w:val="20"/>
-                <w:lang w:val="en-US"/>
-              </w:rPr>
-              <w:t>look into</w:t>
-            </w:r>
-            <w:proofErr w:type="gramEnd"/>
-            <w:r>
-              <w:rPr>
-                <w:sz w:val="20"/>
-                <w:szCs w:val="20"/>
-                <w:lang w:val="en-US"/>
-              </w:rPr>
-              <w:t xml:space="preserve"> Pinocchio)</w:t>
+            <w:r>
+              <w:rPr>
+                <w:sz w:val="20"/>
+                <w:szCs w:val="20"/>
+                <w:lang w:val="en-US"/>
+              </w:rPr>
+              <w:t>Have to retarget to the real robot / simulation, and have the robot to mimic the movement (look into Pinocchio)</w:t>
             </w:r>
           </w:p>
           <w:p>
@@ -1048,25 +892,7 @@
                 <w:szCs w:val="20"/>
                 <w:lang w:val="en-US"/>
               </w:rPr>
-              <w:t xml:space="preserve">Client on leave Weeks </w:t>
-            </w:r>
-            <w:proofErr w:type="gramStart"/>
-            <w:r>
-              <w:rPr>
-                <w:sz w:val="20"/>
-                <w:szCs w:val="20"/>
-                <w:lang w:val="en-US"/>
-              </w:rPr>
-              <w:t>10,</w:t>
-            </w:r>
-            <w:proofErr w:type="gramEnd"/>
-            <w:r>
-              <w:rPr>
-                <w:sz w:val="20"/>
-                <w:szCs w:val="20"/>
-                <w:lang w:val="en-US"/>
-              </w:rPr>
-              <w:t xml:space="preserve"> and 11, so optimally finish by Week 9.</w:t>
+              <w:t>Client on leave Weeks 10, and 11, so optimally finish by Week 9.</w:t>
             </w:r>
           </w:p>
         </w:tc>
@@ -1357,6 +1183,8 @@
           <w:tab w:val="left" w:pos="5844"/>
         </w:tabs>
         <w:rPr>
+          <w:b/>
+          <w:bCs/>
           <w:sz w:val="32"/>
           <w:szCs w:val="32"/>
           <w:lang w:val="en-US"/>
@@ -1364,6 +1192,8 @@
       </w:pPr>
       <w:r>
         <w:rPr>
+          <w:b/>
+          <w:bCs/>
           <w:sz w:val="32"/>
           <w:szCs w:val="32"/>
           <w:lang w:val="en-US"/>
@@ -1606,35 +1436,7 @@
               <w:rPr>
                 <w:lang w:val="en-US"/>
               </w:rPr>
-              <w:t xml:space="preserve">Person detection is implemented using </w:t>
-            </w:r>
-            <w:proofErr w:type="spellStart"/>
-            <w:r>
-              <w:rPr>
-                <w:lang w:val="en-US"/>
-              </w:rPr>
-              <w:t>MediaPipe</w:t>
-            </w:r>
-            <w:proofErr w:type="spellEnd"/>
-            <w:r>
-              <w:rPr>
-                <w:lang w:val="en-US"/>
-              </w:rPr>
-              <w:t xml:space="preserve"> Pose </w:t>
-            </w:r>
-            <w:proofErr w:type="spellStart"/>
-            <w:r>
-              <w:rPr>
-                <w:lang w:val="en-US"/>
-              </w:rPr>
-              <w:t>Landmarker</w:t>
-            </w:r>
-            <w:proofErr w:type="spellEnd"/>
-            <w:r>
-              <w:rPr>
-                <w:lang w:val="en-US"/>
-              </w:rPr>
-              <w:t>.</w:t>
+              <w:t>Person detection is implemented using MediaPipe Pose Landmarker.</w:t>
             </w:r>
           </w:p>
         </w:tc>
@@ -1880,21 +1682,7 @@
               <w:rPr>
                 <w:lang w:val="en-US"/>
               </w:rPr>
-              <w:t xml:space="preserve">The system extracts the selected leader’s </w:t>
-            </w:r>
-            <w:proofErr w:type="spellStart"/>
-            <w:r>
-              <w:rPr>
-                <w:lang w:val="en-US"/>
-              </w:rPr>
-              <w:t>MediaPipe</w:t>
-            </w:r>
-            <w:proofErr w:type="spellEnd"/>
-            <w:r>
-              <w:rPr>
-                <w:lang w:val="en-US"/>
-              </w:rPr>
-              <w:t xml:space="preserve"> pose world landmarks in 3D and can export them per frame with frame ID, timestamp, leader ID and bounding box.</w:t>
+              <w:t>The system extracts the selected leader’s MediaPipe pose world landmarks in 3D and can export them per frame with frame ID, timestamp, leader ID and bounding box.</w:t>
             </w:r>
           </w:p>
         </w:tc>
@@ -3058,13 +2846,7 @@
               <w:rPr>
                 <w:lang w:val="en-US"/>
               </w:rPr>
-              <w:t xml:space="preserve"> a</w:t>
-            </w:r>
-            <w:r>
-              <w:rPr>
-                <w:lang w:val="en-US"/>
-              </w:rPr>
-              <w:t>nd/or discarded. This functionality is already covered in other aspects of the project</w:t>
+              <w:t xml:space="preserve"> and/or discarded. This functionality is already covered in other aspects of the project</w:t>
             </w:r>
           </w:p>
         </w:tc>
@@ -3238,6 +3020,663 @@
           <w:lang w:val="en-US"/>
         </w:rPr>
       </w:pPr>
+      <w:r>
+        <w:rPr>
+          <w:lang w:val="en-US"/>
+        </w:rPr>
+        <w:br/>
+      </w:r>
+      <w:r>
+        <w:rPr>
+          <w:lang w:val="en-US"/>
+        </w:rPr>
+        <w:br/>
+      </w:r>
+      <w:r>
+        <w:rPr>
+          <w:lang w:val="en-US"/>
+        </w:rPr>
+        <w:br/>
+      </w:r>
+      <w:r>
+        <w:rPr>
+          <w:lang w:val="en-US"/>
+        </w:rPr>
+        <w:br/>
+      </w:r>
+      <w:r>
+        <w:rPr>
+          <w:lang w:val="en-US"/>
+        </w:rPr>
+        <w:br/>
+      </w:r>
+    </w:p>
+    <w:p>
+      <w:pPr>
+        <w:tabs>
+          <w:tab w:val="center" w:pos="4513"/>
+          <w:tab w:val="left" w:pos="5844"/>
+        </w:tabs>
+        <w:rPr>
+          <w:b/>
+          <w:bCs/>
+          <w:sz w:val="32"/>
+          <w:szCs w:val="32"/>
+          <w:lang w:val="en-US"/>
+        </w:rPr>
+      </w:pPr>
+    </w:p>
+    <w:p>
+      <w:pPr>
+        <w:tabs>
+          <w:tab w:val="center" w:pos="4513"/>
+          <w:tab w:val="left" w:pos="5844"/>
+        </w:tabs>
+        <w:rPr>
+          <w:b/>
+          <w:bCs/>
+          <w:sz w:val="28"/>
+          <w:szCs w:val="28"/>
+          <w:lang w:val="en-US"/>
+        </w:rPr>
+      </w:pPr>
+      <w:r>
+        <w:rPr>
+          <w:b/>
+          <w:bCs/>
+          <w:sz w:val="28"/>
+          <w:szCs w:val="28"/>
+          <w:lang w:val="en-US"/>
+        </w:rPr>
+        <w:lastRenderedPageBreak/>
+        <w:t>Expected vs Actual:</w:t>
+      </w:r>
+    </w:p>
+    <w:p>
+      <w:pPr>
+        <w:pStyle w:val="ListParagraph"/>
+        <w:numPr>
+          <w:ilvl w:val="0"/>
+          <w:numId w:val="1"/>
+        </w:numPr>
+        <w:tabs>
+          <w:tab w:val="center" w:pos="4513"/>
+          <w:tab w:val="left" w:pos="5844"/>
+        </w:tabs>
+        <w:rPr>
+          <w:lang w:val="en-US"/>
+        </w:rPr>
+      </w:pPr>
+      <w:r>
+        <w:rPr>
+          <w:lang w:val="en-US"/>
+        </w:rPr>
+        <w:t>Hours logged</w:t>
+      </w:r>
+      <w:r>
+        <w:rPr>
+          <w:lang w:val="en-US"/>
+        </w:rPr>
+        <w:t xml:space="preserve"> by week 8 is 173.66h. comfortably inside the 360h</w:t>
+      </w:r>
+      <w:r>
+        <w:rPr>
+          <w:lang w:val="en-US"/>
+        </w:rPr>
+        <w:t xml:space="preserve"> budget placed at the start of the semester.</w:t>
+      </w:r>
+    </w:p>
+    <w:p>
+      <w:pPr>
+        <w:pStyle w:val="ListParagraph"/>
+        <w:numPr>
+          <w:ilvl w:val="0"/>
+          <w:numId w:val="1"/>
+        </w:numPr>
+        <w:tabs>
+          <w:tab w:val="center" w:pos="4513"/>
+          <w:tab w:val="left" w:pos="5844"/>
+        </w:tabs>
+        <w:rPr>
+          <w:lang w:val="en-US"/>
+        </w:rPr>
+      </w:pPr>
+      <w:r>
+        <w:rPr>
+          <w:lang w:val="en-US"/>
+        </w:rPr>
+        <w:t xml:space="preserve">The </w:t>
+      </w:r>
+      <w:r>
+        <w:rPr>
+          <w:lang w:val="en-US"/>
+        </w:rPr>
+        <w:t>Gesture Recognition</w:t>
+      </w:r>
+      <w:r>
+        <w:rPr>
+          <w:lang w:val="en-US"/>
+        </w:rPr>
+        <w:t xml:space="preserve"> </w:t>
+      </w:r>
+      <w:r>
+        <w:rPr>
+          <w:lang w:val="en-US"/>
+        </w:rPr>
+        <w:t>has had overwhelmingly more effort (coding and testing)</w:t>
+      </w:r>
+      <w:r>
+        <w:rPr>
+          <w:lang w:val="en-US"/>
+        </w:rPr>
+        <w:t xml:space="preserve"> put into it than the person tracking</w:t>
+      </w:r>
+      <w:r>
+        <w:rPr>
+          <w:lang w:val="en-US"/>
+        </w:rPr>
+        <w:t xml:space="preserve"> in terms of hours. This is </w:t>
+      </w:r>
+      <w:r>
+        <w:rPr>
+          <w:lang w:val="en-US"/>
+        </w:rPr>
+        <w:t xml:space="preserve">consistent with the Gesture Recognition program </w:t>
+      </w:r>
+      <w:r>
+        <w:rPr>
+          <w:lang w:val="en-US"/>
+        </w:rPr>
+        <w:t>starting</w:t>
+      </w:r>
+      <w:r>
+        <w:rPr>
+          <w:lang w:val="en-US"/>
+        </w:rPr>
+        <w:t xml:space="preserve"> further development</w:t>
+      </w:r>
+      <w:r>
+        <w:rPr>
+          <w:lang w:val="en-US"/>
+        </w:rPr>
+        <w:t xml:space="preserve"> into the next phase. </w:t>
+      </w:r>
+      <w:r>
+        <w:rPr>
+          <w:lang w:val="en-US"/>
+        </w:rPr>
+        <w:t>However,</w:t>
+      </w:r>
+      <w:r>
+        <w:rPr>
+          <w:lang w:val="en-US"/>
+        </w:rPr>
+        <w:t xml:space="preserve"> the gap in hours still seems a bit high</w:t>
+      </w:r>
+      <w:r>
+        <w:rPr>
+          <w:lang w:val="en-US"/>
+        </w:rPr>
+        <w:t>.</w:t>
+      </w:r>
+      <w:r>
+        <w:rPr>
+          <w:lang w:val="en-US"/>
+        </w:rPr>
+        <w:t xml:space="preserve"> This may be due to th</w:t>
+      </w:r>
+      <w:r>
+        <w:rPr>
+          <w:lang w:val="en-US"/>
+        </w:rPr>
+        <w:t>e time it took testing the program and documenting it.</w:t>
+      </w:r>
+    </w:p>
+    <w:p>
+      <w:pPr>
+        <w:pStyle w:val="ListParagraph"/>
+        <w:numPr>
+          <w:ilvl w:val="0"/>
+          <w:numId w:val="1"/>
+        </w:numPr>
+        <w:tabs>
+          <w:tab w:val="center" w:pos="4513"/>
+          <w:tab w:val="left" w:pos="5844"/>
+        </w:tabs>
+        <w:rPr>
+          <w:lang w:val="en-US"/>
+        </w:rPr>
+      </w:pPr>
+      <w:r>
+        <w:rPr>
+          <w:lang w:val="en-US"/>
+        </w:rPr>
+        <w:t xml:space="preserve">Motion Mirroring is the next </w:t>
+      </w:r>
+      <w:r>
+        <w:rPr>
+          <w:lang w:val="en-US"/>
+        </w:rPr>
+        <w:t>part</w:t>
+      </w:r>
+      <w:r>
+        <w:rPr>
+          <w:lang w:val="en-US"/>
+        </w:rPr>
+        <w:t xml:space="preserve"> </w:t>
+      </w:r>
+      <w:r>
+        <w:rPr>
+          <w:lang w:val="en-US"/>
+        </w:rPr>
+        <w:t>of</w:t>
+      </w:r>
+      <w:r>
+        <w:rPr>
+          <w:lang w:val="en-US"/>
+        </w:rPr>
+        <w:t xml:space="preserve"> the Person Tracking</w:t>
+      </w:r>
+      <w:r>
+        <w:rPr>
+          <w:lang w:val="en-US"/>
+        </w:rPr>
+        <w:t xml:space="preserve"> / Identification program. This aspect is tracking behind</w:t>
+      </w:r>
+      <w:r>
+        <w:rPr>
+          <w:lang w:val="en-US"/>
+        </w:rPr>
+        <w:t xml:space="preserve"> at the </w:t>
+      </w:r>
+      <w:r>
+        <w:rPr>
+          <w:lang w:val="en-US"/>
+        </w:rPr>
+        <w:t>moment but</w:t>
+      </w:r>
+      <w:r>
+        <w:rPr>
+          <w:lang w:val="en-US"/>
+        </w:rPr>
+        <w:t xml:space="preserve"> is an integral part of the</w:t>
+      </w:r>
+      <w:r>
+        <w:rPr>
+          <w:lang w:val="en-US"/>
+        </w:rPr>
+        <w:t xml:space="preserve"> program.</w:t>
+      </w:r>
+    </w:p>
+    <w:p>
+      <w:pPr>
+        <w:pStyle w:val="ListParagraph"/>
+        <w:numPr>
+          <w:ilvl w:val="0"/>
+          <w:numId w:val="1"/>
+        </w:numPr>
+        <w:tabs>
+          <w:tab w:val="center" w:pos="4513"/>
+          <w:tab w:val="left" w:pos="5844"/>
+        </w:tabs>
+        <w:rPr>
+          <w:lang w:val="en-US"/>
+        </w:rPr>
+      </w:pPr>
+      <w:r>
+        <w:rPr>
+          <w:lang w:val="en-US"/>
+        </w:rPr>
+        <w:t>Person Following is tracking as expected. This aspect of the program is low priority and is a ‘nice to have’ not a necessity. As such other aspects of the program take pre</w:t>
+      </w:r>
+      <w:r>
+        <w:rPr>
+          <w:lang w:val="en-US"/>
+        </w:rPr>
+        <w:t>cedence.</w:t>
+      </w:r>
+    </w:p>
+    <w:p>
+      <w:pPr>
+        <w:pStyle w:val="ListParagraph"/>
+        <w:numPr>
+          <w:ilvl w:val="0"/>
+          <w:numId w:val="1"/>
+        </w:numPr>
+        <w:tabs>
+          <w:tab w:val="center" w:pos="4513"/>
+          <w:tab w:val="left" w:pos="5844"/>
+        </w:tabs>
+        <w:rPr>
+          <w:lang w:val="en-US"/>
+        </w:rPr>
+      </w:pPr>
+      <w:r>
+        <w:rPr>
+          <w:lang w:val="en-US"/>
+        </w:rPr>
+        <w:t xml:space="preserve">The Gesture Recognition demo performed exactly as expected. Client noted </w:t>
+      </w:r>
+      <w:r>
+        <w:rPr>
+          <w:lang w:val="en-US"/>
+        </w:rPr>
+        <w:t>extra things to be implemented by next meeting</w:t>
+      </w:r>
+      <w:r>
+        <w:rPr>
+          <w:lang w:val="en-US"/>
+        </w:rPr>
+        <w:t xml:space="preserve"> </w:t>
+      </w:r>
+      <w:r>
+        <w:rPr>
+          <w:lang w:val="en-US"/>
+        </w:rPr>
+        <w:t xml:space="preserve">which would </w:t>
+      </w:r>
+      <w:r>
+        <w:rPr>
+          <w:lang w:val="en-US"/>
+        </w:rPr>
+        <w:t>make the program’s next step be the jump to</w:t>
+      </w:r>
+      <w:r>
+        <w:rPr>
+          <w:lang w:val="en-US"/>
+        </w:rPr>
+        <w:t xml:space="preserve"> the real robot from the simulation.</w:t>
+      </w:r>
+    </w:p>
+    <w:p>
+      <w:pPr>
+        <w:pStyle w:val="ListParagraph"/>
+        <w:numPr>
+          <w:ilvl w:val="0"/>
+          <w:numId w:val="1"/>
+        </w:numPr>
+        <w:tabs>
+          <w:tab w:val="center" w:pos="4513"/>
+          <w:tab w:val="left" w:pos="5844"/>
+        </w:tabs>
+        <w:rPr>
+          <w:lang w:val="en-US"/>
+        </w:rPr>
+      </w:pPr>
+      <w:r>
+        <w:rPr>
+          <w:lang w:val="en-US"/>
+        </w:rPr>
+        <w:t xml:space="preserve">The </w:t>
+      </w:r>
+      <w:r>
+        <w:rPr>
+          <w:lang w:val="en-US"/>
+        </w:rPr>
+        <w:t>Person Tracking / Identification demo also performed as expected.</w:t>
+      </w:r>
+    </w:p>
+    <w:p>
+      <w:pPr>
+        <w:pStyle w:val="ListParagraph"/>
+        <w:numPr>
+          <w:ilvl w:val="0"/>
+          <w:numId w:val="1"/>
+        </w:numPr>
+        <w:tabs>
+          <w:tab w:val="center" w:pos="4513"/>
+          <w:tab w:val="left" w:pos="5844"/>
+        </w:tabs>
+        <w:rPr>
+          <w:lang w:val="en-US"/>
+        </w:rPr>
+      </w:pPr>
+      <w:r>
+        <w:rPr>
+          <w:lang w:val="en-US"/>
+        </w:rPr>
+        <w:t>Given time restrictions, Person Following is a realistic contender for</w:t>
+      </w:r>
+      <w:r>
+        <w:rPr>
+          <w:lang w:val="en-US"/>
+        </w:rPr>
+        <w:t xml:space="preserve"> scope reduction. </w:t>
+      </w:r>
+    </w:p>
+    <w:p>
+      <w:pPr>
+        <w:tabs>
+          <w:tab w:val="center" w:pos="4513"/>
+          <w:tab w:val="left" w:pos="5844"/>
+        </w:tabs>
+        <w:rPr>
+          <w:lang w:val="en-US"/>
+        </w:rPr>
+      </w:pPr>
+    </w:p>
+    <w:p>
+      <w:pPr>
+        <w:tabs>
+          <w:tab w:val="center" w:pos="4513"/>
+          <w:tab w:val="left" w:pos="5844"/>
+        </w:tabs>
+        <w:rPr>
+          <w:b/>
+          <w:bCs/>
+          <w:sz w:val="28"/>
+          <w:szCs w:val="28"/>
+          <w:lang w:val="en-US"/>
+        </w:rPr>
+      </w:pPr>
+      <w:r>
+        <w:rPr>
+          <w:b/>
+          <w:bCs/>
+          <w:sz w:val="28"/>
+          <w:szCs w:val="28"/>
+          <w:lang w:val="en-US"/>
+        </w:rPr>
+        <w:t xml:space="preserve">Looking </w:t>
+      </w:r>
+      <w:r>
+        <w:rPr>
+          <w:b/>
+          <w:bCs/>
+          <w:sz w:val="28"/>
+          <w:szCs w:val="28"/>
+          <w:lang w:val="en-US"/>
+        </w:rPr>
+        <w:t>F</w:t>
+      </w:r>
+      <w:r>
+        <w:rPr>
+          <w:b/>
+          <w:bCs/>
+          <w:sz w:val="28"/>
+          <w:szCs w:val="28"/>
+          <w:lang w:val="en-US"/>
+        </w:rPr>
+        <w:t>orward:</w:t>
+      </w:r>
+    </w:p>
+    <w:p>
+      <w:pPr>
+        <w:pStyle w:val="ListParagraph"/>
+        <w:numPr>
+          <w:ilvl w:val="0"/>
+          <w:numId w:val="1"/>
+        </w:numPr>
+        <w:tabs>
+          <w:tab w:val="center" w:pos="4513"/>
+          <w:tab w:val="left" w:pos="5844"/>
+        </w:tabs>
+        <w:rPr>
+          <w:lang w:val="en-US"/>
+        </w:rPr>
+      </w:pPr>
+      <w:r>
+        <w:rPr>
+          <w:lang w:val="en-US"/>
+        </w:rPr>
+        <w:t>The</w:t>
+      </w:r>
+      <w:r>
+        <w:rPr>
+          <w:lang w:val="en-US"/>
+        </w:rPr>
+        <w:t xml:space="preserve"> Person Tracking / Identification aspect’s</w:t>
+      </w:r>
+      <w:r>
+        <w:rPr>
+          <w:lang w:val="en-US"/>
+        </w:rPr>
+        <w:t xml:space="preserve"> next step (Motion Mirroring) should be implemented by next meeting. From there the two programs can be consolidated into one.</w:t>
+      </w:r>
+    </w:p>
+    <w:p>
+      <w:pPr>
+        <w:pStyle w:val="ListParagraph"/>
+        <w:numPr>
+          <w:ilvl w:val="0"/>
+          <w:numId w:val="1"/>
+        </w:numPr>
+        <w:tabs>
+          <w:tab w:val="center" w:pos="4513"/>
+          <w:tab w:val="left" w:pos="5844"/>
+        </w:tabs>
+        <w:rPr>
+          <w:b/>
+          <w:bCs/>
+          <w:lang w:val="en-US"/>
+        </w:rPr>
+      </w:pPr>
+      <w:r>
+        <w:rPr>
+          <w:lang w:val="en-US"/>
+        </w:rPr>
+        <w:t>The Gesture Recognition next step should also be implemented</w:t>
+      </w:r>
+      <w:r>
+        <w:rPr>
+          <w:lang w:val="en-US"/>
+        </w:rPr>
+        <w:t xml:space="preserve">. The different hand gestures should map to real movement instructions the robot </w:t>
+      </w:r>
+      <w:r>
+        <w:rPr>
+          <w:lang w:val="en-US"/>
+        </w:rPr>
+        <w:t xml:space="preserve">/simulation </w:t>
+      </w:r>
+      <w:r>
+        <w:rPr>
+          <w:lang w:val="en-US"/>
+        </w:rPr>
+        <w:t>should follow</w:t>
+      </w:r>
+      <w:r>
+        <w:rPr>
+          <w:lang w:val="en-US"/>
+        </w:rPr>
+        <w:t>.</w:t>
+      </w:r>
+      <w:r>
+        <w:rPr>
+          <w:lang w:val="en-US"/>
+        </w:rPr>
+        <w:t xml:space="preserve"> Gestures should replace the use of controller joysticks</w:t>
+      </w:r>
+    </w:p>
+    <w:p>
+      <w:pPr>
+        <w:pStyle w:val="ListParagraph"/>
+        <w:numPr>
+          <w:ilvl w:val="0"/>
+          <w:numId w:val="1"/>
+        </w:numPr>
+        <w:tabs>
+          <w:tab w:val="center" w:pos="4513"/>
+          <w:tab w:val="left" w:pos="5844"/>
+        </w:tabs>
+        <w:rPr>
+          <w:b/>
+          <w:bCs/>
+          <w:lang w:val="en-US"/>
+        </w:rPr>
+      </w:pPr>
+      <w:r>
+        <w:rPr>
+          <w:lang w:val="en-US"/>
+        </w:rPr>
+        <w:t>Considering all this</w:t>
+      </w:r>
+      <w:r>
+        <w:rPr>
+          <w:lang w:val="en-US"/>
+        </w:rPr>
+        <w:t xml:space="preserve"> and that there are still ~1</w:t>
+      </w:r>
+      <w:r>
+        <w:rPr>
+          <w:lang w:val="en-US"/>
+        </w:rPr>
+        <w:t>6</w:t>
+      </w:r>
+      <w:r>
+        <w:rPr>
+          <w:lang w:val="en-US"/>
+        </w:rPr>
+        <w:t>0h (not including Week 8 hours)</w:t>
+      </w:r>
+      <w:r>
+        <w:rPr>
+          <w:lang w:val="en-US"/>
+        </w:rPr>
+        <w:t xml:space="preserve"> left, there will be enough time within the time budget to complete this project.</w:t>
+      </w:r>
+    </w:p>
+    <w:p>
+      <w:pPr>
+        <w:pStyle w:val="ListParagraph"/>
+        <w:numPr>
+          <w:ilvl w:val="0"/>
+          <w:numId w:val="1"/>
+        </w:numPr>
+        <w:tabs>
+          <w:tab w:val="center" w:pos="4513"/>
+          <w:tab w:val="left" w:pos="5844"/>
+        </w:tabs>
+        <w:rPr>
+          <w:b/>
+          <w:bCs/>
+          <w:lang w:val="en-US"/>
+        </w:rPr>
+      </w:pPr>
+      <w:r>
+        <w:rPr>
+          <w:lang w:val="en-US"/>
+        </w:rPr>
+        <w:t>The client will be on leave in weeks 10 and 11 giving the team only two more meetings.</w:t>
+      </w:r>
+      <w:r>
+        <w:rPr>
+          <w:lang w:val="en-US"/>
+        </w:rPr>
+        <w:t xml:space="preserve"> As such the team should push through the current time pressure and get something almost deliverable by Week 9</w:t>
+      </w:r>
+      <w:r>
+        <w:rPr>
+          <w:lang w:val="en-US"/>
+        </w:rPr>
+        <w:t xml:space="preserve"> meeting. This will cause a spike in hours assigned to project</w:t>
+      </w:r>
+      <w:r>
+        <w:rPr>
+          <w:lang w:val="en-US"/>
+        </w:rPr>
+        <w:t>.</w:t>
+      </w:r>
     </w:p>
     <w:sectPr>
       <w:pgSz w:w="11906" w:h="16838"/>

</xml_diff>

<commit_message>
add: sprint 2 deliverables
</commit_message>
<xml_diff>
--- a/Documentation/Sprint 2 Deliverables/Client_Meeting_Minutes_&_Retrospective.docx
+++ b/Documentation/Sprint 2 Deliverables/Client_Meeting_Minutes_&_Retrospective.docx
@@ -47,7 +47,7 @@
           <w:szCs w:val="48"/>
           <w:lang w:val="en-US"/>
         </w:rPr>
-        <w:t>M</w:t>
+        <w:t xml:space="preserve">Minutes of Meeting </w:t>
       </w:r>
       <w:r>
         <w:rPr>
@@ -57,27 +57,7 @@
           <w:szCs w:val="48"/>
           <w:lang w:val="en-US"/>
         </w:rPr>
-        <w:t xml:space="preserve">inutes of </w:t>
-      </w:r>
-      <w:r>
-        <w:rPr>
-          <w:b/>
-          <w:bCs/>
-          <w:sz w:val="48"/>
-          <w:szCs w:val="48"/>
-          <w:lang w:val="en-US"/>
-        </w:rPr>
-        <w:t xml:space="preserve">Sprint 2 Client </w:t>
-      </w:r>
-      <w:r>
-        <w:rPr>
-          <w:b/>
-          <w:bCs/>
-          <w:sz w:val="48"/>
-          <w:szCs w:val="48"/>
-          <w:lang w:val="en-US"/>
-        </w:rPr>
-        <w:t>Meeting</w:t>
+        <w:t>8</w:t>
       </w:r>
     </w:p>
     <w:p>
@@ -99,7 +79,31 @@
           <w:szCs w:val="32"/>
           <w:lang w:val="en-US"/>
         </w:rPr>
-        <w:t>DD/MM/2026</w:t>
+        <w:t>16</w:t>
+      </w:r>
+      <w:r>
+        <w:rPr>
+          <w:sz w:val="32"/>
+          <w:szCs w:val="32"/>
+          <w:lang w:val="en-US"/>
+        </w:rPr>
+        <w:t>/</w:t>
+      </w:r>
+      <w:r>
+        <w:rPr>
+          <w:sz w:val="32"/>
+          <w:szCs w:val="32"/>
+          <w:lang w:val="en-US"/>
+        </w:rPr>
+        <w:t>09</w:t>
+      </w:r>
+      <w:r>
+        <w:rPr>
+          <w:sz w:val="32"/>
+          <w:szCs w:val="32"/>
+          <w:lang w:val="en-US"/>
+        </w:rPr>
+        <w:t>/2026</w:t>
       </w:r>
     </w:p>
     <w:p>
@@ -116,7 +120,7 @@
         <w:rPr>
           <w:lang w:val="en-US"/>
         </w:rPr>
-        <w:t xml:space="preserve">Present: </w:t>
+        <w:t>Present: Christo, Dylan, Lithasa, Dhava, Murphy, Terry</w:t>
       </w:r>
     </w:p>
     <w:p>
@@ -150,13 +154,7 @@
         <w:rPr>
           <w:lang w:val="en-US"/>
         </w:rPr>
-        <w:t>Absentees:</w:t>
-      </w:r>
-      <w:r>
-        <w:rPr>
-          <w:lang w:val="en-US"/>
-        </w:rPr>
-        <w:t xml:space="preserve"> </w:t>
+        <w:t xml:space="preserve">Absentees: </w:t>
       </w:r>
     </w:p>
     <w:p>
@@ -173,13 +171,7 @@
         <w:rPr>
           <w:lang w:val="en-US"/>
         </w:rPr>
-        <w:t>Meeting Start:</w:t>
-      </w:r>
-      <w:r>
-        <w:rPr>
-          <w:lang w:val="en-US"/>
-        </w:rPr>
-        <w:t xml:space="preserve"> </w:t>
+        <w:t>Meeting Start: 1.00pm</w:t>
       </w:r>
     </w:p>
     <w:p>
@@ -196,13 +188,7 @@
         <w:rPr>
           <w:lang w:val="en-US"/>
         </w:rPr>
-        <w:t>Meeting End:</w:t>
-      </w:r>
-      <w:r>
-        <w:rPr>
-          <w:lang w:val="en-US"/>
-        </w:rPr>
-        <w:t xml:space="preserve"> </w:t>
+        <w:t>Meeting End: 1:30pm</w:t>
       </w:r>
     </w:p>
     <w:tbl>
@@ -210,19 +196,20 @@
         <w:tblStyle w:val="TableGrid"/>
         <w:tblW w:w="11624" w:type="dxa"/>
         <w:tblInd w:w="-572" w:type="dxa"/>
+        <w:tblLayout w:type="fixed"/>
         <w:tblLook w:val="04A0" w:firstRow="1" w:lastRow="0" w:firstColumn="1" w:lastColumn="0" w:noHBand="0" w:noVBand="1"/>
       </w:tblPr>
       <w:tblGrid>
-        <w:gridCol w:w="822"/>
-        <w:gridCol w:w="987"/>
-        <w:gridCol w:w="2160"/>
+        <w:gridCol w:w="821"/>
+        <w:gridCol w:w="810"/>
+        <w:gridCol w:w="1399"/>
+        <w:gridCol w:w="4625"/>
         <w:gridCol w:w="3969"/>
-        <w:gridCol w:w="3686"/>
       </w:tblGrid>
       <w:tr>
         <w:tc>
           <w:tcPr>
-            <w:tcW w:w="822" w:type="dxa"/>
+            <w:tcW w:w="821" w:type="dxa"/>
             <w:shd w:val="clear" w:color="auto" w:fill="83CAEB" w:themeFill="accent1" w:themeFillTint="66"/>
           </w:tcPr>
           <w:p>
@@ -249,7 +236,7 @@
         </w:tc>
         <w:tc>
           <w:tcPr>
-            <w:tcW w:w="987" w:type="dxa"/>
+            <w:tcW w:w="810" w:type="dxa"/>
             <w:shd w:val="clear" w:color="auto" w:fill="83CAEB" w:themeFill="accent1" w:themeFillTint="66"/>
           </w:tcPr>
           <w:p>
@@ -276,7 +263,7 @@
         </w:tc>
         <w:tc>
           <w:tcPr>
-            <w:tcW w:w="2160" w:type="dxa"/>
+            <w:tcW w:w="1399" w:type="dxa"/>
             <w:shd w:val="clear" w:color="auto" w:fill="83CAEB" w:themeFill="accent1" w:themeFillTint="66"/>
           </w:tcPr>
           <w:p>
@@ -303,6 +290,33 @@
         </w:tc>
         <w:tc>
           <w:tcPr>
+            <w:tcW w:w="4625" w:type="dxa"/>
+            <w:shd w:val="clear" w:color="auto" w:fill="83CAEB" w:themeFill="accent1" w:themeFillTint="66"/>
+          </w:tcPr>
+          <w:p>
+            <w:pPr>
+              <w:tabs>
+                <w:tab w:val="center" w:pos="4513"/>
+                <w:tab w:val="left" w:pos="5844"/>
+              </w:tabs>
+              <w:rPr>
+                <w:b/>
+                <w:bCs/>
+                <w:lang w:val="en-US"/>
+              </w:rPr>
+            </w:pPr>
+            <w:r>
+              <w:rPr>
+                <w:b/>
+                <w:bCs/>
+                <w:lang w:val="en-US"/>
+              </w:rPr>
+              <w:t>Details:</w:t>
+            </w:r>
+          </w:p>
+        </w:tc>
+        <w:tc>
+          <w:tcPr>
             <w:tcW w:w="3969" w:type="dxa"/>
             <w:shd w:val="clear" w:color="auto" w:fill="83CAEB" w:themeFill="accent1" w:themeFillTint="66"/>
           </w:tcPr>
@@ -324,33 +338,6 @@
                 <w:bCs/>
                 <w:lang w:val="en-US"/>
               </w:rPr>
-              <w:t>Details:</w:t>
-            </w:r>
-          </w:p>
-        </w:tc>
-        <w:tc>
-          <w:tcPr>
-            <w:tcW w:w="3686" w:type="dxa"/>
-            <w:shd w:val="clear" w:color="auto" w:fill="83CAEB" w:themeFill="accent1" w:themeFillTint="66"/>
-          </w:tcPr>
-          <w:p>
-            <w:pPr>
-              <w:tabs>
-                <w:tab w:val="center" w:pos="4513"/>
-                <w:tab w:val="left" w:pos="5844"/>
-              </w:tabs>
-              <w:rPr>
-                <w:b/>
-                <w:bCs/>
-                <w:lang w:val="en-US"/>
-              </w:rPr>
-            </w:pPr>
-            <w:r>
-              <w:rPr>
-                <w:b/>
-                <w:bCs/>
-                <w:lang w:val="en-US"/>
-              </w:rPr>
               <w:t>Action:</w:t>
             </w:r>
           </w:p>
@@ -359,64 +346,127 @@
       <w:tr>
         <w:tc>
           <w:tcPr>
-            <w:tcW w:w="822" w:type="dxa"/>
-          </w:tcPr>
-          <w:p>
-            <w:pPr>
-              <w:tabs>
-                <w:tab w:val="center" w:pos="4513"/>
-                <w:tab w:val="left" w:pos="5844"/>
-              </w:tabs>
-              <w:rPr>
-                <w:sz w:val="20"/>
-                <w:szCs w:val="20"/>
-                <w:lang w:val="en-US"/>
-              </w:rPr>
-            </w:pPr>
-            <w:r>
-              <w:rPr>
-                <w:sz w:val="20"/>
-                <w:szCs w:val="20"/>
-                <w:lang w:val="en-US"/>
-              </w:rPr>
-              <w:t>1100</w:t>
-            </w:r>
-          </w:p>
-        </w:tc>
-        <w:tc>
-          <w:tcPr>
-            <w:tcW w:w="987" w:type="dxa"/>
-          </w:tcPr>
-          <w:p>
-            <w:pPr>
-              <w:tabs>
-                <w:tab w:val="center" w:pos="4513"/>
-                <w:tab w:val="left" w:pos="5844"/>
-              </w:tabs>
-              <w:rPr>
-                <w:sz w:val="20"/>
-                <w:szCs w:val="20"/>
-                <w:lang w:val="en-US"/>
-              </w:rPr>
-            </w:pPr>
-          </w:p>
-        </w:tc>
-        <w:tc>
-          <w:tcPr>
-            <w:tcW w:w="2160" w:type="dxa"/>
-          </w:tcPr>
-          <w:p>
-            <w:pPr>
-              <w:tabs>
-                <w:tab w:val="center" w:pos="4513"/>
-                <w:tab w:val="left" w:pos="5844"/>
-              </w:tabs>
-              <w:rPr>
-                <w:sz w:val="20"/>
-                <w:szCs w:val="20"/>
-                <w:lang w:val="en-US"/>
-              </w:rPr>
-            </w:pPr>
+            <w:tcW w:w="821" w:type="dxa"/>
+          </w:tcPr>
+          <w:p>
+            <w:pPr>
+              <w:tabs>
+                <w:tab w:val="center" w:pos="4513"/>
+                <w:tab w:val="left" w:pos="5844"/>
+              </w:tabs>
+              <w:rPr>
+                <w:sz w:val="20"/>
+                <w:szCs w:val="20"/>
+                <w:lang w:val="en-US"/>
+              </w:rPr>
+            </w:pPr>
+            <w:r>
+              <w:rPr>
+                <w:sz w:val="20"/>
+                <w:szCs w:val="20"/>
+                <w:lang w:val="en-US"/>
+              </w:rPr>
+              <w:t>13:00</w:t>
+            </w:r>
+          </w:p>
+        </w:tc>
+        <w:tc>
+          <w:tcPr>
+            <w:tcW w:w="810" w:type="dxa"/>
+          </w:tcPr>
+          <w:p>
+            <w:pPr>
+              <w:tabs>
+                <w:tab w:val="center" w:pos="4513"/>
+                <w:tab w:val="left" w:pos="5844"/>
+              </w:tabs>
+              <w:rPr>
+                <w:sz w:val="20"/>
+                <w:szCs w:val="20"/>
+                <w:lang w:val="en-US"/>
+              </w:rPr>
+            </w:pPr>
+            <w:r>
+              <w:rPr>
+                <w:sz w:val="20"/>
+                <w:szCs w:val="20"/>
+                <w:lang w:val="en-US"/>
+              </w:rPr>
+              <w:t>1</w:t>
+            </w:r>
+          </w:p>
+        </w:tc>
+        <w:tc>
+          <w:tcPr>
+            <w:tcW w:w="1399" w:type="dxa"/>
+          </w:tcPr>
+          <w:p>
+            <w:pPr>
+              <w:tabs>
+                <w:tab w:val="center" w:pos="4513"/>
+                <w:tab w:val="left" w:pos="5844"/>
+              </w:tabs>
+              <w:rPr>
+                <w:sz w:val="20"/>
+                <w:szCs w:val="20"/>
+                <w:lang w:val="en-US"/>
+              </w:rPr>
+            </w:pPr>
+            <w:r>
+              <w:rPr>
+                <w:sz w:val="20"/>
+                <w:szCs w:val="20"/>
+                <w:lang w:val="en-US"/>
+              </w:rPr>
+              <w:t>Demo</w:t>
+            </w:r>
+          </w:p>
+        </w:tc>
+        <w:tc>
+          <w:tcPr>
+            <w:tcW w:w="4625" w:type="dxa"/>
+          </w:tcPr>
+          <w:p>
+            <w:pPr>
+              <w:tabs>
+                <w:tab w:val="center" w:pos="4513"/>
+                <w:tab w:val="left" w:pos="5844"/>
+              </w:tabs>
+              <w:rPr>
+                <w:sz w:val="20"/>
+                <w:szCs w:val="20"/>
+                <w:lang w:val="en-US"/>
+              </w:rPr>
+            </w:pPr>
+            <w:r>
+              <w:rPr>
+                <w:sz w:val="20"/>
+                <w:szCs w:val="20"/>
+                <w:lang w:val="en-US"/>
+              </w:rPr>
+              <w:t>Demonstrated gesture recognition prototype</w:t>
+            </w:r>
+          </w:p>
+          <w:p>
+            <w:pPr>
+              <w:tabs>
+                <w:tab w:val="center" w:pos="4513"/>
+                <w:tab w:val="left" w:pos="5844"/>
+              </w:tabs>
+              <w:rPr>
+                <w:sz w:val="20"/>
+                <w:szCs w:val="20"/>
+                <w:lang w:val="en-US"/>
+              </w:rPr>
+            </w:pPr>
+            <w:r>
+              <w:rPr>
+                <w:sz w:val="20"/>
+                <w:szCs w:val="20"/>
+                <w:lang w:val="en-US"/>
+              </w:rPr>
+              <w:t>Demonstrated person identification</w:t>
+            </w:r>
           </w:p>
         </w:tc>
         <w:tc>
@@ -429,24 +479,7 @@
                 <w:tab w:val="center" w:pos="4513"/>
                 <w:tab w:val="left" w:pos="5844"/>
               </w:tabs>
-              <w:rPr>
-                <w:sz w:val="20"/>
-                <w:szCs w:val="20"/>
-                <w:lang w:val="en-US"/>
-              </w:rPr>
-            </w:pPr>
-          </w:p>
-        </w:tc>
-        <w:tc>
-          <w:tcPr>
-            <w:tcW w:w="3686" w:type="dxa"/>
-          </w:tcPr>
-          <w:p>
-            <w:pPr>
-              <w:tabs>
-                <w:tab w:val="center" w:pos="4513"/>
-                <w:tab w:val="left" w:pos="5844"/>
-              </w:tabs>
+              <w:ind w:left="360"/>
               <w:rPr>
                 <w:sz w:val="20"/>
                 <w:szCs w:val="20"/>
@@ -459,56 +492,382 @@
       <w:tr>
         <w:tc>
           <w:tcPr>
-            <w:tcW w:w="822" w:type="dxa"/>
-          </w:tcPr>
-          <w:p>
-            <w:pPr>
-              <w:tabs>
-                <w:tab w:val="center" w:pos="4513"/>
-                <w:tab w:val="left" w:pos="5844"/>
-              </w:tabs>
-              <w:rPr>
-                <w:sz w:val="20"/>
-                <w:szCs w:val="20"/>
-                <w:lang w:val="en-US"/>
-              </w:rPr>
-            </w:pPr>
-          </w:p>
-        </w:tc>
-        <w:tc>
-          <w:tcPr>
-            <w:tcW w:w="987" w:type="dxa"/>
-          </w:tcPr>
-          <w:p>
-            <w:pPr>
-              <w:tabs>
-                <w:tab w:val="center" w:pos="4513"/>
-                <w:tab w:val="left" w:pos="5844"/>
-              </w:tabs>
-              <w:rPr>
-                <w:sz w:val="20"/>
-                <w:szCs w:val="20"/>
-                <w:lang w:val="en-US"/>
-              </w:rPr>
-            </w:pPr>
-          </w:p>
-        </w:tc>
-        <w:tc>
-          <w:tcPr>
-            <w:tcW w:w="2160" w:type="dxa"/>
-          </w:tcPr>
-          <w:p>
-            <w:pPr>
-              <w:tabs>
-                <w:tab w:val="center" w:pos="4513"/>
-                <w:tab w:val="left" w:pos="5844"/>
-              </w:tabs>
-              <w:rPr>
-                <w:sz w:val="20"/>
-                <w:szCs w:val="20"/>
-                <w:lang w:val="en-US"/>
-              </w:rPr>
-            </w:pPr>
+            <w:tcW w:w="821" w:type="dxa"/>
+          </w:tcPr>
+          <w:p>
+            <w:pPr>
+              <w:tabs>
+                <w:tab w:val="center" w:pos="4513"/>
+                <w:tab w:val="left" w:pos="5844"/>
+              </w:tabs>
+              <w:rPr>
+                <w:sz w:val="20"/>
+                <w:szCs w:val="20"/>
+                <w:lang w:val="en-US"/>
+              </w:rPr>
+            </w:pPr>
+            <w:r>
+              <w:rPr>
+                <w:sz w:val="20"/>
+                <w:szCs w:val="20"/>
+                <w:lang w:val="en-US"/>
+              </w:rPr>
+              <w:t>13:00</w:t>
+            </w:r>
+          </w:p>
+        </w:tc>
+        <w:tc>
+          <w:tcPr>
+            <w:tcW w:w="810" w:type="dxa"/>
+          </w:tcPr>
+          <w:p>
+            <w:pPr>
+              <w:tabs>
+                <w:tab w:val="center" w:pos="4513"/>
+                <w:tab w:val="left" w:pos="5844"/>
+              </w:tabs>
+              <w:rPr>
+                <w:sz w:val="20"/>
+                <w:szCs w:val="20"/>
+                <w:lang w:val="en-US"/>
+              </w:rPr>
+            </w:pPr>
+            <w:r>
+              <w:rPr>
+                <w:sz w:val="20"/>
+                <w:szCs w:val="20"/>
+                <w:lang w:val="en-US"/>
+              </w:rPr>
+              <w:t>2</w:t>
+            </w:r>
+          </w:p>
+        </w:tc>
+        <w:tc>
+          <w:tcPr>
+            <w:tcW w:w="1399" w:type="dxa"/>
+          </w:tcPr>
+          <w:p>
+            <w:pPr>
+              <w:tabs>
+                <w:tab w:val="center" w:pos="4513"/>
+                <w:tab w:val="left" w:pos="5844"/>
+              </w:tabs>
+              <w:rPr>
+                <w:sz w:val="20"/>
+                <w:szCs w:val="20"/>
+                <w:lang w:val="en-US"/>
+              </w:rPr>
+            </w:pPr>
+            <w:r>
+              <w:rPr>
+                <w:sz w:val="20"/>
+                <w:szCs w:val="20"/>
+                <w:lang w:val="en-US"/>
+              </w:rPr>
+              <w:t>Feedback</w:t>
+            </w:r>
+          </w:p>
+        </w:tc>
+        <w:tc>
+          <w:tcPr>
+            <w:tcW w:w="4625" w:type="dxa"/>
+          </w:tcPr>
+          <w:p>
+            <w:pPr>
+              <w:tabs>
+                <w:tab w:val="center" w:pos="4513"/>
+                <w:tab w:val="left" w:pos="5844"/>
+              </w:tabs>
+              <w:rPr>
+                <w:sz w:val="20"/>
+                <w:szCs w:val="20"/>
+                <w:lang w:val="en-US"/>
+              </w:rPr>
+            </w:pPr>
+            <w:r>
+              <w:rPr>
+                <w:sz w:val="20"/>
+                <w:szCs w:val="20"/>
+                <w:lang w:val="en-US"/>
+              </w:rPr>
+              <w:t>Gesture recognition:</w:t>
+            </w:r>
+          </w:p>
+          <w:p>
+            <w:pPr>
+              <w:pStyle w:val="ListParagraph"/>
+              <w:numPr>
+                <w:ilvl w:val="0"/>
+                <w:numId w:val="1"/>
+              </w:numPr>
+              <w:tabs>
+                <w:tab w:val="center" w:pos="4513"/>
+                <w:tab w:val="left" w:pos="5844"/>
+              </w:tabs>
+              <w:rPr>
+                <w:sz w:val="20"/>
+                <w:szCs w:val="20"/>
+                <w:lang w:val="en-US"/>
+              </w:rPr>
+            </w:pPr>
+            <w:r>
+              <w:rPr>
+                <w:sz w:val="20"/>
+                <w:szCs w:val="20"/>
+                <w:lang w:val="en-US"/>
+              </w:rPr>
+              <w:t>Camera to recognize the gestures and translate into the three vx, vy, vr. (x, y, rotation)</w:t>
+            </w:r>
+          </w:p>
+          <w:p>
+            <w:pPr>
+              <w:pStyle w:val="ListParagraph"/>
+              <w:numPr>
+                <w:ilvl w:val="0"/>
+                <w:numId w:val="1"/>
+              </w:numPr>
+              <w:tabs>
+                <w:tab w:val="center" w:pos="4513"/>
+                <w:tab w:val="left" w:pos="5844"/>
+              </w:tabs>
+              <w:rPr>
+                <w:sz w:val="20"/>
+                <w:szCs w:val="20"/>
+                <w:lang w:val="en-US"/>
+              </w:rPr>
+            </w:pPr>
+            <w:r>
+              <w:rPr>
+                <w:sz w:val="20"/>
+                <w:szCs w:val="20"/>
+                <w:lang w:val="en-US"/>
+              </w:rPr>
+              <w:t>Instead of joystick, hands used to control robot</w:t>
+            </w:r>
+          </w:p>
+          <w:p>
+            <w:pPr>
+              <w:pStyle w:val="ListParagraph"/>
+              <w:numPr>
+                <w:ilvl w:val="0"/>
+                <w:numId w:val="1"/>
+              </w:numPr>
+              <w:tabs>
+                <w:tab w:val="center" w:pos="4513"/>
+                <w:tab w:val="left" w:pos="5844"/>
+              </w:tabs>
+              <w:rPr>
+                <w:sz w:val="20"/>
+                <w:szCs w:val="20"/>
+                <w:lang w:val="en-US"/>
+              </w:rPr>
+            </w:pPr>
+            <w:r>
+              <w:rPr>
+                <w:sz w:val="20"/>
+                <w:szCs w:val="20"/>
+                <w:lang w:val="en-US"/>
+              </w:rPr>
+              <w:t>Use AI to research how to control the simulation from the group (no elastic band) and to control the directions of movement of the simulation with hands</w:t>
+            </w:r>
+          </w:p>
+          <w:p>
+            <w:pPr>
+              <w:tabs>
+                <w:tab w:val="center" w:pos="4513"/>
+                <w:tab w:val="left" w:pos="5844"/>
+              </w:tabs>
+              <w:rPr>
+                <w:sz w:val="20"/>
+                <w:szCs w:val="20"/>
+                <w:lang w:val="en-US"/>
+              </w:rPr>
+            </w:pPr>
+          </w:p>
+          <w:p>
+            <w:pPr>
+              <w:tabs>
+                <w:tab w:val="center" w:pos="4513"/>
+                <w:tab w:val="left" w:pos="5844"/>
+              </w:tabs>
+              <w:rPr>
+                <w:sz w:val="20"/>
+                <w:szCs w:val="20"/>
+                <w:lang w:val="en-US"/>
+              </w:rPr>
+            </w:pPr>
+            <w:r>
+              <w:rPr>
+                <w:sz w:val="20"/>
+                <w:szCs w:val="20"/>
+                <w:lang w:val="en-US"/>
+              </w:rPr>
+              <w:t>Person identification:</w:t>
+            </w:r>
+          </w:p>
+          <w:p>
+            <w:pPr>
+              <w:pStyle w:val="ListParagraph"/>
+              <w:numPr>
+                <w:ilvl w:val="0"/>
+                <w:numId w:val="1"/>
+              </w:numPr>
+              <w:tabs>
+                <w:tab w:val="center" w:pos="4513"/>
+                <w:tab w:val="left" w:pos="5844"/>
+              </w:tabs>
+              <w:rPr>
+                <w:sz w:val="20"/>
+                <w:szCs w:val="20"/>
+                <w:lang w:val="en-US"/>
+              </w:rPr>
+            </w:pPr>
+            <w:r>
+              <w:rPr>
+                <w:sz w:val="20"/>
+                <w:szCs w:val="20"/>
+                <w:lang w:val="en-US"/>
+              </w:rPr>
+              <w:t>Have to retarget to the real robot / simulation, and have the robot to mimic the movement (look into Pinocchio)</w:t>
+            </w:r>
+          </w:p>
+          <w:p>
+            <w:pPr>
+              <w:pStyle w:val="ListParagraph"/>
+              <w:numPr>
+                <w:ilvl w:val="0"/>
+                <w:numId w:val="1"/>
+              </w:numPr>
+              <w:tabs>
+                <w:tab w:val="center" w:pos="4513"/>
+                <w:tab w:val="left" w:pos="5844"/>
+              </w:tabs>
+              <w:rPr>
+                <w:sz w:val="20"/>
+                <w:szCs w:val="20"/>
+                <w:lang w:val="en-US"/>
+              </w:rPr>
+            </w:pPr>
+            <w:r>
+              <w:rPr>
+                <w:sz w:val="20"/>
+                <w:szCs w:val="20"/>
+                <w:lang w:val="en-US"/>
+              </w:rPr>
+              <w:t>Up to us how we want the robot to recognize the leader (possibilities: click on, hand gesture, …)</w:t>
+            </w:r>
+          </w:p>
+          <w:p>
+            <w:pPr>
+              <w:tabs>
+                <w:tab w:val="center" w:pos="4513"/>
+                <w:tab w:val="left" w:pos="5844"/>
+              </w:tabs>
+              <w:rPr>
+                <w:sz w:val="20"/>
+                <w:szCs w:val="20"/>
+                <w:lang w:val="en-US"/>
+              </w:rPr>
+            </w:pPr>
+          </w:p>
+          <w:p>
+            <w:pPr>
+              <w:tabs>
+                <w:tab w:val="center" w:pos="4513"/>
+                <w:tab w:val="left" w:pos="5844"/>
+              </w:tabs>
+              <w:rPr>
+                <w:sz w:val="20"/>
+                <w:szCs w:val="20"/>
+                <w:lang w:val="en-US"/>
+              </w:rPr>
+            </w:pPr>
+            <w:r>
+              <w:rPr>
+                <w:sz w:val="20"/>
+                <w:szCs w:val="20"/>
+                <w:lang w:val="en-US"/>
+              </w:rPr>
+              <w:t>Need a switch to change between the two projects</w:t>
+            </w:r>
+          </w:p>
+          <w:p>
+            <w:pPr>
+              <w:pStyle w:val="ListParagraph"/>
+              <w:numPr>
+                <w:ilvl w:val="0"/>
+                <w:numId w:val="1"/>
+              </w:numPr>
+              <w:tabs>
+                <w:tab w:val="center" w:pos="4513"/>
+                <w:tab w:val="left" w:pos="5844"/>
+              </w:tabs>
+              <w:rPr>
+                <w:sz w:val="20"/>
+                <w:szCs w:val="20"/>
+                <w:lang w:val="en-US"/>
+              </w:rPr>
+            </w:pPr>
+            <w:r>
+              <w:rPr>
+                <w:sz w:val="20"/>
+                <w:szCs w:val="20"/>
+                <w:lang w:val="en-US"/>
+              </w:rPr>
+              <w:t>Can be whatever we want</w:t>
+            </w:r>
+          </w:p>
+          <w:p>
+            <w:pPr>
+              <w:pStyle w:val="ListParagraph"/>
+              <w:numPr>
+                <w:ilvl w:val="0"/>
+                <w:numId w:val="1"/>
+              </w:numPr>
+              <w:tabs>
+                <w:tab w:val="center" w:pos="4513"/>
+                <w:tab w:val="left" w:pos="5844"/>
+              </w:tabs>
+              <w:rPr>
+                <w:sz w:val="20"/>
+                <w:szCs w:val="20"/>
+                <w:lang w:val="en-US"/>
+              </w:rPr>
+            </w:pPr>
+            <w:r>
+              <w:rPr>
+                <w:sz w:val="20"/>
+                <w:szCs w:val="20"/>
+                <w:lang w:val="en-US"/>
+              </w:rPr>
+              <w:t>Best demo is to the real robot</w:t>
+            </w:r>
+          </w:p>
+          <w:p>
+            <w:pPr>
+              <w:pStyle w:val="ListParagraph"/>
+              <w:numPr>
+                <w:ilvl w:val="0"/>
+                <w:numId w:val="1"/>
+              </w:numPr>
+              <w:tabs>
+                <w:tab w:val="center" w:pos="4513"/>
+                <w:tab w:val="left" w:pos="5844"/>
+              </w:tabs>
+              <w:rPr>
+                <w:sz w:val="20"/>
+                <w:szCs w:val="20"/>
+                <w:lang w:val="en-US"/>
+              </w:rPr>
+            </w:pPr>
+            <w:r>
+              <w:rPr>
+                <w:sz w:val="20"/>
+                <w:szCs w:val="20"/>
+                <w:lang w:val="en-US"/>
+              </w:rPr>
+              <w:t>Minimum is on the simulation robot. It is hard to get consistent access to the robot.</w:t>
+            </w:r>
           </w:p>
         </w:tc>
         <w:tc>
@@ -527,80 +886,120 @@
                 <w:lang w:val="en-US"/>
               </w:rPr>
             </w:pPr>
-          </w:p>
-        </w:tc>
-        <w:tc>
-          <w:tcPr>
-            <w:tcW w:w="3686" w:type="dxa"/>
-          </w:tcPr>
-          <w:p>
-            <w:pPr>
-              <w:tabs>
-                <w:tab w:val="center" w:pos="4513"/>
-                <w:tab w:val="left" w:pos="5844"/>
-              </w:tabs>
-              <w:rPr>
-                <w:sz w:val="20"/>
-                <w:szCs w:val="20"/>
-                <w:lang w:val="en-US"/>
-              </w:rPr>
-            </w:pPr>
+            <w:r>
+              <w:rPr>
+                <w:sz w:val="20"/>
+                <w:szCs w:val="20"/>
+                <w:lang w:val="en-US"/>
+              </w:rPr>
+              <w:t>Client on leave Weeks 10, and 11, so optimally finish by Week 9.</w:t>
+            </w:r>
           </w:p>
         </w:tc>
       </w:tr>
       <w:tr>
         <w:tc>
           <w:tcPr>
-            <w:tcW w:w="822" w:type="dxa"/>
-          </w:tcPr>
-          <w:p>
-            <w:pPr>
-              <w:tabs>
-                <w:tab w:val="center" w:pos="4513"/>
-                <w:tab w:val="left" w:pos="5844"/>
-              </w:tabs>
-              <w:rPr>
-                <w:sz w:val="20"/>
-                <w:szCs w:val="20"/>
-                <w:lang w:val="en-US"/>
-              </w:rPr>
-            </w:pPr>
-          </w:p>
-        </w:tc>
-        <w:tc>
-          <w:tcPr>
-            <w:tcW w:w="987" w:type="dxa"/>
-          </w:tcPr>
-          <w:p>
-            <w:pPr>
-              <w:tabs>
-                <w:tab w:val="center" w:pos="4513"/>
-                <w:tab w:val="left" w:pos="5844"/>
-              </w:tabs>
-              <w:rPr>
-                <w:sz w:val="20"/>
-                <w:szCs w:val="20"/>
-                <w:lang w:val="en-US"/>
-              </w:rPr>
-            </w:pPr>
-          </w:p>
-        </w:tc>
-        <w:tc>
-          <w:tcPr>
-            <w:tcW w:w="2160" w:type="dxa"/>
-          </w:tcPr>
-          <w:p>
-            <w:pPr>
-              <w:tabs>
-                <w:tab w:val="center" w:pos="4513"/>
-                <w:tab w:val="left" w:pos="5844"/>
-              </w:tabs>
-              <w:rPr>
-                <w:sz w:val="20"/>
-                <w:szCs w:val="20"/>
-                <w:lang w:val="en-US"/>
-              </w:rPr>
-            </w:pPr>
+            <w:tcW w:w="821" w:type="dxa"/>
+          </w:tcPr>
+          <w:p>
+            <w:pPr>
+              <w:tabs>
+                <w:tab w:val="center" w:pos="4513"/>
+                <w:tab w:val="left" w:pos="5844"/>
+              </w:tabs>
+              <w:rPr>
+                <w:sz w:val="20"/>
+                <w:szCs w:val="20"/>
+                <w:lang w:val="en-US"/>
+              </w:rPr>
+            </w:pPr>
+            <w:r>
+              <w:rPr>
+                <w:sz w:val="20"/>
+                <w:szCs w:val="20"/>
+                <w:lang w:val="en-US"/>
+              </w:rPr>
+              <w:t>13:25</w:t>
+            </w:r>
+          </w:p>
+        </w:tc>
+        <w:tc>
+          <w:tcPr>
+            <w:tcW w:w="810" w:type="dxa"/>
+          </w:tcPr>
+          <w:p>
+            <w:pPr>
+              <w:tabs>
+                <w:tab w:val="center" w:pos="4513"/>
+                <w:tab w:val="left" w:pos="5844"/>
+              </w:tabs>
+              <w:rPr>
+                <w:sz w:val="20"/>
+                <w:szCs w:val="20"/>
+                <w:lang w:val="en-US"/>
+              </w:rPr>
+            </w:pPr>
+            <w:r>
+              <w:rPr>
+                <w:sz w:val="20"/>
+                <w:szCs w:val="20"/>
+                <w:lang w:val="en-US"/>
+              </w:rPr>
+              <w:t>5</w:t>
+            </w:r>
+          </w:p>
+        </w:tc>
+        <w:tc>
+          <w:tcPr>
+            <w:tcW w:w="1399" w:type="dxa"/>
+          </w:tcPr>
+          <w:p>
+            <w:pPr>
+              <w:tabs>
+                <w:tab w:val="center" w:pos="4513"/>
+                <w:tab w:val="left" w:pos="5844"/>
+              </w:tabs>
+              <w:rPr>
+                <w:sz w:val="20"/>
+                <w:szCs w:val="20"/>
+                <w:lang w:val="en-US"/>
+              </w:rPr>
+            </w:pPr>
+            <w:r>
+              <w:rPr>
+                <w:sz w:val="20"/>
+                <w:szCs w:val="20"/>
+                <w:lang w:val="en-US"/>
+              </w:rPr>
+              <w:t>Next meeting</w:t>
+            </w:r>
+          </w:p>
+        </w:tc>
+        <w:tc>
+          <w:tcPr>
+            <w:tcW w:w="4625" w:type="dxa"/>
+          </w:tcPr>
+          <w:p>
+            <w:pPr>
+              <w:tabs>
+                <w:tab w:val="center" w:pos="4513"/>
+                <w:tab w:val="left" w:pos="5844"/>
+              </w:tabs>
+              <w:rPr>
+                <w:sz w:val="20"/>
+                <w:szCs w:val="20"/>
+                <w:lang w:val="en-US"/>
+              </w:rPr>
+            </w:pPr>
+            <w:r>
+              <w:rPr>
+                <w:sz w:val="20"/>
+                <w:szCs w:val="20"/>
+                <w:lang w:val="en-US"/>
+              </w:rPr>
+              <w:t>Week 9, Wednesday, last meeting before week 12.</w:t>
+            </w:r>
           </w:p>
         </w:tc>
         <w:tc>
@@ -619,11 +1018,117 @@
                 <w:lang w:val="en-US"/>
               </w:rPr>
             </w:pPr>
-          </w:p>
-        </w:tc>
-        <w:tc>
-          <w:tcPr>
-            <w:tcW w:w="3686" w:type="dxa"/>
+            <w:r>
+              <w:rPr>
+                <w:sz w:val="20"/>
+                <w:szCs w:val="20"/>
+                <w:lang w:val="en-US"/>
+              </w:rPr>
+              <w:t xml:space="preserve">Video for proof of the project working </w:t>
+            </w:r>
+          </w:p>
+        </w:tc>
+      </w:tr>
+      <w:tr>
+        <w:tc>
+          <w:tcPr>
+            <w:tcW w:w="821" w:type="dxa"/>
+          </w:tcPr>
+          <w:p>
+            <w:pPr>
+              <w:tabs>
+                <w:tab w:val="center" w:pos="4513"/>
+                <w:tab w:val="left" w:pos="5844"/>
+              </w:tabs>
+              <w:rPr>
+                <w:sz w:val="20"/>
+                <w:szCs w:val="20"/>
+                <w:lang w:val="en-US"/>
+              </w:rPr>
+            </w:pPr>
+            <w:r>
+              <w:rPr>
+                <w:sz w:val="20"/>
+                <w:szCs w:val="20"/>
+                <w:lang w:val="en-US"/>
+              </w:rPr>
+              <w:t>14:00</w:t>
+            </w:r>
+          </w:p>
+        </w:tc>
+        <w:tc>
+          <w:tcPr>
+            <w:tcW w:w="810" w:type="dxa"/>
+          </w:tcPr>
+          <w:p>
+            <w:pPr>
+              <w:tabs>
+                <w:tab w:val="center" w:pos="4513"/>
+                <w:tab w:val="left" w:pos="5844"/>
+              </w:tabs>
+              <w:rPr>
+                <w:sz w:val="20"/>
+                <w:szCs w:val="20"/>
+                <w:lang w:val="en-US"/>
+              </w:rPr>
+            </w:pPr>
+            <w:r>
+              <w:rPr>
+                <w:sz w:val="20"/>
+                <w:szCs w:val="20"/>
+                <w:lang w:val="en-US"/>
+              </w:rPr>
+              <w:t>6</w:t>
+            </w:r>
+          </w:p>
+        </w:tc>
+        <w:tc>
+          <w:tcPr>
+            <w:tcW w:w="1399" w:type="dxa"/>
+          </w:tcPr>
+          <w:p>
+            <w:pPr>
+              <w:tabs>
+                <w:tab w:val="center" w:pos="4513"/>
+                <w:tab w:val="left" w:pos="5844"/>
+              </w:tabs>
+              <w:rPr>
+                <w:sz w:val="20"/>
+                <w:szCs w:val="20"/>
+                <w:lang w:val="en-US"/>
+              </w:rPr>
+            </w:pPr>
+            <w:r>
+              <w:rPr>
+                <w:sz w:val="20"/>
+                <w:szCs w:val="20"/>
+                <w:lang w:val="en-US"/>
+              </w:rPr>
+              <w:t>Meeting end</w:t>
+            </w:r>
+          </w:p>
+        </w:tc>
+        <w:tc>
+          <w:tcPr>
+            <w:tcW w:w="4625" w:type="dxa"/>
+          </w:tcPr>
+          <w:p>
+            <w:pPr>
+              <w:tabs>
+                <w:tab w:val="center" w:pos="4513"/>
+                <w:tab w:val="left" w:pos="5844"/>
+              </w:tabs>
+              <w:rPr>
+                <w:sz w:val="20"/>
+                <w:szCs w:val="20"/>
+                <w:lang w:val="en-US"/>
+              </w:rPr>
+            </w:pPr>
+          </w:p>
+        </w:tc>
+        <w:tc>
+          <w:tcPr>
+            <w:tcW w:w="3969" w:type="dxa"/>
           </w:tcPr>
           <w:p>
             <w:pPr>
@@ -656,19 +1161,6 @@
     </w:p>
     <w:p>
       <w:pPr>
-        <w:tabs>
-          <w:tab w:val="center" w:pos="4513"/>
-          <w:tab w:val="left" w:pos="5844"/>
-        </w:tabs>
-        <w:rPr>
-          <w:sz w:val="32"/>
-          <w:szCs w:val="32"/>
-          <w:lang w:val="en-US"/>
-        </w:rPr>
-      </w:pPr>
-    </w:p>
-    <w:p>
-      <w:pPr>
         <w:rPr>
           <w:sz w:val="32"/>
           <w:szCs w:val="32"/>
@@ -691,6 +1183,8 @@
           <w:tab w:val="left" w:pos="5844"/>
         </w:tabs>
         <w:rPr>
+          <w:b/>
+          <w:bCs/>
           <w:sz w:val="32"/>
           <w:szCs w:val="32"/>
           <w:lang w:val="en-US"/>
@@ -698,6 +1192,8 @@
       </w:pPr>
       <w:r>
         <w:rPr>
+          <w:b/>
+          <w:bCs/>
           <w:sz w:val="32"/>
           <w:szCs w:val="32"/>
           <w:lang w:val="en-US"/>
@@ -940,35 +1436,7 @@
               <w:rPr>
                 <w:lang w:val="en-US"/>
               </w:rPr>
-              <w:t xml:space="preserve">Person detection is implemented using </w:t>
-            </w:r>
-            <w:proofErr w:type="spellStart"/>
-            <w:r>
-              <w:rPr>
-                <w:lang w:val="en-US"/>
-              </w:rPr>
-              <w:t>MediaPipe</w:t>
-            </w:r>
-            <w:proofErr w:type="spellEnd"/>
-            <w:r>
-              <w:rPr>
-                <w:lang w:val="en-US"/>
-              </w:rPr>
-              <w:t xml:space="preserve"> Pose </w:t>
-            </w:r>
-            <w:proofErr w:type="spellStart"/>
-            <w:r>
-              <w:rPr>
-                <w:lang w:val="en-US"/>
-              </w:rPr>
-              <w:t>Landmarker</w:t>
-            </w:r>
-            <w:proofErr w:type="spellEnd"/>
-            <w:r>
-              <w:rPr>
-                <w:lang w:val="en-US"/>
-              </w:rPr>
-              <w:t>.</w:t>
+              <w:t>Person detection is implemented using MediaPipe Pose Landmarker.</w:t>
             </w:r>
           </w:p>
         </w:tc>
@@ -1214,21 +1682,7 @@
               <w:rPr>
                 <w:lang w:val="en-US"/>
               </w:rPr>
-              <w:t xml:space="preserve">The system extracts the selected leader’s </w:t>
-            </w:r>
-            <w:proofErr w:type="spellStart"/>
-            <w:r>
-              <w:rPr>
-                <w:lang w:val="en-US"/>
-              </w:rPr>
-              <w:t>MediaPipe</w:t>
-            </w:r>
-            <w:proofErr w:type="spellEnd"/>
-            <w:r>
-              <w:rPr>
-                <w:lang w:val="en-US"/>
-              </w:rPr>
-              <w:t xml:space="preserve"> pose world landmarks in 3D and can export them per frame with frame ID, timestamp, leader ID and bounding box.</w:t>
+              <w:t>The system extracts the selected leader’s MediaPipe pose world landmarks in 3D and can export them per frame with frame ID, timestamp, leader ID and bounding box.</w:t>
             </w:r>
           </w:p>
         </w:tc>
@@ -1289,6 +1743,43 @@
                 <w:lang w:val="en-US"/>
               </w:rPr>
             </w:pPr>
+            <w:r>
+              <w:rPr>
+                <w:b/>
+                <w:bCs/>
+                <w:lang w:val="en-US"/>
+              </w:rPr>
+              <w:t>COMPLETED/MODIFIED</w:t>
+            </w:r>
+          </w:p>
+          <w:p>
+            <w:pPr>
+              <w:tabs>
+                <w:tab w:val="center" w:pos="4513"/>
+                <w:tab w:val="left" w:pos="5844"/>
+              </w:tabs>
+              <w:rPr>
+                <w:lang w:val="en-US"/>
+              </w:rPr>
+            </w:pPr>
+            <w:r>
+              <w:rPr>
+                <w:lang w:val="en-US"/>
+              </w:rPr>
+              <w:t xml:space="preserve">The system detects different people’s </w:t>
+            </w:r>
+            <w:r>
+              <w:rPr>
+                <w:lang w:val="en-US"/>
+              </w:rPr>
+              <w:t>postures The system has been designed to lock onto a single person. That person</w:t>
+            </w:r>
+            <w:r>
+              <w:rPr>
+                <w:lang w:val="en-US"/>
+              </w:rPr>
+              <w:t>’s postures and gestures will be noted.</w:t>
+            </w:r>
           </w:p>
         </w:tc>
       </w:tr>
@@ -1530,15 +2021,7 @@
               </w:rPr>
             </w:pPr>
             <w:r>
-              <w:t xml:space="preserve">Implemented using </w:t>
-            </w:r>
-            <w:proofErr w:type="spellStart"/>
-            <w:r>
-              <w:t>MediaPipe's</w:t>
-            </w:r>
-            <w:proofErr w:type="spellEnd"/>
-            <w:r>
-              <w:t xml:space="preserve"> hand landmark model. Gestures are recorded by taking 20 samples of each gesture from a live camera feed. The landmark model assigns 21 points to the hand and records the 3D location of each point; these are flattened into a single 63-item array and stored.</w:t>
+              <w:t>Implemented using MediaPipe's hand landmark model. Gestures are recorded by taking 20 samples of each gesture from a live camera feed. The landmark model assigns 21 points to the hand and records the 3D location of each point; these are flattened into a single 63-item array and stored.</w:t>
             </w:r>
           </w:p>
         </w:tc>
@@ -1654,6 +2137,7 @@
               <w:rPr>
                 <w:lang w:val="en-US"/>
               </w:rPr>
+              <w:lastRenderedPageBreak/>
               <w:t>2.3</w:t>
             </w:r>
           </w:p>
@@ -1673,11 +2157,7 @@
               </w:rPr>
             </w:pPr>
             <w:r>
-              <w:t xml:space="preserve">As a developer, I want recognised gestures to be displayed with their frame number so </w:t>
-            </w:r>
-            <w:r>
-              <w:lastRenderedPageBreak/>
-              <w:t>that I can check whether gestures are being recognised correctly.</w:t>
+              <w:t>As a developer, I want recognised gestures to be displayed with their frame number so that I can check whether gestures are being recognised correctly.</w:t>
             </w:r>
           </w:p>
         </w:tc>
@@ -1701,7 +2181,6 @@
                 <w:bCs/>
                 <w:lang w:val="en-US"/>
               </w:rPr>
-              <w:lastRenderedPageBreak/>
               <w:t>COMPLETED</w:t>
             </w:r>
           </w:p>
@@ -1727,7 +2206,6 @@
               </w:rPr>
             </w:pPr>
             <w:r>
-              <w:lastRenderedPageBreak/>
               <w:t>Output goes to the terminal. On every gesture change, the program prints the recognised gesture, the calculated best distance (used to determine whether it falls under the threshold), and the number of milliseconds elapsed since the program started.</w:t>
             </w:r>
           </w:p>
@@ -1752,7 +2230,6 @@
               <w:rPr>
                 <w:lang w:val="en-US"/>
               </w:rPr>
-              <w:lastRenderedPageBreak/>
               <w:t>2.4</w:t>
             </w:r>
           </w:p>
@@ -1953,6 +2430,67 @@
                 <w:lang w:val="en-US"/>
               </w:rPr>
             </w:pPr>
+            <w:r>
+              <w:rPr>
+                <w:b/>
+                <w:bCs/>
+                <w:lang w:val="en-US"/>
+              </w:rPr>
+              <w:t>IN PROGRESS</w:t>
+            </w:r>
+          </w:p>
+          <w:p>
+            <w:pPr>
+              <w:tabs>
+                <w:tab w:val="center" w:pos="4513"/>
+                <w:tab w:val="left" w:pos="5844"/>
+              </w:tabs>
+              <w:rPr>
+                <w:lang w:val="en-US"/>
+              </w:rPr>
+            </w:pPr>
+            <w:r>
+              <w:rPr>
+                <w:lang w:val="en-US"/>
+              </w:rPr>
+              <w:t>People’s</w:t>
+            </w:r>
+            <w:r>
+              <w:rPr>
+                <w:lang w:val="en-US"/>
+              </w:rPr>
+              <w:t xml:space="preserve"> posture</w:t>
+            </w:r>
+            <w:r>
+              <w:rPr>
+                <w:lang w:val="en-US"/>
+              </w:rPr>
+              <w:t xml:space="preserve"> information</w:t>
+            </w:r>
+            <w:r>
+              <w:rPr>
+                <w:lang w:val="en-US"/>
+              </w:rPr>
+              <w:t xml:space="preserve"> gets </w:t>
+            </w:r>
+            <w:r>
+              <w:rPr>
+                <w:lang w:val="en-US"/>
+              </w:rPr>
+              <w:t>output</w:t>
+            </w:r>
+            <w:r>
+              <w:rPr>
+                <w:lang w:val="en-US"/>
+              </w:rPr>
+              <w:t>/registered</w:t>
+            </w:r>
+            <w:r>
+              <w:rPr>
+                <w:lang w:val="en-US"/>
+              </w:rPr>
+              <w:t>.</w:t>
+            </w:r>
           </w:p>
         </w:tc>
       </w:tr>
@@ -2012,6 +2550,54 @@
                 <w:lang w:val="en-US"/>
               </w:rPr>
             </w:pPr>
+            <w:r>
+              <w:rPr>
+                <w:b/>
+                <w:bCs/>
+                <w:lang w:val="en-US"/>
+              </w:rPr>
+              <w:t>NOT STARTED</w:t>
+            </w:r>
+          </w:p>
+          <w:p>
+            <w:pPr>
+              <w:tabs>
+                <w:tab w:val="center" w:pos="4513"/>
+                <w:tab w:val="left" w:pos="5844"/>
+              </w:tabs>
+              <w:rPr>
+                <w:lang w:val="en-US"/>
+              </w:rPr>
+            </w:pPr>
+            <w:r>
+              <w:rPr>
+                <w:lang w:val="en-US"/>
+              </w:rPr>
+              <w:t xml:space="preserve">Next </w:t>
+            </w:r>
+            <w:r>
+              <w:rPr>
+                <w:lang w:val="en-US"/>
+              </w:rPr>
+              <w:t>task</w:t>
+            </w:r>
+            <w:r>
+              <w:rPr>
+                <w:lang w:val="en-US"/>
+              </w:rPr>
+              <w:t>. Posture needs to be mapped onto the robot.</w:t>
+            </w:r>
+          </w:p>
+          <w:p>
+            <w:pPr>
+              <w:tabs>
+                <w:tab w:val="center" w:pos="4513"/>
+                <w:tab w:val="left" w:pos="5844"/>
+              </w:tabs>
+              <w:rPr>
+                <w:lang w:val="en-US"/>
+              </w:rPr>
+            </w:pPr>
           </w:p>
         </w:tc>
       </w:tr>
@@ -2071,6 +2657,42 @@
                 <w:lang w:val="en-US"/>
               </w:rPr>
             </w:pPr>
+            <w:r>
+              <w:rPr>
+                <w:b/>
+                <w:bCs/>
+                <w:lang w:val="en-US"/>
+              </w:rPr>
+              <w:t>IN PROGRESS</w:t>
+            </w:r>
+          </w:p>
+          <w:p>
+            <w:pPr>
+              <w:tabs>
+                <w:tab w:val="center" w:pos="4513"/>
+                <w:tab w:val="left" w:pos="5844"/>
+              </w:tabs>
+              <w:rPr>
+                <w:lang w:val="en-US"/>
+              </w:rPr>
+            </w:pPr>
+            <w:r>
+              <w:rPr>
+                <w:lang w:val="en-US"/>
+              </w:rPr>
+              <w:t>Next task. Posture needs to be mapped onto the robot.</w:t>
+            </w:r>
+          </w:p>
+          <w:p>
+            <w:pPr>
+              <w:tabs>
+                <w:tab w:val="center" w:pos="4513"/>
+                <w:tab w:val="left" w:pos="5844"/>
+              </w:tabs>
+              <w:rPr>
+                <w:lang w:val="en-US"/>
+              </w:rPr>
+            </w:pPr>
           </w:p>
         </w:tc>
       </w:tr>
@@ -2195,6 +2817,37 @@
                 <w:lang w:val="en-US"/>
               </w:rPr>
             </w:pPr>
+            <w:r>
+              <w:rPr>
+                <w:b/>
+                <w:bCs/>
+                <w:lang w:val="en-US"/>
+              </w:rPr>
+              <w:t>NOT STARTED</w:t>
+            </w:r>
+          </w:p>
+          <w:p>
+            <w:pPr>
+              <w:tabs>
+                <w:tab w:val="center" w:pos="4513"/>
+                <w:tab w:val="left" w:pos="5844"/>
+              </w:tabs>
+              <w:rPr>
+                <w:lang w:val="en-US"/>
+              </w:rPr>
+            </w:pPr>
+            <w:r>
+              <w:rPr>
+                <w:lang w:val="en-US"/>
+              </w:rPr>
+              <w:t>Less important, to be implemented later</w:t>
+            </w:r>
+            <w:r>
+              <w:rPr>
+                <w:lang w:val="en-US"/>
+              </w:rPr>
+              <w:t xml:space="preserve"> and/or discarded. This functionality is already covered in other aspects of the project</w:t>
+            </w:r>
           </w:p>
         </w:tc>
       </w:tr>
@@ -2254,306 +2907,55 @@
                 <w:lang w:val="en-US"/>
               </w:rPr>
             </w:pPr>
-          </w:p>
-        </w:tc>
-      </w:tr>
-      <w:tr>
-        <w:tc>
-          <w:tcPr>
-            <w:tcW w:w="562" w:type="dxa"/>
-          </w:tcPr>
-          <w:p>
-            <w:pPr>
-              <w:tabs>
-                <w:tab w:val="center" w:pos="4513"/>
-                <w:tab w:val="left" w:pos="5844"/>
-              </w:tabs>
-              <w:rPr>
-                <w:lang w:val="en-US"/>
-              </w:rPr>
-            </w:pPr>
-          </w:p>
-        </w:tc>
-        <w:tc>
-          <w:tcPr>
-            <w:tcW w:w="4719" w:type="dxa"/>
-          </w:tcPr>
-          <w:p>
-            <w:pPr>
-              <w:tabs>
-                <w:tab w:val="center" w:pos="4513"/>
-                <w:tab w:val="left" w:pos="5844"/>
-              </w:tabs>
-              <w:rPr>
-                <w:lang w:val="en-US"/>
-              </w:rPr>
-            </w:pPr>
-          </w:p>
-        </w:tc>
-        <w:tc>
-          <w:tcPr>
-            <w:tcW w:w="5175" w:type="dxa"/>
-          </w:tcPr>
-          <w:p>
-            <w:pPr>
-              <w:tabs>
-                <w:tab w:val="center" w:pos="4513"/>
-                <w:tab w:val="left" w:pos="5844"/>
-              </w:tabs>
-              <w:rPr>
-                <w:lang w:val="en-US"/>
-              </w:rPr>
-            </w:pPr>
-          </w:p>
-        </w:tc>
-      </w:tr>
-      <w:tr>
-        <w:tc>
-          <w:tcPr>
-            <w:tcW w:w="562" w:type="dxa"/>
-          </w:tcPr>
-          <w:p>
-            <w:pPr>
-              <w:tabs>
-                <w:tab w:val="center" w:pos="4513"/>
-                <w:tab w:val="left" w:pos="5844"/>
-              </w:tabs>
-              <w:rPr>
-                <w:lang w:val="en-US"/>
-              </w:rPr>
-            </w:pPr>
-          </w:p>
-        </w:tc>
-        <w:tc>
-          <w:tcPr>
-            <w:tcW w:w="4719" w:type="dxa"/>
-          </w:tcPr>
-          <w:p>
-            <w:pPr>
-              <w:tabs>
-                <w:tab w:val="center" w:pos="4513"/>
-                <w:tab w:val="left" w:pos="5844"/>
-              </w:tabs>
-              <w:rPr>
-                <w:lang w:val="en-US"/>
-              </w:rPr>
-            </w:pPr>
-          </w:p>
-        </w:tc>
-        <w:tc>
-          <w:tcPr>
-            <w:tcW w:w="5175" w:type="dxa"/>
-          </w:tcPr>
-          <w:p>
-            <w:pPr>
-              <w:tabs>
-                <w:tab w:val="center" w:pos="4513"/>
-                <w:tab w:val="left" w:pos="5844"/>
-              </w:tabs>
-              <w:rPr>
-                <w:lang w:val="en-US"/>
-              </w:rPr>
-            </w:pPr>
-          </w:p>
-        </w:tc>
-      </w:tr>
-      <w:tr>
-        <w:tc>
-          <w:tcPr>
-            <w:tcW w:w="562" w:type="dxa"/>
-          </w:tcPr>
-          <w:p>
-            <w:pPr>
-              <w:tabs>
-                <w:tab w:val="center" w:pos="4513"/>
-                <w:tab w:val="left" w:pos="5844"/>
-              </w:tabs>
-              <w:rPr>
-                <w:lang w:val="en-US"/>
-              </w:rPr>
-            </w:pPr>
-          </w:p>
-        </w:tc>
-        <w:tc>
-          <w:tcPr>
-            <w:tcW w:w="4719" w:type="dxa"/>
-          </w:tcPr>
-          <w:p>
-            <w:pPr>
-              <w:tabs>
-                <w:tab w:val="center" w:pos="4513"/>
-                <w:tab w:val="left" w:pos="5844"/>
-              </w:tabs>
-              <w:rPr>
-                <w:lang w:val="en-US"/>
-              </w:rPr>
-            </w:pPr>
-          </w:p>
-        </w:tc>
-        <w:tc>
-          <w:tcPr>
-            <w:tcW w:w="5175" w:type="dxa"/>
-          </w:tcPr>
-          <w:p>
-            <w:pPr>
-              <w:tabs>
-                <w:tab w:val="center" w:pos="4513"/>
-                <w:tab w:val="left" w:pos="5844"/>
-              </w:tabs>
-              <w:rPr>
-                <w:lang w:val="en-US"/>
-              </w:rPr>
-            </w:pPr>
-          </w:p>
-        </w:tc>
-      </w:tr>
-      <w:tr>
-        <w:tc>
-          <w:tcPr>
-            <w:tcW w:w="562" w:type="dxa"/>
-          </w:tcPr>
-          <w:p>
-            <w:pPr>
-              <w:tabs>
-                <w:tab w:val="center" w:pos="4513"/>
-                <w:tab w:val="left" w:pos="5844"/>
-              </w:tabs>
-              <w:rPr>
-                <w:lang w:val="en-US"/>
-              </w:rPr>
-            </w:pPr>
-          </w:p>
-        </w:tc>
-        <w:tc>
-          <w:tcPr>
-            <w:tcW w:w="4719" w:type="dxa"/>
-          </w:tcPr>
-          <w:p>
-            <w:pPr>
-              <w:tabs>
-                <w:tab w:val="center" w:pos="4513"/>
-                <w:tab w:val="left" w:pos="5844"/>
-              </w:tabs>
-              <w:rPr>
-                <w:lang w:val="en-US"/>
-              </w:rPr>
-            </w:pPr>
-          </w:p>
-        </w:tc>
-        <w:tc>
-          <w:tcPr>
-            <w:tcW w:w="5175" w:type="dxa"/>
-          </w:tcPr>
-          <w:p>
-            <w:pPr>
-              <w:tabs>
-                <w:tab w:val="center" w:pos="4513"/>
-                <w:tab w:val="left" w:pos="5844"/>
-              </w:tabs>
-              <w:rPr>
-                <w:lang w:val="en-US"/>
-              </w:rPr>
-            </w:pPr>
-          </w:p>
-        </w:tc>
-      </w:tr>
-      <w:tr>
-        <w:tc>
-          <w:tcPr>
-            <w:tcW w:w="562" w:type="dxa"/>
-          </w:tcPr>
-          <w:p>
-            <w:pPr>
-              <w:tabs>
-                <w:tab w:val="center" w:pos="4513"/>
-                <w:tab w:val="left" w:pos="5844"/>
-              </w:tabs>
-              <w:rPr>
-                <w:lang w:val="en-US"/>
-              </w:rPr>
-            </w:pPr>
-          </w:p>
-        </w:tc>
-        <w:tc>
-          <w:tcPr>
-            <w:tcW w:w="4719" w:type="dxa"/>
-          </w:tcPr>
-          <w:p>
-            <w:pPr>
-              <w:tabs>
-                <w:tab w:val="center" w:pos="4513"/>
-                <w:tab w:val="left" w:pos="5844"/>
-              </w:tabs>
-              <w:rPr>
-                <w:lang w:val="en-US"/>
-              </w:rPr>
-            </w:pPr>
-          </w:p>
-        </w:tc>
-        <w:tc>
-          <w:tcPr>
-            <w:tcW w:w="5175" w:type="dxa"/>
-          </w:tcPr>
-          <w:p>
-            <w:pPr>
-              <w:tabs>
-                <w:tab w:val="center" w:pos="4513"/>
-                <w:tab w:val="left" w:pos="5844"/>
-              </w:tabs>
-              <w:rPr>
-                <w:lang w:val="en-US"/>
-              </w:rPr>
-            </w:pPr>
-          </w:p>
-        </w:tc>
-      </w:tr>
-      <w:tr>
-        <w:tc>
-          <w:tcPr>
-            <w:tcW w:w="562" w:type="dxa"/>
-          </w:tcPr>
-          <w:p>
-            <w:pPr>
-              <w:tabs>
-                <w:tab w:val="center" w:pos="4513"/>
-                <w:tab w:val="left" w:pos="5844"/>
-              </w:tabs>
-              <w:rPr>
-                <w:lang w:val="en-US"/>
-              </w:rPr>
-            </w:pPr>
-          </w:p>
-        </w:tc>
-        <w:tc>
-          <w:tcPr>
-            <w:tcW w:w="4719" w:type="dxa"/>
-          </w:tcPr>
-          <w:p>
-            <w:pPr>
-              <w:tabs>
-                <w:tab w:val="center" w:pos="4513"/>
-                <w:tab w:val="left" w:pos="5844"/>
-              </w:tabs>
-              <w:rPr>
-                <w:lang w:val="en-US"/>
-              </w:rPr>
-            </w:pPr>
-          </w:p>
-        </w:tc>
-        <w:tc>
-          <w:tcPr>
-            <w:tcW w:w="5175" w:type="dxa"/>
-          </w:tcPr>
-          <w:p>
-            <w:pPr>
-              <w:tabs>
-                <w:tab w:val="center" w:pos="4513"/>
-                <w:tab w:val="left" w:pos="5844"/>
-              </w:tabs>
-              <w:rPr>
-                <w:lang w:val="en-US"/>
-              </w:rPr>
-            </w:pPr>
+            <w:r>
+              <w:rPr>
+                <w:b/>
+                <w:bCs/>
+                <w:lang w:val="en-US"/>
+              </w:rPr>
+              <w:t>NOT STARTED</w:t>
+            </w:r>
+          </w:p>
+          <w:p>
+            <w:pPr>
+              <w:tabs>
+                <w:tab w:val="center" w:pos="4513"/>
+                <w:tab w:val="left" w:pos="5844"/>
+              </w:tabs>
+              <w:rPr>
+                <w:lang w:val="en-US"/>
+              </w:rPr>
+            </w:pPr>
+            <w:r>
+              <w:rPr>
+                <w:lang w:val="en-US"/>
+              </w:rPr>
+              <w:t>Less important, to be implemented later</w:t>
+            </w:r>
+            <w:r>
+              <w:rPr>
+                <w:lang w:val="en-US"/>
+              </w:rPr>
+              <w:t xml:space="preserve"> and/or discarded</w:t>
+            </w:r>
+            <w:r>
+              <w:rPr>
+                <w:lang w:val="en-US"/>
+              </w:rPr>
+              <w:t>. This</w:t>
+            </w:r>
+            <w:r>
+              <w:rPr>
+                <w:lang w:val="en-US"/>
+              </w:rPr>
+              <w:t xml:space="preserve"> functionality is already covered in other aspects</w:t>
+            </w:r>
+            <w:r>
+              <w:rPr>
+                <w:lang w:val="en-US"/>
+              </w:rPr>
+              <w:t xml:space="preserve"> of the project</w:t>
+            </w:r>
           </w:p>
         </w:tc>
       </w:tr>
@@ -2618,6 +3020,663 @@
           <w:lang w:val="en-US"/>
         </w:rPr>
       </w:pPr>
+      <w:r>
+        <w:rPr>
+          <w:lang w:val="en-US"/>
+        </w:rPr>
+        <w:br/>
+      </w:r>
+      <w:r>
+        <w:rPr>
+          <w:lang w:val="en-US"/>
+        </w:rPr>
+        <w:br/>
+      </w:r>
+      <w:r>
+        <w:rPr>
+          <w:lang w:val="en-US"/>
+        </w:rPr>
+        <w:br/>
+      </w:r>
+      <w:r>
+        <w:rPr>
+          <w:lang w:val="en-US"/>
+        </w:rPr>
+        <w:br/>
+      </w:r>
+      <w:r>
+        <w:rPr>
+          <w:lang w:val="en-US"/>
+        </w:rPr>
+        <w:br/>
+      </w:r>
+    </w:p>
+    <w:p>
+      <w:pPr>
+        <w:tabs>
+          <w:tab w:val="center" w:pos="4513"/>
+          <w:tab w:val="left" w:pos="5844"/>
+        </w:tabs>
+        <w:rPr>
+          <w:b/>
+          <w:bCs/>
+          <w:sz w:val="32"/>
+          <w:szCs w:val="32"/>
+          <w:lang w:val="en-US"/>
+        </w:rPr>
+      </w:pPr>
+    </w:p>
+    <w:p>
+      <w:pPr>
+        <w:tabs>
+          <w:tab w:val="center" w:pos="4513"/>
+          <w:tab w:val="left" w:pos="5844"/>
+        </w:tabs>
+        <w:rPr>
+          <w:b/>
+          <w:bCs/>
+          <w:sz w:val="28"/>
+          <w:szCs w:val="28"/>
+          <w:lang w:val="en-US"/>
+        </w:rPr>
+      </w:pPr>
+      <w:r>
+        <w:rPr>
+          <w:b/>
+          <w:bCs/>
+          <w:sz w:val="28"/>
+          <w:szCs w:val="28"/>
+          <w:lang w:val="en-US"/>
+        </w:rPr>
+        <w:lastRenderedPageBreak/>
+        <w:t>Expected vs Actual:</w:t>
+      </w:r>
+    </w:p>
+    <w:p>
+      <w:pPr>
+        <w:pStyle w:val="ListParagraph"/>
+        <w:numPr>
+          <w:ilvl w:val="0"/>
+          <w:numId w:val="1"/>
+        </w:numPr>
+        <w:tabs>
+          <w:tab w:val="center" w:pos="4513"/>
+          <w:tab w:val="left" w:pos="5844"/>
+        </w:tabs>
+        <w:rPr>
+          <w:lang w:val="en-US"/>
+        </w:rPr>
+      </w:pPr>
+      <w:r>
+        <w:rPr>
+          <w:lang w:val="en-US"/>
+        </w:rPr>
+        <w:t>Hours logged</w:t>
+      </w:r>
+      <w:r>
+        <w:rPr>
+          <w:lang w:val="en-US"/>
+        </w:rPr>
+        <w:t xml:space="preserve"> by week 8 is 173.66h. comfortably inside the 360h</w:t>
+      </w:r>
+      <w:r>
+        <w:rPr>
+          <w:lang w:val="en-US"/>
+        </w:rPr>
+        <w:t xml:space="preserve"> budget placed at the start of the semester.</w:t>
+      </w:r>
+    </w:p>
+    <w:p>
+      <w:pPr>
+        <w:pStyle w:val="ListParagraph"/>
+        <w:numPr>
+          <w:ilvl w:val="0"/>
+          <w:numId w:val="1"/>
+        </w:numPr>
+        <w:tabs>
+          <w:tab w:val="center" w:pos="4513"/>
+          <w:tab w:val="left" w:pos="5844"/>
+        </w:tabs>
+        <w:rPr>
+          <w:lang w:val="en-US"/>
+        </w:rPr>
+      </w:pPr>
+      <w:r>
+        <w:rPr>
+          <w:lang w:val="en-US"/>
+        </w:rPr>
+        <w:t xml:space="preserve">The </w:t>
+      </w:r>
+      <w:r>
+        <w:rPr>
+          <w:lang w:val="en-US"/>
+        </w:rPr>
+        <w:t>Gesture Recognition</w:t>
+      </w:r>
+      <w:r>
+        <w:rPr>
+          <w:lang w:val="en-US"/>
+        </w:rPr>
+        <w:t xml:space="preserve"> </w:t>
+      </w:r>
+      <w:r>
+        <w:rPr>
+          <w:lang w:val="en-US"/>
+        </w:rPr>
+        <w:t>has had overwhelmingly more effort (coding and testing)</w:t>
+      </w:r>
+      <w:r>
+        <w:rPr>
+          <w:lang w:val="en-US"/>
+        </w:rPr>
+        <w:t xml:space="preserve"> put into it than the person tracking</w:t>
+      </w:r>
+      <w:r>
+        <w:rPr>
+          <w:lang w:val="en-US"/>
+        </w:rPr>
+        <w:t xml:space="preserve"> in terms of hours. This is </w:t>
+      </w:r>
+      <w:r>
+        <w:rPr>
+          <w:lang w:val="en-US"/>
+        </w:rPr>
+        <w:t xml:space="preserve">consistent with the Gesture Recognition program </w:t>
+      </w:r>
+      <w:r>
+        <w:rPr>
+          <w:lang w:val="en-US"/>
+        </w:rPr>
+        <w:t>starting</w:t>
+      </w:r>
+      <w:r>
+        <w:rPr>
+          <w:lang w:val="en-US"/>
+        </w:rPr>
+        <w:t xml:space="preserve"> further development</w:t>
+      </w:r>
+      <w:r>
+        <w:rPr>
+          <w:lang w:val="en-US"/>
+        </w:rPr>
+        <w:t xml:space="preserve"> into the next phase. </w:t>
+      </w:r>
+      <w:r>
+        <w:rPr>
+          <w:lang w:val="en-US"/>
+        </w:rPr>
+        <w:t>However,</w:t>
+      </w:r>
+      <w:r>
+        <w:rPr>
+          <w:lang w:val="en-US"/>
+        </w:rPr>
+        <w:t xml:space="preserve"> the gap in hours still seems a bit high</w:t>
+      </w:r>
+      <w:r>
+        <w:rPr>
+          <w:lang w:val="en-US"/>
+        </w:rPr>
+        <w:t>.</w:t>
+      </w:r>
+      <w:r>
+        <w:rPr>
+          <w:lang w:val="en-US"/>
+        </w:rPr>
+        <w:t xml:space="preserve"> This may be due to th</w:t>
+      </w:r>
+      <w:r>
+        <w:rPr>
+          <w:lang w:val="en-US"/>
+        </w:rPr>
+        <w:t>e time it took testing the program and documenting it.</w:t>
+      </w:r>
+    </w:p>
+    <w:p>
+      <w:pPr>
+        <w:pStyle w:val="ListParagraph"/>
+        <w:numPr>
+          <w:ilvl w:val="0"/>
+          <w:numId w:val="1"/>
+        </w:numPr>
+        <w:tabs>
+          <w:tab w:val="center" w:pos="4513"/>
+          <w:tab w:val="left" w:pos="5844"/>
+        </w:tabs>
+        <w:rPr>
+          <w:lang w:val="en-US"/>
+        </w:rPr>
+      </w:pPr>
+      <w:r>
+        <w:rPr>
+          <w:lang w:val="en-US"/>
+        </w:rPr>
+        <w:t xml:space="preserve">Motion Mirroring is the next </w:t>
+      </w:r>
+      <w:r>
+        <w:rPr>
+          <w:lang w:val="en-US"/>
+        </w:rPr>
+        <w:t>part</w:t>
+      </w:r>
+      <w:r>
+        <w:rPr>
+          <w:lang w:val="en-US"/>
+        </w:rPr>
+        <w:t xml:space="preserve"> </w:t>
+      </w:r>
+      <w:r>
+        <w:rPr>
+          <w:lang w:val="en-US"/>
+        </w:rPr>
+        <w:t>of</w:t>
+      </w:r>
+      <w:r>
+        <w:rPr>
+          <w:lang w:val="en-US"/>
+        </w:rPr>
+        <w:t xml:space="preserve"> the Person Tracking</w:t>
+      </w:r>
+      <w:r>
+        <w:rPr>
+          <w:lang w:val="en-US"/>
+        </w:rPr>
+        <w:t xml:space="preserve"> / Identification program. This aspect is tracking behind</w:t>
+      </w:r>
+      <w:r>
+        <w:rPr>
+          <w:lang w:val="en-US"/>
+        </w:rPr>
+        <w:t xml:space="preserve"> at the </w:t>
+      </w:r>
+      <w:r>
+        <w:rPr>
+          <w:lang w:val="en-US"/>
+        </w:rPr>
+        <w:t>moment but</w:t>
+      </w:r>
+      <w:r>
+        <w:rPr>
+          <w:lang w:val="en-US"/>
+        </w:rPr>
+        <w:t xml:space="preserve"> is an integral part of the</w:t>
+      </w:r>
+      <w:r>
+        <w:rPr>
+          <w:lang w:val="en-US"/>
+        </w:rPr>
+        <w:t xml:space="preserve"> program.</w:t>
+      </w:r>
+    </w:p>
+    <w:p>
+      <w:pPr>
+        <w:pStyle w:val="ListParagraph"/>
+        <w:numPr>
+          <w:ilvl w:val="0"/>
+          <w:numId w:val="1"/>
+        </w:numPr>
+        <w:tabs>
+          <w:tab w:val="center" w:pos="4513"/>
+          <w:tab w:val="left" w:pos="5844"/>
+        </w:tabs>
+        <w:rPr>
+          <w:lang w:val="en-US"/>
+        </w:rPr>
+      </w:pPr>
+      <w:r>
+        <w:rPr>
+          <w:lang w:val="en-US"/>
+        </w:rPr>
+        <w:t>Person Following is tracking as expected. This aspect of the program is low priority and is a ‘nice to have’ not a necessity. As such other aspects of the program take pre</w:t>
+      </w:r>
+      <w:r>
+        <w:rPr>
+          <w:lang w:val="en-US"/>
+        </w:rPr>
+        <w:t>cedence.</w:t>
+      </w:r>
+    </w:p>
+    <w:p>
+      <w:pPr>
+        <w:pStyle w:val="ListParagraph"/>
+        <w:numPr>
+          <w:ilvl w:val="0"/>
+          <w:numId w:val="1"/>
+        </w:numPr>
+        <w:tabs>
+          <w:tab w:val="center" w:pos="4513"/>
+          <w:tab w:val="left" w:pos="5844"/>
+        </w:tabs>
+        <w:rPr>
+          <w:lang w:val="en-US"/>
+        </w:rPr>
+      </w:pPr>
+      <w:r>
+        <w:rPr>
+          <w:lang w:val="en-US"/>
+        </w:rPr>
+        <w:t xml:space="preserve">The Gesture Recognition demo performed exactly as expected. Client noted </w:t>
+      </w:r>
+      <w:r>
+        <w:rPr>
+          <w:lang w:val="en-US"/>
+        </w:rPr>
+        <w:t>extra things to be implemented by next meeting</w:t>
+      </w:r>
+      <w:r>
+        <w:rPr>
+          <w:lang w:val="en-US"/>
+        </w:rPr>
+        <w:t xml:space="preserve"> </w:t>
+      </w:r>
+      <w:r>
+        <w:rPr>
+          <w:lang w:val="en-US"/>
+        </w:rPr>
+        <w:t xml:space="preserve">which would </w:t>
+      </w:r>
+      <w:r>
+        <w:rPr>
+          <w:lang w:val="en-US"/>
+        </w:rPr>
+        <w:t>make the program’s next step be the jump to</w:t>
+      </w:r>
+      <w:r>
+        <w:rPr>
+          <w:lang w:val="en-US"/>
+        </w:rPr>
+        <w:t xml:space="preserve"> the real robot from the simulation.</w:t>
+      </w:r>
+    </w:p>
+    <w:p>
+      <w:pPr>
+        <w:pStyle w:val="ListParagraph"/>
+        <w:numPr>
+          <w:ilvl w:val="0"/>
+          <w:numId w:val="1"/>
+        </w:numPr>
+        <w:tabs>
+          <w:tab w:val="center" w:pos="4513"/>
+          <w:tab w:val="left" w:pos="5844"/>
+        </w:tabs>
+        <w:rPr>
+          <w:lang w:val="en-US"/>
+        </w:rPr>
+      </w:pPr>
+      <w:r>
+        <w:rPr>
+          <w:lang w:val="en-US"/>
+        </w:rPr>
+        <w:t xml:space="preserve">The </w:t>
+      </w:r>
+      <w:r>
+        <w:rPr>
+          <w:lang w:val="en-US"/>
+        </w:rPr>
+        <w:t>Person Tracking / Identification demo also performed as expected.</w:t>
+      </w:r>
+    </w:p>
+    <w:p>
+      <w:pPr>
+        <w:pStyle w:val="ListParagraph"/>
+        <w:numPr>
+          <w:ilvl w:val="0"/>
+          <w:numId w:val="1"/>
+        </w:numPr>
+        <w:tabs>
+          <w:tab w:val="center" w:pos="4513"/>
+          <w:tab w:val="left" w:pos="5844"/>
+        </w:tabs>
+        <w:rPr>
+          <w:lang w:val="en-US"/>
+        </w:rPr>
+      </w:pPr>
+      <w:r>
+        <w:rPr>
+          <w:lang w:val="en-US"/>
+        </w:rPr>
+        <w:t>Given time restrictions, Person Following is a realistic contender for</w:t>
+      </w:r>
+      <w:r>
+        <w:rPr>
+          <w:lang w:val="en-US"/>
+        </w:rPr>
+        <w:t xml:space="preserve"> scope reduction. </w:t>
+      </w:r>
+    </w:p>
+    <w:p>
+      <w:pPr>
+        <w:tabs>
+          <w:tab w:val="center" w:pos="4513"/>
+          <w:tab w:val="left" w:pos="5844"/>
+        </w:tabs>
+        <w:rPr>
+          <w:lang w:val="en-US"/>
+        </w:rPr>
+      </w:pPr>
+    </w:p>
+    <w:p>
+      <w:pPr>
+        <w:tabs>
+          <w:tab w:val="center" w:pos="4513"/>
+          <w:tab w:val="left" w:pos="5844"/>
+        </w:tabs>
+        <w:rPr>
+          <w:b/>
+          <w:bCs/>
+          <w:sz w:val="28"/>
+          <w:szCs w:val="28"/>
+          <w:lang w:val="en-US"/>
+        </w:rPr>
+      </w:pPr>
+      <w:r>
+        <w:rPr>
+          <w:b/>
+          <w:bCs/>
+          <w:sz w:val="28"/>
+          <w:szCs w:val="28"/>
+          <w:lang w:val="en-US"/>
+        </w:rPr>
+        <w:t xml:space="preserve">Looking </w:t>
+      </w:r>
+      <w:r>
+        <w:rPr>
+          <w:b/>
+          <w:bCs/>
+          <w:sz w:val="28"/>
+          <w:szCs w:val="28"/>
+          <w:lang w:val="en-US"/>
+        </w:rPr>
+        <w:t>F</w:t>
+      </w:r>
+      <w:r>
+        <w:rPr>
+          <w:b/>
+          <w:bCs/>
+          <w:sz w:val="28"/>
+          <w:szCs w:val="28"/>
+          <w:lang w:val="en-US"/>
+        </w:rPr>
+        <w:t>orward:</w:t>
+      </w:r>
+    </w:p>
+    <w:p>
+      <w:pPr>
+        <w:pStyle w:val="ListParagraph"/>
+        <w:numPr>
+          <w:ilvl w:val="0"/>
+          <w:numId w:val="1"/>
+        </w:numPr>
+        <w:tabs>
+          <w:tab w:val="center" w:pos="4513"/>
+          <w:tab w:val="left" w:pos="5844"/>
+        </w:tabs>
+        <w:rPr>
+          <w:lang w:val="en-US"/>
+        </w:rPr>
+      </w:pPr>
+      <w:r>
+        <w:rPr>
+          <w:lang w:val="en-US"/>
+        </w:rPr>
+        <w:t>The</w:t>
+      </w:r>
+      <w:r>
+        <w:rPr>
+          <w:lang w:val="en-US"/>
+        </w:rPr>
+        <w:t xml:space="preserve"> Person Tracking / Identification aspect’s</w:t>
+      </w:r>
+      <w:r>
+        <w:rPr>
+          <w:lang w:val="en-US"/>
+        </w:rPr>
+        <w:t xml:space="preserve"> next step (Motion Mirroring) should be implemented by next meeting. From there the two programs can be consolidated into one.</w:t>
+      </w:r>
+    </w:p>
+    <w:p>
+      <w:pPr>
+        <w:pStyle w:val="ListParagraph"/>
+        <w:numPr>
+          <w:ilvl w:val="0"/>
+          <w:numId w:val="1"/>
+        </w:numPr>
+        <w:tabs>
+          <w:tab w:val="center" w:pos="4513"/>
+          <w:tab w:val="left" w:pos="5844"/>
+        </w:tabs>
+        <w:rPr>
+          <w:b/>
+          <w:bCs/>
+          <w:lang w:val="en-US"/>
+        </w:rPr>
+      </w:pPr>
+      <w:r>
+        <w:rPr>
+          <w:lang w:val="en-US"/>
+        </w:rPr>
+        <w:t>The Gesture Recognition next step should also be implemented</w:t>
+      </w:r>
+      <w:r>
+        <w:rPr>
+          <w:lang w:val="en-US"/>
+        </w:rPr>
+        <w:t xml:space="preserve">. The different hand gestures should map to real movement instructions the robot </w:t>
+      </w:r>
+      <w:r>
+        <w:rPr>
+          <w:lang w:val="en-US"/>
+        </w:rPr>
+        <w:t xml:space="preserve">/simulation </w:t>
+      </w:r>
+      <w:r>
+        <w:rPr>
+          <w:lang w:val="en-US"/>
+        </w:rPr>
+        <w:t>should follow</w:t>
+      </w:r>
+      <w:r>
+        <w:rPr>
+          <w:lang w:val="en-US"/>
+        </w:rPr>
+        <w:t>.</w:t>
+      </w:r>
+      <w:r>
+        <w:rPr>
+          <w:lang w:val="en-US"/>
+        </w:rPr>
+        <w:t xml:space="preserve"> Gestures should replace the use of controller joysticks</w:t>
+      </w:r>
+    </w:p>
+    <w:p>
+      <w:pPr>
+        <w:pStyle w:val="ListParagraph"/>
+        <w:numPr>
+          <w:ilvl w:val="0"/>
+          <w:numId w:val="1"/>
+        </w:numPr>
+        <w:tabs>
+          <w:tab w:val="center" w:pos="4513"/>
+          <w:tab w:val="left" w:pos="5844"/>
+        </w:tabs>
+        <w:rPr>
+          <w:b/>
+          <w:bCs/>
+          <w:lang w:val="en-US"/>
+        </w:rPr>
+      </w:pPr>
+      <w:r>
+        <w:rPr>
+          <w:lang w:val="en-US"/>
+        </w:rPr>
+        <w:t>Considering all this</w:t>
+      </w:r>
+      <w:r>
+        <w:rPr>
+          <w:lang w:val="en-US"/>
+        </w:rPr>
+        <w:t xml:space="preserve"> and that there are still ~1</w:t>
+      </w:r>
+      <w:r>
+        <w:rPr>
+          <w:lang w:val="en-US"/>
+        </w:rPr>
+        <w:t>6</w:t>
+      </w:r>
+      <w:r>
+        <w:rPr>
+          <w:lang w:val="en-US"/>
+        </w:rPr>
+        <w:t>0h (not including Week 8 hours)</w:t>
+      </w:r>
+      <w:r>
+        <w:rPr>
+          <w:lang w:val="en-US"/>
+        </w:rPr>
+        <w:t xml:space="preserve"> left, there will be enough time within the time budget to complete this project.</w:t>
+      </w:r>
+    </w:p>
+    <w:p>
+      <w:pPr>
+        <w:pStyle w:val="ListParagraph"/>
+        <w:numPr>
+          <w:ilvl w:val="0"/>
+          <w:numId w:val="1"/>
+        </w:numPr>
+        <w:tabs>
+          <w:tab w:val="center" w:pos="4513"/>
+          <w:tab w:val="left" w:pos="5844"/>
+        </w:tabs>
+        <w:rPr>
+          <w:b/>
+          <w:bCs/>
+          <w:lang w:val="en-US"/>
+        </w:rPr>
+      </w:pPr>
+      <w:r>
+        <w:rPr>
+          <w:lang w:val="en-US"/>
+        </w:rPr>
+        <w:t>The client will be on leave in weeks 10 and 11 giving the team only two more meetings.</w:t>
+      </w:r>
+      <w:r>
+        <w:rPr>
+          <w:lang w:val="en-US"/>
+        </w:rPr>
+        <w:t xml:space="preserve"> As such the team should push through the current time pressure and get something almost deliverable by Week 9</w:t>
+      </w:r>
+      <w:r>
+        <w:rPr>
+          <w:lang w:val="en-US"/>
+        </w:rPr>
+        <w:t xml:space="preserve"> meeting. This will cause a spike in hours assigned to project</w:t>
+      </w:r>
+      <w:r>
+        <w:rPr>
+          <w:lang w:val="en-US"/>
+        </w:rPr>
+        <w:t>.</w:t>
+      </w:r>
     </w:p>
     <w:sectPr>
       <w:pgSz w:w="11906" w:h="16838"/>
@@ -2627,6 +3686,127 @@
     </w:sectPr>
   </w:body>
 </w:document>
+</file>
+
+<file path=word/numbering.xml><?xml version="1.0" encoding="utf-8"?>
+<w:numbering xmlns:wpc="http://schemas.microsoft.com/office/word/2010/wordprocessingCanvas" xmlns:cx="http://schemas.microsoft.com/office/drawing/2014/chartex" xmlns:cx1="http://schemas.microsoft.com/office/drawing/2015/9/8/chartex" xmlns:cx2="http://schemas.microsoft.com/office/drawing/2015/10/21/chartex" xmlns:cx3="http://schemas.microsoft.com/office/drawing/2016/5/9/chartex" xmlns:cx4="http://schemas.microsoft.com/office/drawing/2016/5/10/chartex" xmlns:cx5="http://schemas.microsoft.com/office/drawing/2016/5/11/chartex" xmlns:cx6="http://schemas.microsoft.com/office/drawing/2016/5/12/chartex" xmlns:cx7="http://schemas.microsoft.com/office/drawing/2016/5/13/chartex" xmlns:cx8="http://schemas.microsoft.com/office/drawing/2016/5/14/chartex" xmlns:mc="http://schemas.openxmlformats.org/markup-compatibility/2006" xmlns:aink="http://schemas.microsoft.com/office/drawing/2016/ink" xmlns:am3d="http://schemas.microsoft.com/office/drawing/2017/model3d" xmlns:o="urn:schemas-microsoft-com:office:office" xmlns:oel="http://schemas.microsoft.com/office/2019/extlst" xmlns:r="http://schemas.openxmlformats.org/officeDocument/2006/relationships" xmlns:m="http://schemas.openxmlformats.org/officeDocument/2006/math" xmlns:v="urn:schemas-microsoft-com:vml" xmlns:wp14="http://schemas.microsoft.com/office/word/2010/wordprocessingDrawing" xmlns:wp="http://schemas.openxmlformats.org/drawingml/2006/wordprocessingDrawing" xmlns:w10="urn:schemas-microsoft-com:office:word" xmlns:w="http://schemas.openxmlformats.org/wordprocessingml/2006/main" xmlns:w14="http://schemas.microsoft.com/office/word/2010/wordml" xmlns:w15="http://schemas.microsoft.com/office/word/2012/wordml" xmlns:w16cex="http://schemas.microsoft.com/office/word/2018/wordml/cex" xmlns:w16cid="http://schemas.microsoft.com/office/word/2016/wordml/cid" xmlns:w16="http://schemas.microsoft.com/office/word/2018/wordml" xmlns:w16du="http://schemas.microsoft.com/office/word/2023/wordml/word16du" xmlns:w16sdtdh="http://schemas.microsoft.com/office/word/2020/wordml/sdtdatahash" xmlns:w16sdtfl="http://schemas.microsoft.com/office/word/2024/wordml/sdtformatlock" xmlns:w16se="http://schemas.microsoft.com/office/word/2015/wordml/symex" xmlns:wpg="http://schemas.microsoft.com/office/word/2010/wordprocessingGroup" xmlns:wpi="http://schemas.microsoft.com/office/word/2010/wordprocessingInk" xmlns:wne="http://schemas.microsoft.com/office/word/2006/wordml" xmlns:wps="http://schemas.microsoft.com/office/word/2010/wordprocessingShape" mc:Ignorable="w14 w15 w16se w16cid w16 w16cex w16sdtdh w16sdtfl w16du wp14">
+  <w:abstractNum w:abstractNumId="0" w15:restartNumberingAfterBreak="0">
+    <w:nsid w:val="344E45CF"/>
+    <w:multiLevelType w:val="hybridMultilevel"/>
+    <w:tmpl w:val="A594B55E"/>
+    <w:lvl w:ilvl="0" w:tplc="B7FA70CC">
+      <w:start w:val="113"/>
+      <w:numFmt w:val="bullet"/>
+      <w:lvlText w:val="-"/>
+      <w:lvlJc w:val="left"/>
+      <w:pPr>
+        <w:ind w:left="720" w:hanging="360"/>
+      </w:pPr>
+      <w:rPr>
+        <w:rFonts w:ascii="Aptos" w:eastAsiaTheme="minorHAnsi" w:hAnsi="Aptos" w:cstheme="minorBidi" w:hint="default"/>
+      </w:rPr>
+    </w:lvl>
+    <w:lvl w:ilvl="1" w:tplc="0C090003" w:tentative="1">
+      <w:start w:val="1"/>
+      <w:numFmt w:val="bullet"/>
+      <w:lvlText w:val="o"/>
+      <w:lvlJc w:val="left"/>
+      <w:pPr>
+        <w:ind w:left="1440" w:hanging="360"/>
+      </w:pPr>
+      <w:rPr>
+        <w:rFonts w:ascii="Courier New" w:hAnsi="Courier New" w:cs="Courier New" w:hint="default"/>
+      </w:rPr>
+    </w:lvl>
+    <w:lvl w:ilvl="2" w:tplc="0C090005" w:tentative="1">
+      <w:start w:val="1"/>
+      <w:numFmt w:val="bullet"/>
+      <w:lvlText w:val=""/>
+      <w:lvlJc w:val="left"/>
+      <w:pPr>
+        <w:ind w:left="2160" w:hanging="360"/>
+      </w:pPr>
+      <w:rPr>
+        <w:rFonts w:ascii="Wingdings" w:hAnsi="Wingdings" w:hint="default"/>
+      </w:rPr>
+    </w:lvl>
+    <w:lvl w:ilvl="3" w:tplc="0C090001" w:tentative="1">
+      <w:start w:val="1"/>
+      <w:numFmt w:val="bullet"/>
+      <w:lvlText w:val=""/>
+      <w:lvlJc w:val="left"/>
+      <w:pPr>
+        <w:ind w:left="2880" w:hanging="360"/>
+      </w:pPr>
+      <w:rPr>
+        <w:rFonts w:ascii="Symbol" w:hAnsi="Symbol" w:hint="default"/>
+      </w:rPr>
+    </w:lvl>
+    <w:lvl w:ilvl="4" w:tplc="0C090003" w:tentative="1">
+      <w:start w:val="1"/>
+      <w:numFmt w:val="bullet"/>
+      <w:lvlText w:val="o"/>
+      <w:lvlJc w:val="left"/>
+      <w:pPr>
+        <w:ind w:left="3600" w:hanging="360"/>
+      </w:pPr>
+      <w:rPr>
+        <w:rFonts w:ascii="Courier New" w:hAnsi="Courier New" w:cs="Courier New" w:hint="default"/>
+      </w:rPr>
+    </w:lvl>
+    <w:lvl w:ilvl="5" w:tplc="0C090005" w:tentative="1">
+      <w:start w:val="1"/>
+      <w:numFmt w:val="bullet"/>
+      <w:lvlText w:val=""/>
+      <w:lvlJc w:val="left"/>
+      <w:pPr>
+        <w:ind w:left="4320" w:hanging="360"/>
+      </w:pPr>
+      <w:rPr>
+        <w:rFonts w:ascii="Wingdings" w:hAnsi="Wingdings" w:hint="default"/>
+      </w:rPr>
+    </w:lvl>
+    <w:lvl w:ilvl="6" w:tplc="0C090001" w:tentative="1">
+      <w:start w:val="1"/>
+      <w:numFmt w:val="bullet"/>
+      <w:lvlText w:val=""/>
+      <w:lvlJc w:val="left"/>
+      <w:pPr>
+        <w:ind w:left="5040" w:hanging="360"/>
+      </w:pPr>
+      <w:rPr>
+        <w:rFonts w:ascii="Symbol" w:hAnsi="Symbol" w:hint="default"/>
+      </w:rPr>
+    </w:lvl>
+    <w:lvl w:ilvl="7" w:tplc="0C090003" w:tentative="1">
+      <w:start w:val="1"/>
+      <w:numFmt w:val="bullet"/>
+      <w:lvlText w:val="o"/>
+      <w:lvlJc w:val="left"/>
+      <w:pPr>
+        <w:ind w:left="5760" w:hanging="360"/>
+      </w:pPr>
+      <w:rPr>
+        <w:rFonts w:ascii="Courier New" w:hAnsi="Courier New" w:cs="Courier New" w:hint="default"/>
+      </w:rPr>
+    </w:lvl>
+    <w:lvl w:ilvl="8" w:tplc="0C090005" w:tentative="1">
+      <w:start w:val="1"/>
+      <w:numFmt w:val="bullet"/>
+      <w:lvlText w:val=""/>
+      <w:lvlJc w:val="left"/>
+      <w:pPr>
+        <w:ind w:left="6480" w:hanging="360"/>
+      </w:pPr>
+      <w:rPr>
+        <w:rFonts w:ascii="Wingdings" w:hAnsi="Wingdings" w:hint="default"/>
+      </w:rPr>
+    </w:lvl>
+  </w:abstractNum>
+  <w:num w:numId="1" w16cid:durableId="1382830617">
+    <w:abstractNumId w:val="0"/>
+  </w:num>
+</w:numbering>
 </file>
 
 <file path=word/styles.xml><?xml version="1.0" encoding="utf-8"?>

</xml_diff>